<commit_message>
Fix report for sex check
</commit_message>
<xml_diff>
--- a/doc/report.docx
+++ b/doc/report.docx
@@ -31,7 +31,7 @@
         <w:pStyle w:val="Date"/>
       </w:pPr>
       <w:r>
-        <w:t xml:space="preserve">2026-07-07</w:t>
+        <w:t xml:space="preserve">2026-07-23</w:t>
       </w:r>
     </w:p>
     <w:sdt>
@@ -235,7 +235,7 @@
       </w:tr>
     </w:tbl>
     <w:bookmarkEnd w:id="12"/>
-    <w:bookmarkStart w:id="21" w:name="descriptive-statistics"/>
+    <w:bookmarkStart w:id="25" w:name="descriptive-statistics"/>
     <w:p>
       <w:pPr>
         <w:pStyle w:val="Heading1"/>
@@ -288,13 +288,13 @@
               <w:tblLook w:firstRow="1" w:lastRow="0" w:firstColumn="0" w:lastColumn="0" w:noHBand="0" w:noVBand="0" w:val="0020"/>
             </w:tblPr>
             <w:tblGrid>
-              <w:gridCol w:w="3204"/>
-              <w:gridCol w:w="785"/>
-              <w:gridCol w:w="785"/>
-              <w:gridCol w:w="785"/>
-              <w:gridCol w:w="785"/>
-              <w:gridCol w:w="785"/>
-              <w:gridCol w:w="785"/>
+              <w:gridCol w:w="3309"/>
+              <w:gridCol w:w="768"/>
+              <w:gridCol w:w="768"/>
+              <w:gridCol w:w="768"/>
+              <w:gridCol w:w="768"/>
+              <w:gridCol w:w="768"/>
+              <w:gridCol w:w="768"/>
             </w:tblGrid>
             <w:tr>
               <w:trPr>
@@ -2804,6 +2804,99 @@
                   </w:pPr>
                   <w:r>
                     <w:t xml:space="preserve">1412 (36.8)</w:t>
+                  </w:r>
+                </w:p>
+              </w:tc>
+            </w:tr>
+            <w:tr>
+              <w:tc>
+                <w:tcPr/>
+                <w:p>
+                  <w:pPr>
+                    <w:pStyle w:val="Compact"/>
+                    <w:jc w:val="left"/>
+                    <w:jc w:val="center"/>
+                  </w:pPr>
+                  <w:r>
+                    <w:t xml:space="preserve">Body Dissatisfaction (Any Direction) = Dissatisfied (%)</w:t>
+                  </w:r>
+                </w:p>
+              </w:tc>
+              <w:tc>
+                <w:tcPr/>
+                <w:p>
+                  <w:pPr>
+                    <w:pStyle w:val="Compact"/>
+                    <w:jc w:val="left"/>
+                    <w:jc w:val="center"/>
+                  </w:pPr>
+                  <w:r>
+                    <w:t xml:space="preserve">2016 (50.5)</w:t>
+                  </w:r>
+                </w:p>
+              </w:tc>
+              <w:tc>
+                <w:tcPr/>
+                <w:p>
+                  <w:pPr>
+                    <w:pStyle w:val="Compact"/>
+                    <w:jc w:val="left"/>
+                    <w:jc w:val="center"/>
+                  </w:pPr>
+                  <w:r>
+                    <w:t xml:space="preserve">2335 (55.1)</w:t>
+                  </w:r>
+                </w:p>
+              </w:tc>
+              <w:tc>
+                <w:tcPr/>
+                <w:p>
+                  <w:pPr>
+                    <w:pStyle w:val="Compact"/>
+                    <w:jc w:val="left"/>
+                    <w:jc w:val="center"/>
+                  </w:pPr>
+                  <w:r>
+                    <w:t xml:space="preserve">1562 (43.7)</w:t>
+                  </w:r>
+                </w:p>
+              </w:tc>
+              <w:tc>
+                <w:tcPr/>
+                <w:p>
+                  <w:pPr>
+                    <w:pStyle w:val="Compact"/>
+                    <w:jc w:val="left"/>
+                    <w:jc w:val="center"/>
+                  </w:pPr>
+                  <w:r>
+                    <w:t xml:space="preserve">1858 (45.5)</w:t>
+                  </w:r>
+                </w:p>
+              </w:tc>
+              <w:tc>
+                <w:tcPr/>
+                <w:p>
+                  <w:pPr>
+                    <w:pStyle w:val="Compact"/>
+                    <w:jc w:val="left"/>
+                    <w:jc w:val="center"/>
+                  </w:pPr>
+                  <w:r>
+                    <w:t xml:space="preserve">1410 (44.2)</w:t>
+                  </w:r>
+                </w:p>
+              </w:tc>
+              <w:tc>
+                <w:tcPr/>
+                <w:p>
+                  <w:pPr>
+                    <w:pStyle w:val="Compact"/>
+                    <w:jc w:val="left"/>
+                    <w:jc w:val="center"/>
+                  </w:pPr>
+                  <w:r>
+                    <w:t xml:space="preserve">1687 (43.9)</w:t>
                   </w:r>
                 </w:p>
               </w:tc>
@@ -3740,10 +3833,10 @@
               <w:tblLook w:firstRow="1" w:lastRow="0" w:firstColumn="0" w:lastColumn="0" w:noHBand="0" w:noVBand="0" w:val="0020"/>
             </w:tblPr>
             <w:tblGrid>
-              <w:gridCol w:w="4562"/>
-              <w:gridCol w:w="1119"/>
-              <w:gridCol w:w="1119"/>
-              <w:gridCol w:w="1119"/>
+              <w:gridCol w:w="4668"/>
+              <w:gridCol w:w="1083"/>
+              <w:gridCol w:w="1083"/>
+              <w:gridCol w:w="1083"/>
             </w:tblGrid>
             <w:tr>
               <w:trPr>
@@ -5206,6 +5299,60 @@
                   </w:pPr>
                   <w:r>
                     <w:t xml:space="preserve">2617 (37.2)</w:t>
+                  </w:r>
+                </w:p>
+              </w:tc>
+            </w:tr>
+            <w:tr>
+              <w:tc>
+                <w:tcPr/>
+                <w:p>
+                  <w:pPr>
+                    <w:pStyle w:val="Compact"/>
+                    <w:jc w:val="left"/>
+                    <w:jc w:val="center"/>
+                  </w:pPr>
+                  <w:r>
+                    <w:t xml:space="preserve">Body Dissatisfaction (Any Direction) = Dissatisfied (%)</w:t>
+                  </w:r>
+                </w:p>
+              </w:tc>
+              <w:tc>
+                <w:tcPr/>
+                <w:p>
+                  <w:pPr>
+                    <w:pStyle w:val="Compact"/>
+                    <w:jc w:val="left"/>
+                    <w:jc w:val="center"/>
+                  </w:pPr>
+                  <w:r>
+                    <w:t xml:space="preserve">4351 (52.8)</w:t>
+                  </w:r>
+                </w:p>
+              </w:tc>
+              <w:tc>
+                <w:tcPr/>
+                <w:p>
+                  <w:pPr>
+                    <w:pStyle w:val="Compact"/>
+                    <w:jc w:val="left"/>
+                    <w:jc w:val="center"/>
+                  </w:pPr>
+                  <w:r>
+                    <w:t xml:space="preserve">3420 (44.6)</w:t>
+                  </w:r>
+                </w:p>
+              </w:tc>
+              <w:tc>
+                <w:tcPr/>
+                <w:p>
+                  <w:pPr>
+                    <w:pStyle w:val="Compact"/>
+                    <w:jc w:val="left"/>
+                    <w:jc w:val="center"/>
+                  </w:pPr>
+                  <w:r>
+                    <w:t xml:space="preserve">3097 (44.1)</w:t>
                   </w:r>
                 </w:p>
               </w:tc>
@@ -5778,6 +5925,24 @@
               </w:numPr>
             </w:pPr>
             <w:r>
+              <w:t xml:space="preserve">The direction-agnostic dissatisfaction indicator (</w:t>
+            </w:r>
+            <w:r>
+              <w:t xml:space="preserve">“Any Direction”</w:t>
+            </w:r>
+            <w:r>
+              <w:t xml:space="preserve">) shows just under half of children pick an ideal different from their current figure at every age.</w:t>
+            </w:r>
+          </w:p>
+          <w:p>
+            <w:pPr>
+              <w:pStyle w:val="Compact"/>
+              <w:numPr>
+                <w:ilvl w:val="0"/>
+                <w:numId w:val="1003"/>
+              </w:numPr>
+            </w:pPr>
+            <w:r>
               <w:t xml:space="preserve">The dissatisfaction also looks broadly like you would expect: most children either pick an ideal the same as their current, or a smaller one, with a smaller share picking a larger ideal.</w:t>
             </w:r>
           </w:p>
@@ -5834,8 +5999,3538 @@
       </w:tr>
     </w:tbl>
     <w:bookmarkEnd w:id="20"/>
-    <w:bookmarkEnd w:id="21"/>
-    <w:bookmarkStart w:id="27" w:name="preliminary-plots"/>
+    <w:bookmarkStart w:id="24" w:name="by-sex-within-age-group"/>
+    <w:p>
+      <w:pPr>
+        <w:pStyle w:val="Heading2"/>
+      </w:pPr>
+      <w:r>
+        <w:t xml:space="preserve">2.3 By sex within age group</w:t>
+      </w:r>
+    </w:p>
+    <w:tbl>
+      <w:tblPr>
+        <w:tblStyle w:val="Table"/>
+        <w:tblW w:type="pct" w:w="5000"/>
+        <w:tblLayout w:type="fixed"/>
+        <w:tblLook w:firstRow="0" w:lastRow="0" w:firstColumn="0" w:lastColumn="0" w:noHBand="0" w:noVBand="0" w:val="0000"/>
+      </w:tblPr>
+      <w:tblGrid>
+        <w:gridCol w:w="7920"/>
+      </w:tblGrid>
+      <w:tr>
+        <w:tc>
+          <w:tcPr/>
+          <w:bookmarkStart w:id="21" w:name="tbl-by-sex-age"/>
+          <w:p>
+            <w:pPr>
+              <w:jc w:val="center"/>
+            </w:pPr>
+            <w:pPr>
+              <w:jc w:val="left"/>
+              <w:spacing w:before="200"/>
+              <w:pStyle w:val="ImageCaption"/>
+            </w:pPr>
+            <w:r>
+              <w:t xml:space="preserve">Table 3: Descriptive statistics by sex within age group (cohorts pooled).</w:t>
+            </w:r>
+          </w:p>
+          <w:tbl>
+            <w:tblPr>
+              <w:tblStyle w:val="Table"/>
+              <w:tblW w:type="pct" w:w="5000"/>
+              <w:tblLayout w:type="fixed"/>
+              <w:tblLook w:firstRow="1" w:lastRow="0" w:firstColumn="0" w:lastColumn="0" w:noHBand="0" w:noVBand="0" w:val="0020"/>
+            </w:tblPr>
+            <w:tblGrid>
+              <w:gridCol w:w="3261"/>
+              <w:gridCol w:w="757"/>
+              <w:gridCol w:w="757"/>
+              <w:gridCol w:w="757"/>
+              <w:gridCol w:w="815"/>
+              <w:gridCol w:w="757"/>
+              <w:gridCol w:w="815"/>
+            </w:tblGrid>
+            <w:tr>
+              <w:trPr>
+                <w:tblHeader w:val="on"/>
+              </w:trPr>
+              <w:tc>
+                <w:tcPr/>
+                <w:p>
+                  <w:pPr>
+                    <w:pStyle w:val="Compact"/>
+                  </w:pPr>
+                </w:p>
+              </w:tc>
+              <w:tc>
+                <w:tcPr/>
+                <w:p>
+                  <w:pPr>
+                    <w:pStyle w:val="Compact"/>
+                    <w:jc w:val="left"/>
+                    <w:jc w:val="center"/>
+                  </w:pPr>
+                  <w:r>
+                    <w:t xml:space="preserve">Male:Age 8</w:t>
+                  </w:r>
+                </w:p>
+              </w:tc>
+              <w:tc>
+                <w:tcPr/>
+                <w:p>
+                  <w:pPr>
+                    <w:pStyle w:val="Compact"/>
+                    <w:jc w:val="left"/>
+                    <w:jc w:val="center"/>
+                  </w:pPr>
+                  <w:r>
+                    <w:t xml:space="preserve">Female:Age 8</w:t>
+                  </w:r>
+                </w:p>
+              </w:tc>
+              <w:tc>
+                <w:tcPr/>
+                <w:p>
+                  <w:pPr>
+                    <w:pStyle w:val="Compact"/>
+                    <w:jc w:val="left"/>
+                    <w:jc w:val="center"/>
+                  </w:pPr>
+                  <w:r>
+                    <w:t xml:space="preserve">Male:Age 10</w:t>
+                  </w:r>
+                </w:p>
+              </w:tc>
+              <w:tc>
+                <w:tcPr/>
+                <w:p>
+                  <w:pPr>
+                    <w:pStyle w:val="Compact"/>
+                    <w:jc w:val="left"/>
+                    <w:jc w:val="center"/>
+                  </w:pPr>
+                  <w:r>
+                    <w:t xml:space="preserve">Female:Age 10</w:t>
+                  </w:r>
+                </w:p>
+              </w:tc>
+              <w:tc>
+                <w:tcPr/>
+                <w:p>
+                  <w:pPr>
+                    <w:pStyle w:val="Compact"/>
+                    <w:jc w:val="left"/>
+                    <w:jc w:val="center"/>
+                  </w:pPr>
+                  <w:r>
+                    <w:t xml:space="preserve">Male:Age 12</w:t>
+                  </w:r>
+                </w:p>
+              </w:tc>
+              <w:tc>
+                <w:tcPr/>
+                <w:p>
+                  <w:pPr>
+                    <w:pStyle w:val="Compact"/>
+                    <w:jc w:val="left"/>
+                    <w:jc w:val="center"/>
+                  </w:pPr>
+                  <w:r>
+                    <w:t xml:space="preserve">Female:Age 12</w:t>
+                  </w:r>
+                </w:p>
+              </w:tc>
+            </w:tr>
+            <w:tr>
+              <w:tc>
+                <w:tcPr/>
+                <w:p>
+                  <w:pPr>
+                    <w:pStyle w:val="Compact"/>
+                    <w:jc w:val="left"/>
+                    <w:jc w:val="center"/>
+                  </w:pPr>
+                  <w:r>
+                    <w:t xml:space="preserve">n</w:t>
+                  </w:r>
+                </w:p>
+              </w:tc>
+              <w:tc>
+                <w:tcPr/>
+                <w:p>
+                  <w:pPr>
+                    <w:pStyle w:val="Compact"/>
+                    <w:jc w:val="left"/>
+                    <w:jc w:val="center"/>
+                  </w:pPr>
+                  <w:r>
+                    <w:t xml:space="preserve">4307</w:t>
+                  </w:r>
+                </w:p>
+              </w:tc>
+              <w:tc>
+                <w:tcPr/>
+                <w:p>
+                  <w:pPr>
+                    <w:pStyle w:val="Compact"/>
+                    <w:jc w:val="left"/>
+                    <w:jc w:val="center"/>
+                  </w:pPr>
+                  <w:r>
+                    <w:t xml:space="preserve">4109</w:t>
+                  </w:r>
+                </w:p>
+              </w:tc>
+              <w:tc>
+                <w:tcPr/>
+                <w:p>
+                  <w:pPr>
+                    <w:pStyle w:val="Compact"/>
+                    <w:jc w:val="left"/>
+                    <w:jc w:val="center"/>
+                  </w:pPr>
+                  <w:r>
+                    <w:t xml:space="preserve">4061</w:t>
+                  </w:r>
+                </w:p>
+              </w:tc>
+              <w:tc>
+                <w:tcPr/>
+                <w:p>
+                  <w:pPr>
+                    <w:pStyle w:val="Compact"/>
+                    <w:jc w:val="left"/>
+                    <w:jc w:val="center"/>
+                  </w:pPr>
+                  <w:r>
+                    <w:t xml:space="preserve">3872</w:t>
+                  </w:r>
+                </w:p>
+              </w:tc>
+              <w:tc>
+                <w:tcPr/>
+                <w:p>
+                  <w:pPr>
+                    <w:pStyle w:val="Compact"/>
+                    <w:jc w:val="left"/>
+                    <w:jc w:val="center"/>
+                  </w:pPr>
+                  <w:r>
+                    <w:t xml:space="preserve">3754</w:t>
+                  </w:r>
+                </w:p>
+              </w:tc>
+              <w:tc>
+                <w:tcPr/>
+                <w:p>
+                  <w:pPr>
+                    <w:pStyle w:val="Compact"/>
+                    <w:jc w:val="left"/>
+                    <w:jc w:val="center"/>
+                  </w:pPr>
+                  <w:r>
+                    <w:t xml:space="preserve">3583</w:t>
+                  </w:r>
+                </w:p>
+              </w:tc>
+            </w:tr>
+            <w:tr>
+              <w:tc>
+                <w:tcPr/>
+                <w:p>
+                  <w:pPr>
+                    <w:pStyle w:val="Compact"/>
+                    <w:jc w:val="left"/>
+                    <w:jc w:val="center"/>
+                  </w:pPr>
+                  <w:r>
+                    <w:t xml:space="preserve">Age (Years) (mean (SD))</w:t>
+                  </w:r>
+                </w:p>
+              </w:tc>
+              <w:tc>
+                <w:tcPr/>
+                <w:p>
+                  <w:pPr>
+                    <w:pStyle w:val="Compact"/>
+                    <w:jc w:val="left"/>
+                    <w:jc w:val="center"/>
+                  </w:pPr>
+                  <w:r>
+                    <w:t xml:space="preserve">8.32 (0.47)</w:t>
+                  </w:r>
+                </w:p>
+              </w:tc>
+              <w:tc>
+                <w:tcPr/>
+                <w:p>
+                  <w:pPr>
+                    <w:pStyle w:val="Compact"/>
+                    <w:jc w:val="left"/>
+                    <w:jc w:val="center"/>
+                  </w:pPr>
+                  <w:r>
+                    <w:t xml:space="preserve">8.33 (0.47)</w:t>
+                  </w:r>
+                </w:p>
+              </w:tc>
+              <w:tc>
+                <w:tcPr/>
+                <w:p>
+                  <w:pPr>
+                    <w:pStyle w:val="Compact"/>
+                    <w:jc w:val="left"/>
+                    <w:jc w:val="center"/>
+                  </w:pPr>
+                  <w:r>
+                    <w:t xml:space="preserve">10.37 (0.48)</w:t>
+                  </w:r>
+                </w:p>
+              </w:tc>
+              <w:tc>
+                <w:tcPr/>
+                <w:p>
+                  <w:pPr>
+                    <w:pStyle w:val="Compact"/>
+                    <w:jc w:val="left"/>
+                    <w:jc w:val="center"/>
+                  </w:pPr>
+                  <w:r>
+                    <w:t xml:space="preserve">10.37 (0.48)</w:t>
+                  </w:r>
+                </w:p>
+              </w:tc>
+              <w:tc>
+                <w:tcPr/>
+                <w:p>
+                  <w:pPr>
+                    <w:pStyle w:val="Compact"/>
+                    <w:jc w:val="left"/>
+                    <w:jc w:val="center"/>
+                  </w:pPr>
+                  <w:r>
+                    <w:t xml:space="preserve">12.44 (0.50)</w:t>
+                  </w:r>
+                </w:p>
+              </w:tc>
+              <w:tc>
+                <w:tcPr/>
+                <w:p>
+                  <w:pPr>
+                    <w:pStyle w:val="Compact"/>
+                    <w:jc w:val="left"/>
+                    <w:jc w:val="center"/>
+                  </w:pPr>
+                  <w:r>
+                    <w:t xml:space="preserve">12.45 (0.50)</w:t>
+                  </w:r>
+                </w:p>
+              </w:tc>
+            </w:tr>
+            <w:tr>
+              <w:tc>
+                <w:tcPr/>
+                <w:p>
+                  <w:pPr>
+                    <w:pStyle w:val="Compact"/>
+                    <w:jc w:val="left"/>
+                    <w:jc w:val="center"/>
+                  </w:pPr>
+                  <w:r>
+                    <w:t xml:space="preserve">Socioeconomic Position (mean (SD))</w:t>
+                  </w:r>
+                </w:p>
+              </w:tc>
+              <w:tc>
+                <w:tcPr/>
+                <w:p>
+                  <w:pPr>
+                    <w:pStyle w:val="Compact"/>
+                    <w:jc w:val="left"/>
+                    <w:jc w:val="center"/>
+                  </w:pPr>
+                  <w:r>
+                    <w:t xml:space="preserve">0.00 (0.96)</w:t>
+                  </w:r>
+                </w:p>
+              </w:tc>
+              <w:tc>
+                <w:tcPr/>
+                <w:p>
+                  <w:pPr>
+                    <w:pStyle w:val="Compact"/>
+                    <w:jc w:val="left"/>
+                    <w:jc w:val="center"/>
+                  </w:pPr>
+                  <w:r>
+                    <w:t xml:space="preserve">0.01 (0.99)</w:t>
+                  </w:r>
+                </w:p>
+              </w:tc>
+              <w:tc>
+                <w:tcPr/>
+                <w:p>
+                  <w:pPr>
+                    <w:pStyle w:val="Compact"/>
+                    <w:jc w:val="left"/>
+                    <w:jc w:val="center"/>
+                  </w:pPr>
+                  <w:r>
+                    <w:t xml:space="preserve">0.00 (0.98)</w:t>
+                  </w:r>
+                </w:p>
+              </w:tc>
+              <w:tc>
+                <w:tcPr/>
+                <w:p>
+                  <w:pPr>
+                    <w:pStyle w:val="Compact"/>
+                    <w:jc w:val="left"/>
+                    <w:jc w:val="center"/>
+                  </w:pPr>
+                  <w:r>
+                    <w:t xml:space="preserve">0.02 (0.98)</w:t>
+                  </w:r>
+                </w:p>
+              </w:tc>
+              <w:tc>
+                <w:tcPr/>
+                <w:p>
+                  <w:pPr>
+                    <w:pStyle w:val="Compact"/>
+                    <w:jc w:val="left"/>
+                    <w:jc w:val="center"/>
+                  </w:pPr>
+                  <w:r>
+                    <w:t xml:space="preserve">0.00 (0.97)</w:t>
+                  </w:r>
+                </w:p>
+              </w:tc>
+              <w:tc>
+                <w:tcPr/>
+                <w:p>
+                  <w:pPr>
+                    <w:pStyle w:val="Compact"/>
+                    <w:jc w:val="left"/>
+                    <w:jc w:val="center"/>
+                  </w:pPr>
+                  <w:r>
+                    <w:t xml:space="preserve">0.01 (1.00)</w:t>
+                  </w:r>
+                </w:p>
+              </w:tc>
+            </w:tr>
+            <w:tr>
+              <w:tc>
+                <w:tcPr/>
+                <w:p>
+                  <w:pPr>
+                    <w:pStyle w:val="Compact"/>
+                    <w:jc w:val="left"/>
+                    <w:jc w:val="center"/>
+                  </w:pPr>
+                  <w:r>
+                    <w:t xml:space="preserve">Body Mass Index (mean (SD))</w:t>
+                  </w:r>
+                </w:p>
+              </w:tc>
+              <w:tc>
+                <w:tcPr/>
+                <w:p>
+                  <w:pPr>
+                    <w:pStyle w:val="Compact"/>
+                    <w:jc w:val="left"/>
+                    <w:jc w:val="center"/>
+                  </w:pPr>
+                  <w:r>
+                    <w:t xml:space="preserve">17.59 (2.86)</w:t>
+                  </w:r>
+                </w:p>
+              </w:tc>
+              <w:tc>
+                <w:tcPr/>
+                <w:p>
+                  <w:pPr>
+                    <w:pStyle w:val="Compact"/>
+                    <w:jc w:val="left"/>
+                    <w:jc w:val="center"/>
+                  </w:pPr>
+                  <w:r>
+                    <w:t xml:space="preserve">17.62 (2.81)</w:t>
+                  </w:r>
+                </w:p>
+              </w:tc>
+              <w:tc>
+                <w:tcPr/>
+                <w:p>
+                  <w:pPr>
+                    <w:pStyle w:val="Compact"/>
+                    <w:jc w:val="left"/>
+                    <w:jc w:val="center"/>
+                  </w:pPr>
+                  <w:r>
+                    <w:t xml:space="preserve">18.90 (3.57)</w:t>
+                  </w:r>
+                </w:p>
+              </w:tc>
+              <w:tc>
+                <w:tcPr/>
+                <w:p>
+                  <w:pPr>
+                    <w:pStyle w:val="Compact"/>
+                    <w:jc w:val="left"/>
+                    <w:jc w:val="center"/>
+                  </w:pPr>
+                  <w:r>
+                    <w:t xml:space="preserve">18.94 (3.89)</w:t>
+                  </w:r>
+                </w:p>
+              </w:tc>
+              <w:tc>
+                <w:tcPr/>
+                <w:p>
+                  <w:pPr>
+                    <w:pStyle w:val="Compact"/>
+                    <w:jc w:val="left"/>
+                    <w:jc w:val="center"/>
+                  </w:pPr>
+                  <w:r>
+                    <w:t xml:space="preserve">20.19 (3.88)</w:t>
+                  </w:r>
+                </w:p>
+              </w:tc>
+              <w:tc>
+                <w:tcPr/>
+                <w:p>
+                  <w:pPr>
+                    <w:pStyle w:val="Compact"/>
+                    <w:jc w:val="left"/>
+                    <w:jc w:val="center"/>
+                  </w:pPr>
+                  <w:r>
+                    <w:t xml:space="preserve">20.72 (3.79)</w:t>
+                  </w:r>
+                </w:p>
+              </w:tc>
+            </w:tr>
+            <w:tr>
+              <w:tc>
+                <w:tcPr/>
+                <w:p>
+                  <w:pPr>
+                    <w:pStyle w:val="Compact"/>
+                    <w:jc w:val="left"/>
+                    <w:jc w:val="center"/>
+                  </w:pPr>
+                  <w:r>
+                    <w:t xml:space="preserve">BMI z-score (mean (SD))</w:t>
+                  </w:r>
+                </w:p>
+              </w:tc>
+              <w:tc>
+                <w:tcPr/>
+                <w:p>
+                  <w:pPr>
+                    <w:pStyle w:val="Compact"/>
+                    <w:jc w:val="left"/>
+                    <w:jc w:val="center"/>
+                  </w:pPr>
+                  <w:r>
+                    <w:t xml:space="preserve">0.41 (0.99)</w:t>
+                  </w:r>
+                </w:p>
+              </w:tc>
+              <w:tc>
+                <w:tcPr/>
+                <w:p>
+                  <w:pPr>
+                    <w:pStyle w:val="Compact"/>
+                    <w:jc w:val="left"/>
+                    <w:jc w:val="center"/>
+                  </w:pPr>
+                  <w:r>
+                    <w:t xml:space="preserve">0.36 (0.96)</w:t>
+                  </w:r>
+                </w:p>
+              </w:tc>
+              <w:tc>
+                <w:tcPr/>
+                <w:p>
+                  <w:pPr>
+                    <w:pStyle w:val="Compact"/>
+                    <w:jc w:val="left"/>
+                    <w:jc w:val="center"/>
+                  </w:pPr>
+                  <w:r>
+                    <w:t xml:space="preserve">0.39 (1.03)</w:t>
+                  </w:r>
+                </w:p>
+              </w:tc>
+              <w:tc>
+                <w:tcPr/>
+                <w:p>
+                  <w:pPr>
+                    <w:pStyle w:val="Compact"/>
+                    <w:jc w:val="left"/>
+                    <w:jc w:val="center"/>
+                  </w:pPr>
+                  <w:r>
+                    <w:t xml:space="preserve">0.29 (1.01)</w:t>
+                  </w:r>
+                </w:p>
+              </w:tc>
+              <w:tc>
+                <w:tcPr/>
+                <w:p>
+                  <w:pPr>
+                    <w:pStyle w:val="Compact"/>
+                    <w:jc w:val="left"/>
+                    <w:jc w:val="center"/>
+                  </w:pPr>
+                  <w:r>
+                    <w:t xml:space="preserve">0.31 (1.06)</w:t>
+                  </w:r>
+                </w:p>
+              </w:tc>
+              <w:tc>
+                <w:tcPr/>
+                <w:p>
+                  <w:pPr>
+                    <w:pStyle w:val="Compact"/>
+                    <w:jc w:val="left"/>
+                    <w:jc w:val="center"/>
+                  </w:pPr>
+                  <w:r>
+                    <w:t xml:space="preserve">0.39 (0.95)</w:t>
+                  </w:r>
+                </w:p>
+              </w:tc>
+            </w:tr>
+            <w:tr>
+              <w:tc>
+                <w:tcPr/>
+                <w:p>
+                  <w:pPr>
+                    <w:pStyle w:val="Compact"/>
+                    <w:jc w:val="left"/>
+                    <w:jc w:val="center"/>
+                  </w:pPr>
+                  <w:r>
+                    <w:t xml:space="preserve">Body Image (Current) (%)</w:t>
+                  </w:r>
+                </w:p>
+              </w:tc>
+              <w:tc>
+                <w:tcPr/>
+                <w:p>
+                  <w:pPr>
+                    <w:pStyle w:val="Compact"/>
+                  </w:pPr>
+                </w:p>
+              </w:tc>
+              <w:tc>
+                <w:tcPr/>
+                <w:p>
+                  <w:pPr>
+                    <w:pStyle w:val="Compact"/>
+                  </w:pPr>
+                </w:p>
+              </w:tc>
+              <w:tc>
+                <w:tcPr/>
+                <w:p>
+                  <w:pPr>
+                    <w:pStyle w:val="Compact"/>
+                  </w:pPr>
+                </w:p>
+              </w:tc>
+              <w:tc>
+                <w:tcPr/>
+                <w:p>
+                  <w:pPr>
+                    <w:pStyle w:val="Compact"/>
+                  </w:pPr>
+                </w:p>
+              </w:tc>
+              <w:tc>
+                <w:tcPr/>
+                <w:p>
+                  <w:pPr>
+                    <w:pStyle w:val="Compact"/>
+                  </w:pPr>
+                </w:p>
+              </w:tc>
+              <w:tc>
+                <w:tcPr/>
+                <w:p>
+                  <w:pPr>
+                    <w:pStyle w:val="Compact"/>
+                  </w:pPr>
+                </w:p>
+              </w:tc>
+            </w:tr>
+            <w:tr>
+              <w:tc>
+                <w:tcPr/>
+                <w:p>
+                  <w:pPr>
+                    <w:pStyle w:val="Compact"/>
+                    <w:jc w:val="left"/>
+                    <w:jc w:val="center"/>
+                  </w:pPr>
+                  <w:r>
+                    <w:t xml:space="preserve">Picture 1</w:t>
+                  </w:r>
+                </w:p>
+              </w:tc>
+              <w:tc>
+                <w:tcPr/>
+                <w:p>
+                  <w:pPr>
+                    <w:pStyle w:val="Compact"/>
+                    <w:jc w:val="left"/>
+                    <w:jc w:val="center"/>
+                  </w:pPr>
+                  <w:r>
+                    <w:t xml:space="preserve">137 (3.3)</w:t>
+                  </w:r>
+                </w:p>
+              </w:tc>
+              <w:tc>
+                <w:tcPr/>
+                <w:p>
+                  <w:pPr>
+                    <w:pStyle w:val="Compact"/>
+                    <w:jc w:val="left"/>
+                    <w:jc w:val="center"/>
+                  </w:pPr>
+                  <w:r>
+                    <w:t xml:space="preserve">76 (1.9)</w:t>
+                  </w:r>
+                </w:p>
+              </w:tc>
+              <w:tc>
+                <w:tcPr/>
+                <w:p>
+                  <w:pPr>
+                    <w:pStyle w:val="Compact"/>
+                    <w:jc w:val="left"/>
+                    <w:jc w:val="center"/>
+                  </w:pPr>
+                  <w:r>
+                    <w:t xml:space="preserve">31 (0.8)</w:t>
+                  </w:r>
+                </w:p>
+              </w:tc>
+              <w:tc>
+                <w:tcPr/>
+                <w:p>
+                  <w:pPr>
+                    <w:pStyle w:val="Compact"/>
+                    <w:jc w:val="left"/>
+                    <w:jc w:val="center"/>
+                  </w:pPr>
+                  <w:r>
+                    <w:t xml:space="preserve">21 (0.6)</w:t>
+                  </w:r>
+                </w:p>
+              </w:tc>
+              <w:tc>
+                <w:tcPr/>
+                <w:p>
+                  <w:pPr>
+                    <w:pStyle w:val="Compact"/>
+                    <w:jc w:val="left"/>
+                    <w:jc w:val="center"/>
+                  </w:pPr>
+                  <w:r>
+                    <w:t xml:space="preserve">12 (0.3)</w:t>
+                  </w:r>
+                </w:p>
+              </w:tc>
+              <w:tc>
+                <w:tcPr/>
+                <w:p>
+                  <w:pPr>
+                    <w:pStyle w:val="Compact"/>
+                    <w:jc w:val="left"/>
+                    <w:jc w:val="center"/>
+                  </w:pPr>
+                  <w:r>
+                    <w:t xml:space="preserve">9 (0.3)</w:t>
+                  </w:r>
+                </w:p>
+              </w:tc>
+            </w:tr>
+            <w:tr>
+              <w:tc>
+                <w:tcPr/>
+                <w:p>
+                  <w:pPr>
+                    <w:pStyle w:val="Compact"/>
+                    <w:jc w:val="left"/>
+                    <w:jc w:val="center"/>
+                  </w:pPr>
+                  <w:r>
+                    <w:t xml:space="preserve">Picture 2</w:t>
+                  </w:r>
+                </w:p>
+              </w:tc>
+              <w:tc>
+                <w:tcPr/>
+                <w:p>
+                  <w:pPr>
+                    <w:pStyle w:val="Compact"/>
+                    <w:jc w:val="left"/>
+                    <w:jc w:val="center"/>
+                  </w:pPr>
+                  <w:r>
+                    <w:t xml:space="preserve">340 (8.1)</w:t>
+                  </w:r>
+                </w:p>
+              </w:tc>
+              <w:tc>
+                <w:tcPr/>
+                <w:p>
+                  <w:pPr>
+                    <w:pStyle w:val="Compact"/>
+                    <w:jc w:val="left"/>
+                    <w:jc w:val="center"/>
+                  </w:pPr>
+                  <w:r>
+                    <w:t xml:space="preserve">339 (8.4)</w:t>
+                  </w:r>
+                </w:p>
+              </w:tc>
+              <w:tc>
+                <w:tcPr/>
+                <w:p>
+                  <w:pPr>
+                    <w:pStyle w:val="Compact"/>
+                    <w:jc w:val="left"/>
+                    <w:jc w:val="center"/>
+                  </w:pPr>
+                  <w:r>
+                    <w:t xml:space="preserve">154 (3.9)</w:t>
+                  </w:r>
+                </w:p>
+              </w:tc>
+              <w:tc>
+                <w:tcPr/>
+                <w:p>
+                  <w:pPr>
+                    <w:pStyle w:val="Compact"/>
+                    <w:jc w:val="left"/>
+                    <w:jc w:val="center"/>
+                  </w:pPr>
+                  <w:r>
+                    <w:t xml:space="preserve">177 (4.7)</w:t>
+                  </w:r>
+                </w:p>
+              </w:tc>
+              <w:tc>
+                <w:tcPr/>
+                <w:p>
+                  <w:pPr>
+                    <w:pStyle w:val="Compact"/>
+                    <w:jc w:val="left"/>
+                    <w:jc w:val="center"/>
+                  </w:pPr>
+                  <w:r>
+                    <w:t xml:space="preserve">133 (3.7)</w:t>
+                  </w:r>
+                </w:p>
+              </w:tc>
+              <w:tc>
+                <w:tcPr/>
+                <w:p>
+                  <w:pPr>
+                    <w:pStyle w:val="Compact"/>
+                    <w:jc w:val="left"/>
+                    <w:jc w:val="center"/>
+                  </w:pPr>
+                  <w:r>
+                    <w:t xml:space="preserve">118 (3.4)</w:t>
+                  </w:r>
+                </w:p>
+              </w:tc>
+            </w:tr>
+            <w:tr>
+              <w:tc>
+                <w:tcPr/>
+                <w:p>
+                  <w:pPr>
+                    <w:pStyle w:val="Compact"/>
+                    <w:jc w:val="left"/>
+                    <w:jc w:val="center"/>
+                  </w:pPr>
+                  <w:r>
+                    <w:t xml:space="preserve">Picture 3</w:t>
+                  </w:r>
+                </w:p>
+              </w:tc>
+              <w:tc>
+                <w:tcPr/>
+                <w:p>
+                  <w:pPr>
+                    <w:pStyle w:val="Compact"/>
+                    <w:jc w:val="left"/>
+                    <w:jc w:val="center"/>
+                  </w:pPr>
+                  <w:r>
+                    <w:t xml:space="preserve">1375 (32.6)</w:t>
+                  </w:r>
+                </w:p>
+              </w:tc>
+              <w:tc>
+                <w:tcPr/>
+                <w:p>
+                  <w:pPr>
+                    <w:pStyle w:val="Compact"/>
+                    <w:jc w:val="left"/>
+                    <w:jc w:val="center"/>
+                  </w:pPr>
+                  <w:r>
+                    <w:t xml:space="preserve">918 (22.8)</w:t>
+                  </w:r>
+                </w:p>
+              </w:tc>
+              <w:tc>
+                <w:tcPr/>
+                <w:p>
+                  <w:pPr>
+                    <w:pStyle w:val="Compact"/>
+                    <w:jc w:val="left"/>
+                    <w:jc w:val="center"/>
+                  </w:pPr>
+                  <w:r>
+                    <w:t xml:space="preserve">1059 (27.1)</w:t>
+                  </w:r>
+                </w:p>
+              </w:tc>
+              <w:tc>
+                <w:tcPr/>
+                <w:p>
+                  <w:pPr>
+                    <w:pStyle w:val="Compact"/>
+                    <w:jc w:val="left"/>
+                    <w:jc w:val="center"/>
+                  </w:pPr>
+                  <w:r>
+                    <w:t xml:space="preserve">740 (19.7)</w:t>
+                  </w:r>
+                </w:p>
+              </w:tc>
+              <w:tc>
+                <w:tcPr/>
+                <w:p>
+                  <w:pPr>
+                    <w:pStyle w:val="Compact"/>
+                    <w:jc w:val="left"/>
+                    <w:jc w:val="center"/>
+                  </w:pPr>
+                  <w:r>
+                    <w:t xml:space="preserve">955 (26.6)</w:t>
+                  </w:r>
+                </w:p>
+              </w:tc>
+              <w:tc>
+                <w:tcPr/>
+                <w:p>
+                  <w:pPr>
+                    <w:pStyle w:val="Compact"/>
+                    <w:jc w:val="left"/>
+                    <w:jc w:val="center"/>
+                  </w:pPr>
+                  <w:r>
+                    <w:t xml:space="preserve">646 (18.8)</w:t>
+                  </w:r>
+                </w:p>
+              </w:tc>
+            </w:tr>
+            <w:tr>
+              <w:tc>
+                <w:tcPr/>
+                <w:p>
+                  <w:pPr>
+                    <w:pStyle w:val="Compact"/>
+                    <w:jc w:val="left"/>
+                    <w:jc w:val="center"/>
+                  </w:pPr>
+                  <w:r>
+                    <w:t xml:space="preserve">Picture 4</w:t>
+                  </w:r>
+                </w:p>
+              </w:tc>
+              <w:tc>
+                <w:tcPr/>
+                <w:p>
+                  <w:pPr>
+                    <w:pStyle w:val="Compact"/>
+                    <w:jc w:val="left"/>
+                    <w:jc w:val="center"/>
+                  </w:pPr>
+                  <w:r>
+                    <w:t xml:space="preserve">1843 (43.7)</w:t>
+                  </w:r>
+                </w:p>
+              </w:tc>
+              <w:tc>
+                <w:tcPr/>
+                <w:p>
+                  <w:pPr>
+                    <w:pStyle w:val="Compact"/>
+                    <w:jc w:val="left"/>
+                    <w:jc w:val="center"/>
+                  </w:pPr>
+                  <w:r>
+                    <w:t xml:space="preserve">2027 (50.3)</w:t>
+                  </w:r>
+                </w:p>
+              </w:tc>
+              <w:tc>
+                <w:tcPr/>
+                <w:p>
+                  <w:pPr>
+                    <w:pStyle w:val="Compact"/>
+                    <w:jc w:val="left"/>
+                    <w:jc w:val="center"/>
+                  </w:pPr>
+                  <w:r>
+                    <w:t xml:space="preserve">1807 (46.2)</w:t>
+                  </w:r>
+                </w:p>
+              </w:tc>
+              <w:tc>
+                <w:tcPr/>
+                <w:p>
+                  <w:pPr>
+                    <w:pStyle w:val="Compact"/>
+                    <w:jc w:val="left"/>
+                    <w:jc w:val="center"/>
+                  </w:pPr>
+                  <w:r>
+                    <w:t xml:space="preserve">1972 (52.5)</w:t>
+                  </w:r>
+                </w:p>
+              </w:tc>
+              <w:tc>
+                <w:tcPr/>
+                <w:p>
+                  <w:pPr>
+                    <w:pStyle w:val="Compact"/>
+                    <w:jc w:val="left"/>
+                    <w:jc w:val="center"/>
+                  </w:pPr>
+                  <w:r>
+                    <w:t xml:space="preserve">1552 (43.3)</w:t>
+                  </w:r>
+                </w:p>
+              </w:tc>
+              <w:tc>
+                <w:tcPr/>
+                <w:p>
+                  <w:pPr>
+                    <w:pStyle w:val="Compact"/>
+                    <w:jc w:val="left"/>
+                    <w:jc w:val="center"/>
+                  </w:pPr>
+                  <w:r>
+                    <w:t xml:space="preserve">1675 (48.6)</w:t>
+                  </w:r>
+                </w:p>
+              </w:tc>
+            </w:tr>
+            <w:tr>
+              <w:tc>
+                <w:tcPr/>
+                <w:p>
+                  <w:pPr>
+                    <w:pStyle w:val="Compact"/>
+                    <w:jc w:val="left"/>
+                    <w:jc w:val="center"/>
+                  </w:pPr>
+                  <w:r>
+                    <w:t xml:space="preserve">Picture 5</w:t>
+                  </w:r>
+                </w:p>
+              </w:tc>
+              <w:tc>
+                <w:tcPr/>
+                <w:p>
+                  <w:pPr>
+                    <w:pStyle w:val="Compact"/>
+                    <w:jc w:val="left"/>
+                    <w:jc w:val="center"/>
+                  </w:pPr>
+                  <w:r>
+                    <w:t xml:space="preserve">462 (11.0)</w:t>
+                  </w:r>
+                </w:p>
+              </w:tc>
+              <w:tc>
+                <w:tcPr/>
+                <w:p>
+                  <w:pPr>
+                    <w:pStyle w:val="Compact"/>
+                    <w:jc w:val="left"/>
+                    <w:jc w:val="center"/>
+                  </w:pPr>
+                  <w:r>
+                    <w:t xml:space="preserve">608 (15.1)</w:t>
+                  </w:r>
+                </w:p>
+              </w:tc>
+              <w:tc>
+                <w:tcPr/>
+                <w:p>
+                  <w:pPr>
+                    <w:pStyle w:val="Compact"/>
+                    <w:jc w:val="left"/>
+                    <w:jc w:val="center"/>
+                  </w:pPr>
+                  <w:r>
+                    <w:t xml:space="preserve">736 (18.8)</w:t>
+                  </w:r>
+                </w:p>
+              </w:tc>
+              <w:tc>
+                <w:tcPr/>
+                <w:p>
+                  <w:pPr>
+                    <w:pStyle w:val="Compact"/>
+                    <w:jc w:val="left"/>
+                    <w:jc w:val="center"/>
+                  </w:pPr>
+                  <w:r>
+                    <w:t xml:space="preserve">742 (19.8)</w:t>
+                  </w:r>
+                </w:p>
+              </w:tc>
+              <w:tc>
+                <w:tcPr/>
+                <w:p>
+                  <w:pPr>
+                    <w:pStyle w:val="Compact"/>
+                    <w:jc w:val="left"/>
+                    <w:jc w:val="center"/>
+                  </w:pPr>
+                  <w:r>
+                    <w:t xml:space="preserve">765 (21.3)</w:t>
+                  </w:r>
+                </w:p>
+              </w:tc>
+              <w:tc>
+                <w:tcPr/>
+                <w:p>
+                  <w:pPr>
+                    <w:pStyle w:val="Compact"/>
+                    <w:jc w:val="left"/>
+                    <w:jc w:val="center"/>
+                  </w:pPr>
+                  <w:r>
+                    <w:t xml:space="preserve">858 (24.9)</w:t>
+                  </w:r>
+                </w:p>
+              </w:tc>
+            </w:tr>
+            <w:tr>
+              <w:tc>
+                <w:tcPr/>
+                <w:p>
+                  <w:pPr>
+                    <w:pStyle w:val="Compact"/>
+                    <w:jc w:val="left"/>
+                    <w:jc w:val="center"/>
+                  </w:pPr>
+                  <w:r>
+                    <w:t xml:space="preserve">Picture 6</w:t>
+                  </w:r>
+                </w:p>
+              </w:tc>
+              <w:tc>
+                <w:tcPr/>
+                <w:p>
+                  <w:pPr>
+                    <w:pStyle w:val="Compact"/>
+                    <w:jc w:val="left"/>
+                    <w:jc w:val="center"/>
+                  </w:pPr>
+                  <w:r>
+                    <w:t xml:space="preserve">48 (1.1)</w:t>
+                  </w:r>
+                </w:p>
+              </w:tc>
+              <w:tc>
+                <w:tcPr/>
+                <w:p>
+                  <w:pPr>
+                    <w:pStyle w:val="Compact"/>
+                    <w:jc w:val="left"/>
+                    <w:jc w:val="center"/>
+                  </w:pPr>
+                  <w:r>
+                    <w:t xml:space="preserve">46 (1.1)</w:t>
+                  </w:r>
+                </w:p>
+              </w:tc>
+              <w:tc>
+                <w:tcPr/>
+                <w:p>
+                  <w:pPr>
+                    <w:pStyle w:val="Compact"/>
+                    <w:jc w:val="left"/>
+                    <w:jc w:val="center"/>
+                  </w:pPr>
+                  <w:r>
+                    <w:t xml:space="preserve">109 (2.8)</w:t>
+                  </w:r>
+                </w:p>
+              </w:tc>
+              <w:tc>
+                <w:tcPr/>
+                <w:p>
+                  <w:pPr>
+                    <w:pStyle w:val="Compact"/>
+                    <w:jc w:val="left"/>
+                    <w:jc w:val="center"/>
+                  </w:pPr>
+                  <w:r>
+                    <w:t xml:space="preserve">88 (2.3)</w:t>
+                  </w:r>
+                </w:p>
+              </w:tc>
+              <w:tc>
+                <w:tcPr/>
+                <w:p>
+                  <w:pPr>
+                    <w:pStyle w:val="Compact"/>
+                    <w:jc w:val="left"/>
+                    <w:jc w:val="center"/>
+                  </w:pPr>
+                  <w:r>
+                    <w:t xml:space="preserve">154 (4.3)</w:t>
+                  </w:r>
+                </w:p>
+              </w:tc>
+              <w:tc>
+                <w:tcPr/>
+                <w:p>
+                  <w:pPr>
+                    <w:pStyle w:val="Compact"/>
+                    <w:jc w:val="left"/>
+                    <w:jc w:val="center"/>
+                  </w:pPr>
+                  <w:r>
+                    <w:t xml:space="preserve">127 (3.7)</w:t>
+                  </w:r>
+                </w:p>
+              </w:tc>
+            </w:tr>
+            <w:tr>
+              <w:tc>
+                <w:tcPr/>
+                <w:p>
+                  <w:pPr>
+                    <w:pStyle w:val="Compact"/>
+                    <w:jc w:val="left"/>
+                    <w:jc w:val="center"/>
+                  </w:pPr>
+                  <w:r>
+                    <w:t xml:space="preserve">Picture 7</w:t>
+                  </w:r>
+                </w:p>
+              </w:tc>
+              <w:tc>
+                <w:tcPr/>
+                <w:p>
+                  <w:pPr>
+                    <w:pStyle w:val="Compact"/>
+                    <w:jc w:val="left"/>
+                    <w:jc w:val="center"/>
+                  </w:pPr>
+                  <w:r>
+                    <w:t xml:space="preserve">8 (0.2)</w:t>
+                  </w:r>
+                </w:p>
+              </w:tc>
+              <w:tc>
+                <w:tcPr/>
+                <w:p>
+                  <w:pPr>
+                    <w:pStyle w:val="Compact"/>
+                    <w:jc w:val="left"/>
+                    <w:jc w:val="center"/>
+                  </w:pPr>
+                  <w:r>
+                    <w:t xml:space="preserve">16 (0.4)</w:t>
+                  </w:r>
+                </w:p>
+              </w:tc>
+              <w:tc>
+                <w:tcPr/>
+                <w:p>
+                  <w:pPr>
+                    <w:pStyle w:val="Compact"/>
+                    <w:jc w:val="left"/>
+                    <w:jc w:val="center"/>
+                  </w:pPr>
+                  <w:r>
+                    <w:t xml:space="preserve">18 (0.5)</w:t>
+                  </w:r>
+                </w:p>
+              </w:tc>
+              <w:tc>
+                <w:tcPr/>
+                <w:p>
+                  <w:pPr>
+                    <w:pStyle w:val="Compact"/>
+                    <w:jc w:val="left"/>
+                    <w:jc w:val="center"/>
+                  </w:pPr>
+                  <w:r>
+                    <w:t xml:space="preserve">14 (0.4)</w:t>
+                  </w:r>
+                </w:p>
+              </w:tc>
+              <w:tc>
+                <w:tcPr/>
+                <w:p>
+                  <w:pPr>
+                    <w:pStyle w:val="Compact"/>
+                    <w:jc w:val="left"/>
+                    <w:jc w:val="center"/>
+                  </w:pPr>
+                  <w:r>
+                    <w:t xml:space="preserve">17 (0.5)</w:t>
+                  </w:r>
+                </w:p>
+              </w:tc>
+              <w:tc>
+                <w:tcPr/>
+                <w:p>
+                  <w:pPr>
+                    <w:pStyle w:val="Compact"/>
+                    <w:jc w:val="left"/>
+                    <w:jc w:val="center"/>
+                  </w:pPr>
+                  <w:r>
+                    <w:t xml:space="preserve">12 (0.3)</w:t>
+                  </w:r>
+                </w:p>
+              </w:tc>
+            </w:tr>
+            <w:tr>
+              <w:tc>
+                <w:tcPr/>
+                <w:p>
+                  <w:pPr>
+                    <w:pStyle w:val="Compact"/>
+                    <w:jc w:val="left"/>
+                    <w:jc w:val="center"/>
+                  </w:pPr>
+                  <w:r>
+                    <w:t xml:space="preserve">Body Image (Ideal) (%)</w:t>
+                  </w:r>
+                </w:p>
+              </w:tc>
+              <w:tc>
+                <w:tcPr/>
+                <w:p>
+                  <w:pPr>
+                    <w:pStyle w:val="Compact"/>
+                  </w:pPr>
+                </w:p>
+              </w:tc>
+              <w:tc>
+                <w:tcPr/>
+                <w:p>
+                  <w:pPr>
+                    <w:pStyle w:val="Compact"/>
+                  </w:pPr>
+                </w:p>
+              </w:tc>
+              <w:tc>
+                <w:tcPr/>
+                <w:p>
+                  <w:pPr>
+                    <w:pStyle w:val="Compact"/>
+                  </w:pPr>
+                </w:p>
+              </w:tc>
+              <w:tc>
+                <w:tcPr/>
+                <w:p>
+                  <w:pPr>
+                    <w:pStyle w:val="Compact"/>
+                  </w:pPr>
+                </w:p>
+              </w:tc>
+              <w:tc>
+                <w:tcPr/>
+                <w:p>
+                  <w:pPr>
+                    <w:pStyle w:val="Compact"/>
+                  </w:pPr>
+                </w:p>
+              </w:tc>
+              <w:tc>
+                <w:tcPr/>
+                <w:p>
+                  <w:pPr>
+                    <w:pStyle w:val="Compact"/>
+                  </w:pPr>
+                </w:p>
+              </w:tc>
+            </w:tr>
+            <w:tr>
+              <w:tc>
+                <w:tcPr/>
+                <w:p>
+                  <w:pPr>
+                    <w:pStyle w:val="Compact"/>
+                    <w:jc w:val="left"/>
+                    <w:jc w:val="center"/>
+                  </w:pPr>
+                  <w:r>
+                    <w:t xml:space="preserve">Picture 1</w:t>
+                  </w:r>
+                </w:p>
+              </w:tc>
+              <w:tc>
+                <w:tcPr/>
+                <w:p>
+                  <w:pPr>
+                    <w:pStyle w:val="Compact"/>
+                    <w:jc w:val="left"/>
+                    <w:jc w:val="center"/>
+                  </w:pPr>
+                  <w:r>
+                    <w:t xml:space="preserve">300 (7.1)</w:t>
+                  </w:r>
+                </w:p>
+              </w:tc>
+              <w:tc>
+                <w:tcPr/>
+                <w:p>
+                  <w:pPr>
+                    <w:pStyle w:val="Compact"/>
+                    <w:jc w:val="left"/>
+                    <w:jc w:val="center"/>
+                  </w:pPr>
+                  <w:r>
+                    <w:t xml:space="preserve">255 (6.3)</w:t>
+                  </w:r>
+                </w:p>
+              </w:tc>
+              <w:tc>
+                <w:tcPr/>
+                <w:p>
+                  <w:pPr>
+                    <w:pStyle w:val="Compact"/>
+                    <w:jc w:val="left"/>
+                    <w:jc w:val="center"/>
+                  </w:pPr>
+                  <w:r>
+                    <w:t xml:space="preserve">67 (1.7)</w:t>
+                  </w:r>
+                </w:p>
+              </w:tc>
+              <w:tc>
+                <w:tcPr/>
+                <w:p>
+                  <w:pPr>
+                    <w:pStyle w:val="Compact"/>
+                    <w:jc w:val="left"/>
+                    <w:jc w:val="center"/>
+                  </w:pPr>
+                  <w:r>
+                    <w:t xml:space="preserve">50 (1.3)</w:t>
+                  </w:r>
+                </w:p>
+              </w:tc>
+              <w:tc>
+                <w:tcPr/>
+                <w:p>
+                  <w:pPr>
+                    <w:pStyle w:val="Compact"/>
+                    <w:jc w:val="left"/>
+                    <w:jc w:val="center"/>
+                  </w:pPr>
+                  <w:r>
+                    <w:t xml:space="preserve">18 (0.5)</w:t>
+                  </w:r>
+                </w:p>
+              </w:tc>
+              <w:tc>
+                <w:tcPr/>
+                <w:p>
+                  <w:pPr>
+                    <w:pStyle w:val="Compact"/>
+                    <w:jc w:val="left"/>
+                    <w:jc w:val="center"/>
+                  </w:pPr>
+                  <w:r>
+                    <w:t xml:space="preserve">26 (0.8)</w:t>
+                  </w:r>
+                </w:p>
+              </w:tc>
+            </w:tr>
+            <w:tr>
+              <w:tc>
+                <w:tcPr/>
+                <w:p>
+                  <w:pPr>
+                    <w:pStyle w:val="Compact"/>
+                    <w:jc w:val="left"/>
+                    <w:jc w:val="center"/>
+                  </w:pPr>
+                  <w:r>
+                    <w:t xml:space="preserve">Picture 2</w:t>
+                  </w:r>
+                </w:p>
+              </w:tc>
+              <w:tc>
+                <w:tcPr/>
+                <w:p>
+                  <w:pPr>
+                    <w:pStyle w:val="Compact"/>
+                    <w:jc w:val="left"/>
+                    <w:jc w:val="center"/>
+                  </w:pPr>
+                  <w:r>
+                    <w:t xml:space="preserve">611 (14.5)</w:t>
+                  </w:r>
+                </w:p>
+              </w:tc>
+              <w:tc>
+                <w:tcPr/>
+                <w:p>
+                  <w:pPr>
+                    <w:pStyle w:val="Compact"/>
+                    <w:jc w:val="left"/>
+                    <w:jc w:val="center"/>
+                  </w:pPr>
+                  <w:r>
+                    <w:t xml:space="preserve">612 (15.2)</w:t>
+                  </w:r>
+                </w:p>
+              </w:tc>
+              <w:tc>
+                <w:tcPr/>
+                <w:p>
+                  <w:pPr>
+                    <w:pStyle w:val="Compact"/>
+                    <w:jc w:val="left"/>
+                    <w:jc w:val="center"/>
+                  </w:pPr>
+                  <w:r>
+                    <w:t xml:space="preserve">266 (6.8)</w:t>
+                  </w:r>
+                </w:p>
+              </w:tc>
+              <w:tc>
+                <w:tcPr/>
+                <w:p>
+                  <w:pPr>
+                    <w:pStyle w:val="Compact"/>
+                    <w:jc w:val="left"/>
+                    <w:jc w:val="center"/>
+                  </w:pPr>
+                  <w:r>
+                    <w:t xml:space="preserve">291 (7.8)</w:t>
+                  </w:r>
+                </w:p>
+              </w:tc>
+              <w:tc>
+                <w:tcPr/>
+                <w:p>
+                  <w:pPr>
+                    <w:pStyle w:val="Compact"/>
+                    <w:jc w:val="left"/>
+                    <w:jc w:val="center"/>
+                  </w:pPr>
+                  <w:r>
+                    <w:t xml:space="preserve">185 (5.2)</w:t>
+                  </w:r>
+                </w:p>
+              </w:tc>
+              <w:tc>
+                <w:tcPr/>
+                <w:p>
+                  <w:pPr>
+                    <w:pStyle w:val="Compact"/>
+                    <w:jc w:val="left"/>
+                    <w:jc w:val="center"/>
+                  </w:pPr>
+                  <w:r>
+                    <w:t xml:space="preserve">200 (5.8)</w:t>
+                  </w:r>
+                </w:p>
+              </w:tc>
+            </w:tr>
+            <w:tr>
+              <w:tc>
+                <w:tcPr/>
+                <w:p>
+                  <w:pPr>
+                    <w:pStyle w:val="Compact"/>
+                    <w:jc w:val="left"/>
+                    <w:jc w:val="center"/>
+                  </w:pPr>
+                  <w:r>
+                    <w:t xml:space="preserve">Picture 3</w:t>
+                  </w:r>
+                </w:p>
+              </w:tc>
+              <w:tc>
+                <w:tcPr/>
+                <w:p>
+                  <w:pPr>
+                    <w:pStyle w:val="Compact"/>
+                    <w:jc w:val="left"/>
+                    <w:jc w:val="center"/>
+                  </w:pPr>
+                  <w:r>
+                    <w:t xml:space="preserve">1646 (39.1)</w:t>
+                  </w:r>
+                </w:p>
+              </w:tc>
+              <w:tc>
+                <w:tcPr/>
+                <w:p>
+                  <w:pPr>
+                    <w:pStyle w:val="Compact"/>
+                    <w:jc w:val="left"/>
+                    <w:jc w:val="center"/>
+                  </w:pPr>
+                  <w:r>
+                    <w:t xml:space="preserve">1362 (33.8)</w:t>
+                  </w:r>
+                </w:p>
+              </w:tc>
+              <w:tc>
+                <w:tcPr/>
+                <w:p>
+                  <w:pPr>
+                    <w:pStyle w:val="Compact"/>
+                    <w:jc w:val="left"/>
+                    <w:jc w:val="center"/>
+                  </w:pPr>
+                  <w:r>
+                    <w:t xml:space="preserve">1469 (37.5)</w:t>
+                  </w:r>
+                </w:p>
+              </w:tc>
+              <w:tc>
+                <w:tcPr/>
+                <w:p>
+                  <w:pPr>
+                    <w:pStyle w:val="Compact"/>
+                    <w:jc w:val="left"/>
+                    <w:jc w:val="center"/>
+                  </w:pPr>
+                  <w:r>
+                    <w:t xml:space="preserve">1205 (32.1)</w:t>
+                  </w:r>
+                </w:p>
+              </w:tc>
+              <w:tc>
+                <w:tcPr/>
+                <w:p>
+                  <w:pPr>
+                    <w:pStyle w:val="Compact"/>
+                    <w:jc w:val="left"/>
+                    <w:jc w:val="center"/>
+                  </w:pPr>
+                  <w:r>
+                    <w:t xml:space="preserve">1182 (33.0)</w:t>
+                  </w:r>
+                </w:p>
+              </w:tc>
+              <w:tc>
+                <w:tcPr/>
+                <w:p>
+                  <w:pPr>
+                    <w:pStyle w:val="Compact"/>
+                    <w:jc w:val="left"/>
+                    <w:jc w:val="center"/>
+                  </w:pPr>
+                  <w:r>
+                    <w:t xml:space="preserve">1104 (32.0)</w:t>
+                  </w:r>
+                </w:p>
+              </w:tc>
+            </w:tr>
+            <w:tr>
+              <w:tc>
+                <w:tcPr/>
+                <w:p>
+                  <w:pPr>
+                    <w:pStyle w:val="Compact"/>
+                    <w:jc w:val="left"/>
+                    <w:jc w:val="center"/>
+                  </w:pPr>
+                  <w:r>
+                    <w:t xml:space="preserve">Picture 4</w:t>
+                  </w:r>
+                </w:p>
+              </w:tc>
+              <w:tc>
+                <w:tcPr/>
+                <w:p>
+                  <w:pPr>
+                    <w:pStyle w:val="Compact"/>
+                    <w:jc w:val="left"/>
+                    <w:jc w:val="center"/>
+                  </w:pPr>
+                  <w:r>
+                    <w:t xml:space="preserve">1422 (33.8)</w:t>
+                  </w:r>
+                </w:p>
+              </w:tc>
+              <w:tc>
+                <w:tcPr/>
+                <w:p>
+                  <w:pPr>
+                    <w:pStyle w:val="Compact"/>
+                    <w:jc w:val="left"/>
+                    <w:jc w:val="center"/>
+                  </w:pPr>
+                  <w:r>
+                    <w:t xml:space="preserve">1642 (40.8)</w:t>
+                  </w:r>
+                </w:p>
+              </w:tc>
+              <w:tc>
+                <w:tcPr/>
+                <w:p>
+                  <w:pPr>
+                    <w:pStyle w:val="Compact"/>
+                    <w:jc w:val="left"/>
+                    <w:jc w:val="center"/>
+                  </w:pPr>
+                  <w:r>
+                    <w:t xml:space="preserve">1889 (48.2)</w:t>
+                  </w:r>
+                </w:p>
+              </w:tc>
+              <w:tc>
+                <w:tcPr/>
+                <w:p>
+                  <w:pPr>
+                    <w:pStyle w:val="Compact"/>
+                    <w:jc w:val="left"/>
+                    <w:jc w:val="center"/>
+                  </w:pPr>
+                  <w:r>
+                    <w:t xml:space="preserve">2076 (55.3)</w:t>
+                  </w:r>
+                </w:p>
+              </w:tc>
+              <w:tc>
+                <w:tcPr/>
+                <w:p>
+                  <w:pPr>
+                    <w:pStyle w:val="Compact"/>
+                    <w:jc w:val="left"/>
+                    <w:jc w:val="center"/>
+                  </w:pPr>
+                  <w:r>
+                    <w:t xml:space="preserve">1878 (52.4)</w:t>
+                  </w:r>
+                </w:p>
+              </w:tc>
+              <w:tc>
+                <w:tcPr/>
+                <w:p>
+                  <w:pPr>
+                    <w:pStyle w:val="Compact"/>
+                    <w:jc w:val="left"/>
+                    <w:jc w:val="center"/>
+                  </w:pPr>
+                  <w:r>
+                    <w:t xml:space="preserve">1984 (57.6)</w:t>
+                  </w:r>
+                </w:p>
+              </w:tc>
+            </w:tr>
+            <w:tr>
+              <w:tc>
+                <w:tcPr/>
+                <w:p>
+                  <w:pPr>
+                    <w:pStyle w:val="Compact"/>
+                    <w:jc w:val="left"/>
+                    <w:jc w:val="center"/>
+                  </w:pPr>
+                  <w:r>
+                    <w:t xml:space="preserve">Picture 5</w:t>
+                  </w:r>
+                </w:p>
+              </w:tc>
+              <w:tc>
+                <w:tcPr/>
+                <w:p>
+                  <w:pPr>
+                    <w:pStyle w:val="Compact"/>
+                    <w:jc w:val="left"/>
+                    <w:jc w:val="center"/>
+                  </w:pPr>
+                  <w:r>
+                    <w:t xml:space="preserve">209 (5.0)</w:t>
+                  </w:r>
+                </w:p>
+              </w:tc>
+              <w:tc>
+                <w:tcPr/>
+                <w:p>
+                  <w:pPr>
+                    <w:pStyle w:val="Compact"/>
+                    <w:jc w:val="left"/>
+                    <w:jc w:val="center"/>
+                  </w:pPr>
+                  <w:r>
+                    <w:t xml:space="preserve">150 (3.7)</w:t>
+                  </w:r>
+                </w:p>
+              </w:tc>
+              <w:tc>
+                <w:tcPr/>
+                <w:p>
+                  <w:pPr>
+                    <w:pStyle w:val="Compact"/>
+                    <w:jc w:val="left"/>
+                    <w:jc w:val="center"/>
+                  </w:pPr>
+                  <w:r>
+                    <w:t xml:space="preserve">211 (5.4)</w:t>
+                  </w:r>
+                </w:p>
+              </w:tc>
+              <w:tc>
+                <w:tcPr/>
+                <w:p>
+                  <w:pPr>
+                    <w:pStyle w:val="Compact"/>
+                    <w:jc w:val="left"/>
+                    <w:jc w:val="center"/>
+                  </w:pPr>
+                  <w:r>
+                    <w:t xml:space="preserve">125 (3.3)</w:t>
+                  </w:r>
+                </w:p>
+              </w:tc>
+              <w:tc>
+                <w:tcPr/>
+                <w:p>
+                  <w:pPr>
+                    <w:pStyle w:val="Compact"/>
+                    <w:jc w:val="left"/>
+                    <w:jc w:val="center"/>
+                  </w:pPr>
+                  <w:r>
+                    <w:t xml:space="preserve">302 (8.4)</w:t>
+                  </w:r>
+                </w:p>
+              </w:tc>
+              <w:tc>
+                <w:tcPr/>
+                <w:p>
+                  <w:pPr>
+                    <w:pStyle w:val="Compact"/>
+                    <w:jc w:val="left"/>
+                    <w:jc w:val="center"/>
+                  </w:pPr>
+                  <w:r>
+                    <w:t xml:space="preserve">125 (3.6)</w:t>
+                  </w:r>
+                </w:p>
+              </w:tc>
+            </w:tr>
+            <w:tr>
+              <w:tc>
+                <w:tcPr/>
+                <w:p>
+                  <w:pPr>
+                    <w:pStyle w:val="Compact"/>
+                    <w:jc w:val="left"/>
+                    <w:jc w:val="center"/>
+                  </w:pPr>
+                  <w:r>
+                    <w:t xml:space="preserve">Picture 6</w:t>
+                  </w:r>
+                </w:p>
+              </w:tc>
+              <w:tc>
+                <w:tcPr/>
+                <w:p>
+                  <w:pPr>
+                    <w:pStyle w:val="Compact"/>
+                    <w:jc w:val="left"/>
+                    <w:jc w:val="center"/>
+                  </w:pPr>
+                  <w:r>
+                    <w:t xml:space="preserve">11 (0.3)</w:t>
+                  </w:r>
+                </w:p>
+              </w:tc>
+              <w:tc>
+                <w:tcPr/>
+                <w:p>
+                  <w:pPr>
+                    <w:pStyle w:val="Compact"/>
+                    <w:jc w:val="left"/>
+                    <w:jc w:val="center"/>
+                  </w:pPr>
+                  <w:r>
+                    <w:t xml:space="preserve">5 (0.1)</w:t>
+                  </w:r>
+                </w:p>
+              </w:tc>
+              <w:tc>
+                <w:tcPr/>
+                <w:p>
+                  <w:pPr>
+                    <w:pStyle w:val="Compact"/>
+                    <w:jc w:val="left"/>
+                    <w:jc w:val="center"/>
+                  </w:pPr>
+                  <w:r>
+                    <w:t xml:space="preserve">11 (0.3)</w:t>
+                  </w:r>
+                </w:p>
+              </w:tc>
+              <w:tc>
+                <w:tcPr/>
+                <w:p>
+                  <w:pPr>
+                    <w:pStyle w:val="Compact"/>
+                    <w:jc w:val="left"/>
+                    <w:jc w:val="center"/>
+                  </w:pPr>
+                  <w:r>
+                    <w:t xml:space="preserve">5 (0.1)</w:t>
+                  </w:r>
+                </w:p>
+              </w:tc>
+              <w:tc>
+                <w:tcPr/>
+                <w:p>
+                  <w:pPr>
+                    <w:pStyle w:val="Compact"/>
+                    <w:jc w:val="left"/>
+                    <w:jc w:val="center"/>
+                  </w:pPr>
+                  <w:r>
+                    <w:t xml:space="preserve">13 (0.4)</w:t>
+                  </w:r>
+                </w:p>
+              </w:tc>
+              <w:tc>
+                <w:tcPr/>
+                <w:p>
+                  <w:pPr>
+                    <w:pStyle w:val="Compact"/>
+                    <w:jc w:val="left"/>
+                    <w:jc w:val="center"/>
+                  </w:pPr>
+                  <w:r>
+                    <w:t xml:space="preserve">6 (0.2)</w:t>
+                  </w:r>
+                </w:p>
+              </w:tc>
+            </w:tr>
+            <w:tr>
+              <w:tc>
+                <w:tcPr/>
+                <w:p>
+                  <w:pPr>
+                    <w:pStyle w:val="Compact"/>
+                    <w:jc w:val="left"/>
+                    <w:jc w:val="center"/>
+                  </w:pPr>
+                  <w:r>
+                    <w:t xml:space="preserve">Picture 7</w:t>
+                  </w:r>
+                </w:p>
+              </w:tc>
+              <w:tc>
+                <w:tcPr/>
+                <w:p>
+                  <w:pPr>
+                    <w:pStyle w:val="Compact"/>
+                    <w:jc w:val="left"/>
+                    <w:jc w:val="center"/>
+                  </w:pPr>
+                  <w:r>
+                    <w:t xml:space="preserve">9 (0.2)</w:t>
+                  </w:r>
+                </w:p>
+              </w:tc>
+              <w:tc>
+                <w:tcPr/>
+                <w:p>
+                  <w:pPr>
+                    <w:pStyle w:val="Compact"/>
+                    <w:jc w:val="left"/>
+                    <w:jc w:val="center"/>
+                  </w:pPr>
+                  <w:r>
+                    <w:t xml:space="preserve">2 (0.0)</w:t>
+                  </w:r>
+                </w:p>
+              </w:tc>
+              <w:tc>
+                <w:tcPr/>
+                <w:p>
+                  <w:pPr>
+                    <w:pStyle w:val="Compact"/>
+                    <w:jc w:val="left"/>
+                    <w:jc w:val="center"/>
+                  </w:pPr>
+                  <w:r>
+                    <w:t xml:space="preserve">5 (0.1)</w:t>
+                  </w:r>
+                </w:p>
+              </w:tc>
+              <w:tc>
+                <w:tcPr/>
+                <w:p>
+                  <w:pPr>
+                    <w:pStyle w:val="Compact"/>
+                    <w:jc w:val="left"/>
+                    <w:jc w:val="center"/>
+                  </w:pPr>
+                  <w:r>
+                    <w:t xml:space="preserve">2 (0.1)</w:t>
+                  </w:r>
+                </w:p>
+              </w:tc>
+              <w:tc>
+                <w:tcPr/>
+                <w:p>
+                  <w:pPr>
+                    <w:pStyle w:val="Compact"/>
+                    <w:jc w:val="left"/>
+                    <w:jc w:val="center"/>
+                  </w:pPr>
+                  <w:r>
+                    <w:t xml:space="preserve">7 (0.2)</w:t>
+                  </w:r>
+                </w:p>
+              </w:tc>
+              <w:tc>
+                <w:tcPr/>
+                <w:p>
+                  <w:pPr>
+                    <w:pStyle w:val="Compact"/>
+                    <w:jc w:val="left"/>
+                    <w:jc w:val="center"/>
+                  </w:pPr>
+                  <w:r>
+                    <w:t xml:space="preserve">1 (0.0)</w:t>
+                  </w:r>
+                </w:p>
+              </w:tc>
+            </w:tr>
+            <w:tr>
+              <w:tc>
+                <w:tcPr/>
+                <w:p>
+                  <w:pPr>
+                    <w:pStyle w:val="Compact"/>
+                    <w:jc w:val="left"/>
+                    <w:jc w:val="center"/>
+                  </w:pPr>
+                  <w:r>
+                    <w:t xml:space="preserve">Body Dissatisfaction (Perceived - Ideal) (mean (SD))</w:t>
+                  </w:r>
+                </w:p>
+              </w:tc>
+              <w:tc>
+                <w:tcPr/>
+                <w:p>
+                  <w:pPr>
+                    <w:pStyle w:val="Compact"/>
+                    <w:jc w:val="left"/>
+                    <w:jc w:val="center"/>
+                  </w:pPr>
+                  <w:r>
+                    <w:t xml:space="preserve">0.39 (1.06)</w:t>
+                  </w:r>
+                </w:p>
+              </w:tc>
+              <w:tc>
+                <w:tcPr/>
+                <w:p>
+                  <w:pPr>
+                    <w:pStyle w:val="Compact"/>
+                    <w:jc w:val="left"/>
+                    <w:jc w:val="center"/>
+                  </w:pPr>
+                  <w:r>
+                    <w:t xml:space="preserve">0.52 (1.01)</w:t>
+                  </w:r>
+                </w:p>
+              </w:tc>
+              <w:tc>
+                <w:tcPr/>
+                <w:p>
+                  <w:pPr>
+                    <w:pStyle w:val="Compact"/>
+                    <w:jc w:val="left"/>
+                    <w:jc w:val="center"/>
+                  </w:pPr>
+                  <w:r>
+                    <w:t xml:space="preserve">0.38 (0.89)</w:t>
+                  </w:r>
+                </w:p>
+              </w:tc>
+              <w:tc>
+                <w:tcPr/>
+                <w:p>
+                  <w:pPr>
+                    <w:pStyle w:val="Compact"/>
+                    <w:jc w:val="left"/>
+                    <w:jc w:val="center"/>
+                  </w:pPr>
+                  <w:r>
+                    <w:t xml:space="preserve">0.43 (0.80)</w:t>
+                  </w:r>
+                </w:p>
+              </w:tc>
+              <w:tc>
+                <w:tcPr/>
+                <w:p>
+                  <w:pPr>
+                    <w:pStyle w:val="Compact"/>
+                    <w:jc w:val="left"/>
+                    <w:jc w:val="center"/>
+                  </w:pPr>
+                  <w:r>
+                    <w:t xml:space="preserve">0.31 (0.82)</w:t>
+                  </w:r>
+                </w:p>
+              </w:tc>
+              <w:tc>
+                <w:tcPr/>
+                <w:p>
+                  <w:pPr>
+                    <w:pStyle w:val="Compact"/>
+                    <w:jc w:val="left"/>
+                    <w:jc w:val="center"/>
+                  </w:pPr>
+                  <w:r>
+                    <w:t xml:space="preserve">0.49 (0.81)</w:t>
+                  </w:r>
+                </w:p>
+              </w:tc>
+            </w:tr>
+            <w:tr>
+              <w:tc>
+                <w:tcPr/>
+                <w:p>
+                  <w:pPr>
+                    <w:pStyle w:val="Compact"/>
+                    <w:jc w:val="left"/>
+                    <w:jc w:val="center"/>
+                  </w:pPr>
+                  <w:r>
+                    <w:t xml:space="preserve">Body Dissatisfaction (%)</w:t>
+                  </w:r>
+                </w:p>
+              </w:tc>
+              <w:tc>
+                <w:tcPr/>
+                <w:p>
+                  <w:pPr>
+                    <w:pStyle w:val="Compact"/>
+                  </w:pPr>
+                </w:p>
+              </w:tc>
+              <w:tc>
+                <w:tcPr/>
+                <w:p>
+                  <w:pPr>
+                    <w:pStyle w:val="Compact"/>
+                  </w:pPr>
+                </w:p>
+              </w:tc>
+              <w:tc>
+                <w:tcPr/>
+                <w:p>
+                  <w:pPr>
+                    <w:pStyle w:val="Compact"/>
+                  </w:pPr>
+                </w:p>
+              </w:tc>
+              <w:tc>
+                <w:tcPr/>
+                <w:p>
+                  <w:pPr>
+                    <w:pStyle w:val="Compact"/>
+                  </w:pPr>
+                </w:p>
+              </w:tc>
+              <w:tc>
+                <w:tcPr/>
+                <w:p>
+                  <w:pPr>
+                    <w:pStyle w:val="Compact"/>
+                  </w:pPr>
+                </w:p>
+              </w:tc>
+              <w:tc>
+                <w:tcPr/>
+                <w:p>
+                  <w:pPr>
+                    <w:pStyle w:val="Compact"/>
+                  </w:pPr>
+                </w:p>
+              </w:tc>
+            </w:tr>
+            <w:tr>
+              <w:tc>
+                <w:tcPr/>
+                <w:p>
+                  <w:pPr>
+                    <w:pStyle w:val="Compact"/>
+                    <w:jc w:val="left"/>
+                    <w:jc w:val="center"/>
+                  </w:pPr>
+                  <w:r>
+                    <w:t xml:space="preserve">Thinner than ideal</w:t>
+                  </w:r>
+                </w:p>
+              </w:tc>
+              <w:tc>
+                <w:tcPr/>
+                <w:p>
+                  <w:pPr>
+                    <w:pStyle w:val="Compact"/>
+                    <w:jc w:val="left"/>
+                    <w:jc w:val="center"/>
+                  </w:pPr>
+                  <w:r>
+                    <w:t xml:space="preserve">555 (13.2)</w:t>
+                  </w:r>
+                </w:p>
+              </w:tc>
+              <w:tc>
+                <w:tcPr/>
+                <w:p>
+                  <w:pPr>
+                    <w:pStyle w:val="Compact"/>
+                    <w:jc w:val="left"/>
+                    <w:jc w:val="center"/>
+                  </w:pPr>
+                  <w:r>
+                    <w:t xml:space="preserve">334 (8.3)</w:t>
+                  </w:r>
+                </w:p>
+              </w:tc>
+              <w:tc>
+                <w:tcPr/>
+                <w:p>
+                  <w:pPr>
+                    <w:pStyle w:val="Compact"/>
+                    <w:jc w:val="left"/>
+                    <w:jc w:val="center"/>
+                  </w:pPr>
+                  <w:r>
+                    <w:t xml:space="preserve">330 (8.4)</w:t>
+                  </w:r>
+                </w:p>
+              </w:tc>
+              <w:tc>
+                <w:tcPr/>
+                <w:p>
+                  <w:pPr>
+                    <w:pStyle w:val="Compact"/>
+                    <w:jc w:val="left"/>
+                    <w:jc w:val="center"/>
+                  </w:pPr>
+                  <w:r>
+                    <w:t xml:space="preserve">222 (5.9)</w:t>
+                  </w:r>
+                </w:p>
+              </w:tc>
+              <w:tc>
+                <w:tcPr/>
+                <w:p>
+                  <w:pPr>
+                    <w:pStyle w:val="Compact"/>
+                    <w:jc w:val="left"/>
+                    <w:jc w:val="center"/>
+                  </w:pPr>
+                  <w:r>
+                    <w:t xml:space="preserve">321 (9.0)</w:t>
+                  </w:r>
+                </w:p>
+              </w:tc>
+              <w:tc>
+                <w:tcPr/>
+                <w:p>
+                  <w:pPr>
+                    <w:pStyle w:val="Compact"/>
+                    <w:jc w:val="left"/>
+                    <w:jc w:val="center"/>
+                  </w:pPr>
+                  <w:r>
+                    <w:t xml:space="preserve">159 (4.6)</w:t>
+                  </w:r>
+                </w:p>
+              </w:tc>
+            </w:tr>
+            <w:tr>
+              <w:tc>
+                <w:tcPr/>
+                <w:p>
+                  <w:pPr>
+                    <w:pStyle w:val="Compact"/>
+                    <w:jc w:val="left"/>
+                    <w:jc w:val="center"/>
+                  </w:pPr>
+                  <w:r>
+                    <w:t xml:space="preserve">Ideal</w:t>
+                  </w:r>
+                </w:p>
+              </w:tc>
+              <w:tc>
+                <w:tcPr/>
+                <w:p>
+                  <w:pPr>
+                    <w:pStyle w:val="Compact"/>
+                    <w:jc w:val="left"/>
+                    <w:jc w:val="center"/>
+                  </w:pPr>
+                  <w:r>
+                    <w:t xml:space="preserve">1958 (46.5)</w:t>
+                  </w:r>
+                </w:p>
+              </w:tc>
+              <w:tc>
+                <w:tcPr/>
+                <w:p>
+                  <w:pPr>
+                    <w:pStyle w:val="Compact"/>
+                    <w:jc w:val="left"/>
+                    <w:jc w:val="center"/>
+                  </w:pPr>
+                  <w:r>
+                    <w:t xml:space="preserve">1924 (47.8)</w:t>
+                  </w:r>
+                </w:p>
+              </w:tc>
+              <w:tc>
+                <w:tcPr/>
+                <w:p>
+                  <w:pPr>
+                    <w:pStyle w:val="Compact"/>
+                    <w:jc w:val="left"/>
+                    <w:jc w:val="center"/>
+                  </w:pPr>
+                  <w:r>
+                    <w:t xml:space="preserve">2172 (55.5)</w:t>
+                  </w:r>
+                </w:p>
+              </w:tc>
+              <w:tc>
+                <w:tcPr/>
+                <w:p>
+                  <w:pPr>
+                    <w:pStyle w:val="Compact"/>
+                    <w:jc w:val="left"/>
+                    <w:jc w:val="center"/>
+                  </w:pPr>
+                  <w:r>
+                    <w:t xml:space="preserve">2070 (55.2)</w:t>
+                  </w:r>
+                </w:p>
+              </w:tc>
+              <w:tc>
+                <w:tcPr/>
+                <w:p>
+                  <w:pPr>
+                    <w:pStyle w:val="Compact"/>
+                    <w:jc w:val="left"/>
+                    <w:jc w:val="center"/>
+                  </w:pPr>
+                  <w:r>
+                    <w:t xml:space="preserve">2112 (58.9)</w:t>
+                  </w:r>
+                </w:p>
+              </w:tc>
+              <w:tc>
+                <w:tcPr/>
+                <w:p>
+                  <w:pPr>
+                    <w:pStyle w:val="Compact"/>
+                    <w:jc w:val="left"/>
+                    <w:jc w:val="center"/>
+                  </w:pPr>
+                  <w:r>
+                    <w:t xml:space="preserve">1820 (52.8)</w:t>
+                  </w:r>
+                </w:p>
+              </w:tc>
+            </w:tr>
+            <w:tr>
+              <w:tc>
+                <w:tcPr/>
+                <w:p>
+                  <w:pPr>
+                    <w:pStyle w:val="Compact"/>
+                    <w:jc w:val="left"/>
+                    <w:jc w:val="center"/>
+                  </w:pPr>
+                  <w:r>
+                    <w:t xml:space="preserve">Larger than ideal</w:t>
+                  </w:r>
+                </w:p>
+              </w:tc>
+              <w:tc>
+                <w:tcPr/>
+                <w:p>
+                  <w:pPr>
+                    <w:pStyle w:val="Compact"/>
+                    <w:jc w:val="left"/>
+                    <w:jc w:val="center"/>
+                  </w:pPr>
+                  <w:r>
+                    <w:t xml:space="preserve">1694 (40.3)</w:t>
+                  </w:r>
+                </w:p>
+              </w:tc>
+              <w:tc>
+                <w:tcPr/>
+                <w:p>
+                  <w:pPr>
+                    <w:pStyle w:val="Compact"/>
+                    <w:jc w:val="left"/>
+                    <w:jc w:val="center"/>
+                  </w:pPr>
+                  <w:r>
+                    <w:t xml:space="preserve">1768 (43.9)</w:t>
+                  </w:r>
+                </w:p>
+              </w:tc>
+              <w:tc>
+                <w:tcPr/>
+                <w:p>
+                  <w:pPr>
+                    <w:pStyle w:val="Compact"/>
+                    <w:jc w:val="left"/>
+                    <w:jc w:val="center"/>
+                  </w:pPr>
+                  <w:r>
+                    <w:t xml:space="preserve">1408 (36.0)</w:t>
+                  </w:r>
+                </w:p>
+              </w:tc>
+              <w:tc>
+                <w:tcPr/>
+                <w:p>
+                  <w:pPr>
+                    <w:pStyle w:val="Compact"/>
+                    <w:jc w:val="left"/>
+                    <w:jc w:val="center"/>
+                  </w:pPr>
+                  <w:r>
+                    <w:t xml:space="preserve">1460 (38.9)</w:t>
+                  </w:r>
+                </w:p>
+              </w:tc>
+              <w:tc>
+                <w:tcPr/>
+                <w:p>
+                  <w:pPr>
+                    <w:pStyle w:val="Compact"/>
+                    <w:jc w:val="left"/>
+                    <w:jc w:val="center"/>
+                  </w:pPr>
+                  <w:r>
+                    <w:t xml:space="preserve">1151 (32.1)</w:t>
+                  </w:r>
+                </w:p>
+              </w:tc>
+              <w:tc>
+                <w:tcPr/>
+                <w:p>
+                  <w:pPr>
+                    <w:pStyle w:val="Compact"/>
+                    <w:jc w:val="left"/>
+                    <w:jc w:val="center"/>
+                  </w:pPr>
+                  <w:r>
+                    <w:t xml:space="preserve">1466 (42.6)</w:t>
+                  </w:r>
+                </w:p>
+              </w:tc>
+            </w:tr>
+            <w:tr>
+              <w:tc>
+                <w:tcPr/>
+                <w:p>
+                  <w:pPr>
+                    <w:pStyle w:val="Compact"/>
+                    <w:jc w:val="left"/>
+                    <w:jc w:val="center"/>
+                  </w:pPr>
+                  <w:r>
+                    <w:t xml:space="preserve">Body Dissatisfaction (Any Direction) = Dissatisfied (%)</w:t>
+                  </w:r>
+                </w:p>
+              </w:tc>
+              <w:tc>
+                <w:tcPr/>
+                <w:p>
+                  <w:pPr>
+                    <w:pStyle w:val="Compact"/>
+                    <w:jc w:val="left"/>
+                    <w:jc w:val="center"/>
+                  </w:pPr>
+                  <w:r>
+                    <w:t xml:space="preserve">2249 (53.5)</w:t>
+                  </w:r>
+                </w:p>
+              </w:tc>
+              <w:tc>
+                <w:tcPr/>
+                <w:p>
+                  <w:pPr>
+                    <w:pStyle w:val="Compact"/>
+                    <w:jc w:val="left"/>
+                    <w:jc w:val="center"/>
+                  </w:pPr>
+                  <w:r>
+                    <w:t xml:space="preserve">2102 (52.2)</w:t>
+                  </w:r>
+                </w:p>
+              </w:tc>
+              <w:tc>
+                <w:tcPr/>
+                <w:p>
+                  <w:pPr>
+                    <w:pStyle w:val="Compact"/>
+                    <w:jc w:val="left"/>
+                    <w:jc w:val="center"/>
+                  </w:pPr>
+                  <w:r>
+                    <w:t xml:space="preserve">1738 (44.5)</w:t>
+                  </w:r>
+                </w:p>
+              </w:tc>
+              <w:tc>
+                <w:tcPr/>
+                <w:p>
+                  <w:pPr>
+                    <w:pStyle w:val="Compact"/>
+                    <w:jc w:val="left"/>
+                    <w:jc w:val="center"/>
+                  </w:pPr>
+                  <w:r>
+                    <w:t xml:space="preserve">1682 (44.8)</w:t>
+                  </w:r>
+                </w:p>
+              </w:tc>
+              <w:tc>
+                <w:tcPr/>
+                <w:p>
+                  <w:pPr>
+                    <w:pStyle w:val="Compact"/>
+                    <w:jc w:val="left"/>
+                    <w:jc w:val="center"/>
+                  </w:pPr>
+                  <w:r>
+                    <w:t xml:space="preserve">1472 (41.1)</w:t>
+                  </w:r>
+                </w:p>
+              </w:tc>
+              <w:tc>
+                <w:tcPr/>
+                <w:p>
+                  <w:pPr>
+                    <w:pStyle w:val="Compact"/>
+                    <w:jc w:val="left"/>
+                    <w:jc w:val="center"/>
+                  </w:pPr>
+                  <w:r>
+                    <w:t xml:space="preserve">1625 (47.2)</w:t>
+                  </w:r>
+                </w:p>
+              </w:tc>
+            </w:tr>
+            <w:tr>
+              <w:tc>
+                <w:tcPr/>
+                <w:p>
+                  <w:pPr>
+                    <w:pStyle w:val="Compact"/>
+                    <w:jc w:val="left"/>
+                    <w:jc w:val="center"/>
+                  </w:pPr>
+                  <w:r>
+                    <w:t xml:space="preserve">Parental Warmth (Parent 1) (mean (SD))</w:t>
+                  </w:r>
+                </w:p>
+              </w:tc>
+              <w:tc>
+                <w:tcPr/>
+                <w:p>
+                  <w:pPr>
+                    <w:pStyle w:val="Compact"/>
+                    <w:jc w:val="left"/>
+                    <w:jc w:val="center"/>
+                  </w:pPr>
+                  <w:r>
+                    <w:t xml:space="preserve">4.37 (0.55)</w:t>
+                  </w:r>
+                </w:p>
+              </w:tc>
+              <w:tc>
+                <w:tcPr/>
+                <w:p>
+                  <w:pPr>
+                    <w:pStyle w:val="Compact"/>
+                    <w:jc w:val="left"/>
+                    <w:jc w:val="center"/>
+                  </w:pPr>
+                  <w:r>
+                    <w:t xml:space="preserve">4.39 (0.54)</w:t>
+                  </w:r>
+                </w:p>
+              </w:tc>
+              <w:tc>
+                <w:tcPr/>
+                <w:p>
+                  <w:pPr>
+                    <w:pStyle w:val="Compact"/>
+                    <w:jc w:val="left"/>
+                    <w:jc w:val="center"/>
+                  </w:pPr>
+                  <w:r>
+                    <w:t xml:space="preserve">4.30 (0.58)</w:t>
+                  </w:r>
+                </w:p>
+              </w:tc>
+              <w:tc>
+                <w:tcPr/>
+                <w:p>
+                  <w:pPr>
+                    <w:pStyle w:val="Compact"/>
+                    <w:jc w:val="left"/>
+                    <w:jc w:val="center"/>
+                  </w:pPr>
+                  <w:r>
+                    <w:t xml:space="preserve">4.32 (0.58)</w:t>
+                  </w:r>
+                </w:p>
+              </w:tc>
+              <w:tc>
+                <w:tcPr/>
+                <w:p>
+                  <w:pPr>
+                    <w:pStyle w:val="Compact"/>
+                    <w:jc w:val="left"/>
+                    <w:jc w:val="center"/>
+                  </w:pPr>
+                  <w:r>
+                    <w:t xml:space="preserve">4.16 (0.63)</w:t>
+                  </w:r>
+                </w:p>
+              </w:tc>
+              <w:tc>
+                <w:tcPr/>
+                <w:p>
+                  <w:pPr>
+                    <w:pStyle w:val="Compact"/>
+                    <w:jc w:val="left"/>
+                    <w:jc w:val="center"/>
+                  </w:pPr>
+                  <w:r>
+                    <w:t xml:space="preserve">4.21 (0.62)</w:t>
+                  </w:r>
+                </w:p>
+              </w:tc>
+            </w:tr>
+            <w:tr>
+              <w:tc>
+                <w:tcPr/>
+                <w:p>
+                  <w:pPr>
+                    <w:pStyle w:val="Compact"/>
+                    <w:jc w:val="left"/>
+                    <w:jc w:val="center"/>
+                  </w:pPr>
+                  <w:r>
+                    <w:t xml:space="preserve">Parental Anger (Parent 1) (mean (SD))</w:t>
+                  </w:r>
+                </w:p>
+              </w:tc>
+              <w:tc>
+                <w:tcPr/>
+                <w:p>
+                  <w:pPr>
+                    <w:pStyle w:val="Compact"/>
+                    <w:jc w:val="left"/>
+                    <w:jc w:val="center"/>
+                  </w:pPr>
+                  <w:r>
+                    <w:t xml:space="preserve">2.22 (0.62)</w:t>
+                  </w:r>
+                </w:p>
+              </w:tc>
+              <w:tc>
+                <w:tcPr/>
+                <w:p>
+                  <w:pPr>
+                    <w:pStyle w:val="Compact"/>
+                    <w:jc w:val="left"/>
+                    <w:jc w:val="center"/>
+                  </w:pPr>
+                  <w:r>
+                    <w:t xml:space="preserve">2.09 (0.59)</w:t>
+                  </w:r>
+                </w:p>
+              </w:tc>
+              <w:tc>
+                <w:tcPr/>
+                <w:p>
+                  <w:pPr>
+                    <w:pStyle w:val="Compact"/>
+                    <w:jc w:val="left"/>
+                    <w:jc w:val="center"/>
+                  </w:pPr>
+                  <w:r>
+                    <w:t xml:space="preserve">2.19 (0.66)</w:t>
+                  </w:r>
+                </w:p>
+              </w:tc>
+              <w:tc>
+                <w:tcPr/>
+                <w:p>
+                  <w:pPr>
+                    <w:pStyle w:val="Compact"/>
+                    <w:jc w:val="left"/>
+                    <w:jc w:val="center"/>
+                  </w:pPr>
+                  <w:r>
+                    <w:t xml:space="preserve">2.09 (0.62)</w:t>
+                  </w:r>
+                </w:p>
+              </w:tc>
+              <w:tc>
+                <w:tcPr/>
+                <w:p>
+                  <w:pPr>
+                    <w:pStyle w:val="Compact"/>
+                    <w:jc w:val="left"/>
+                    <w:jc w:val="center"/>
+                  </w:pPr>
+                  <w:r>
+                    <w:t xml:space="preserve">2.19 (0.68)</w:t>
+                  </w:r>
+                </w:p>
+              </w:tc>
+              <w:tc>
+                <w:tcPr/>
+                <w:p>
+                  <w:pPr>
+                    <w:pStyle w:val="Compact"/>
+                    <w:jc w:val="left"/>
+                    <w:jc w:val="center"/>
+                  </w:pPr>
+                  <w:r>
+                    <w:t xml:space="preserve">2.07 (0.65)</w:t>
+                  </w:r>
+                </w:p>
+              </w:tc>
+            </w:tr>
+            <w:tr>
+              <w:tc>
+                <w:tcPr/>
+                <w:p>
+                  <w:pPr>
+                    <w:pStyle w:val="Compact"/>
+                    <w:jc w:val="left"/>
+                    <w:jc w:val="center"/>
+                  </w:pPr>
+                  <w:r>
+                    <w:t xml:space="preserve">Parental Warmth (Parent 2) (mean (SD))</w:t>
+                  </w:r>
+                </w:p>
+              </w:tc>
+              <w:tc>
+                <w:tcPr/>
+                <w:p>
+                  <w:pPr>
+                    <w:pStyle w:val="Compact"/>
+                    <w:jc w:val="left"/>
+                    <w:jc w:val="center"/>
+                  </w:pPr>
+                  <w:r>
+                    <w:t xml:space="preserve">4.01 (0.64)</w:t>
+                  </w:r>
+                </w:p>
+              </w:tc>
+              <w:tc>
+                <w:tcPr/>
+                <w:p>
+                  <w:pPr>
+                    <w:pStyle w:val="Compact"/>
+                    <w:jc w:val="left"/>
+                    <w:jc w:val="center"/>
+                  </w:pPr>
+                  <w:r>
+                    <w:t xml:space="preserve">4.07 (0.62)</w:t>
+                  </w:r>
+                </w:p>
+              </w:tc>
+              <w:tc>
+                <w:tcPr/>
+                <w:p>
+                  <w:pPr>
+                    <w:pStyle w:val="Compact"/>
+                    <w:jc w:val="left"/>
+                    <w:jc w:val="center"/>
+                  </w:pPr>
+                  <w:r>
+                    <w:t xml:space="preserve">3.92 (0.65)</w:t>
+                  </w:r>
+                </w:p>
+              </w:tc>
+              <w:tc>
+                <w:tcPr/>
+                <w:p>
+                  <w:pPr>
+                    <w:pStyle w:val="Compact"/>
+                    <w:jc w:val="left"/>
+                    <w:jc w:val="center"/>
+                  </w:pPr>
+                  <w:r>
+                    <w:t xml:space="preserve">3.99 (0.65)</w:t>
+                  </w:r>
+                </w:p>
+              </w:tc>
+              <w:tc>
+                <w:tcPr/>
+                <w:p>
+                  <w:pPr>
+                    <w:pStyle w:val="Compact"/>
+                    <w:jc w:val="left"/>
+                    <w:jc w:val="center"/>
+                  </w:pPr>
+                  <w:r>
+                    <w:t xml:space="preserve">3.78 (0.71)</w:t>
+                  </w:r>
+                </w:p>
+              </w:tc>
+              <w:tc>
+                <w:tcPr/>
+                <w:p>
+                  <w:pPr>
+                    <w:pStyle w:val="Compact"/>
+                    <w:jc w:val="left"/>
+                    <w:jc w:val="center"/>
+                  </w:pPr>
+                  <w:r>
+                    <w:t xml:space="preserve">3.83 (0.69)</w:t>
+                  </w:r>
+                </w:p>
+              </w:tc>
+            </w:tr>
+            <w:tr>
+              <w:tc>
+                <w:tcPr/>
+                <w:p>
+                  <w:pPr>
+                    <w:pStyle w:val="Compact"/>
+                    <w:jc w:val="left"/>
+                    <w:jc w:val="center"/>
+                  </w:pPr>
+                  <w:r>
+                    <w:t xml:space="preserve">Parental Anger (Parent 2) (mean (SD))</w:t>
+                  </w:r>
+                </w:p>
+              </w:tc>
+              <w:tc>
+                <w:tcPr/>
+                <w:p>
+                  <w:pPr>
+                    <w:pStyle w:val="Compact"/>
+                    <w:jc w:val="left"/>
+                    <w:jc w:val="center"/>
+                  </w:pPr>
+                  <w:r>
+                    <w:t xml:space="preserve">2.23 (0.63)</w:t>
+                  </w:r>
+                </w:p>
+              </w:tc>
+              <w:tc>
+                <w:tcPr/>
+                <w:p>
+                  <w:pPr>
+                    <w:pStyle w:val="Compact"/>
+                    <w:jc w:val="left"/>
+                    <w:jc w:val="center"/>
+                  </w:pPr>
+                  <w:r>
+                    <w:t xml:space="preserve">2.10 (0.59)</w:t>
+                  </w:r>
+                </w:p>
+              </w:tc>
+              <w:tc>
+                <w:tcPr/>
+                <w:p>
+                  <w:pPr>
+                    <w:pStyle w:val="Compact"/>
+                    <w:jc w:val="left"/>
+                    <w:jc w:val="center"/>
+                  </w:pPr>
+                  <w:r>
+                    <w:t xml:space="preserve">2.19 (0.62)</w:t>
+                  </w:r>
+                </w:p>
+              </w:tc>
+              <w:tc>
+                <w:tcPr/>
+                <w:p>
+                  <w:pPr>
+                    <w:pStyle w:val="Compact"/>
+                    <w:jc w:val="left"/>
+                    <w:jc w:val="center"/>
+                  </w:pPr>
+                  <w:r>
+                    <w:t xml:space="preserve">2.07 (0.61)</w:t>
+                  </w:r>
+                </w:p>
+              </w:tc>
+              <w:tc>
+                <w:tcPr/>
+                <w:p>
+                  <w:pPr>
+                    <w:pStyle w:val="Compact"/>
+                    <w:jc w:val="left"/>
+                    <w:jc w:val="center"/>
+                  </w:pPr>
+                  <w:r>
+                    <w:t xml:space="preserve">2.17 (0.66)</w:t>
+                  </w:r>
+                </w:p>
+              </w:tc>
+              <w:tc>
+                <w:tcPr/>
+                <w:p>
+                  <w:pPr>
+                    <w:pStyle w:val="Compact"/>
+                    <w:jc w:val="left"/>
+                    <w:jc w:val="center"/>
+                  </w:pPr>
+                  <w:r>
+                    <w:t xml:space="preserve">2.05 (0.64)</w:t>
+                  </w:r>
+                </w:p>
+              </w:tc>
+            </w:tr>
+            <w:tr>
+              <w:tc>
+                <w:tcPr/>
+                <w:p>
+                  <w:pPr>
+                    <w:pStyle w:val="Compact"/>
+                    <w:jc w:val="left"/>
+                    <w:jc w:val="center"/>
+                  </w:pPr>
+                  <w:r>
+                    <w:t xml:space="preserve">Parental Warmth (Mother) (mean (SD))</w:t>
+                  </w:r>
+                </w:p>
+              </w:tc>
+              <w:tc>
+                <w:tcPr/>
+                <w:p>
+                  <w:pPr>
+                    <w:pStyle w:val="Compact"/>
+                    <w:jc w:val="left"/>
+                    <w:jc w:val="center"/>
+                  </w:pPr>
+                  <w:r>
+                    <w:t xml:space="preserve">4.38 (0.54)</w:t>
+                  </w:r>
+                </w:p>
+              </w:tc>
+              <w:tc>
+                <w:tcPr/>
+                <w:p>
+                  <w:pPr>
+                    <w:pStyle w:val="Compact"/>
+                    <w:jc w:val="left"/>
+                    <w:jc w:val="center"/>
+                  </w:pPr>
+                  <w:r>
+                    <w:t xml:space="preserve">4.39 (0.54)</w:t>
+                  </w:r>
+                </w:p>
+              </w:tc>
+              <w:tc>
+                <w:tcPr/>
+                <w:p>
+                  <w:pPr>
+                    <w:pStyle w:val="Compact"/>
+                    <w:jc w:val="left"/>
+                    <w:jc w:val="center"/>
+                  </w:pPr>
+                  <w:r>
+                    <w:t xml:space="preserve">4.31 (0.58)</w:t>
+                  </w:r>
+                </w:p>
+              </w:tc>
+              <w:tc>
+                <w:tcPr/>
+                <w:p>
+                  <w:pPr>
+                    <w:pStyle w:val="Compact"/>
+                    <w:jc w:val="left"/>
+                    <w:jc w:val="center"/>
+                  </w:pPr>
+                  <w:r>
+                    <w:t xml:space="preserve">4.32 (0.58)</w:t>
+                  </w:r>
+                </w:p>
+              </w:tc>
+              <w:tc>
+                <w:tcPr/>
+                <w:p>
+                  <w:pPr>
+                    <w:pStyle w:val="Compact"/>
+                    <w:jc w:val="left"/>
+                    <w:jc w:val="center"/>
+                  </w:pPr>
+                  <w:r>
+                    <w:t xml:space="preserve">4.17 (0.62)</w:t>
+                  </w:r>
+                </w:p>
+              </w:tc>
+              <w:tc>
+                <w:tcPr/>
+                <w:p>
+                  <w:pPr>
+                    <w:pStyle w:val="Compact"/>
+                    <w:jc w:val="left"/>
+                    <w:jc w:val="center"/>
+                  </w:pPr>
+                  <w:r>
+                    <w:t xml:space="preserve">4.21 (0.63)</w:t>
+                  </w:r>
+                </w:p>
+              </w:tc>
+            </w:tr>
+            <w:tr>
+              <w:tc>
+                <w:tcPr/>
+                <w:p>
+                  <w:pPr>
+                    <w:pStyle w:val="Compact"/>
+                    <w:jc w:val="left"/>
+                    <w:jc w:val="center"/>
+                  </w:pPr>
+                  <w:r>
+                    <w:t xml:space="preserve">Parental Anger (Mother) (mean (SD))</w:t>
+                  </w:r>
+                </w:p>
+              </w:tc>
+              <w:tc>
+                <w:tcPr/>
+                <w:p>
+                  <w:pPr>
+                    <w:pStyle w:val="Compact"/>
+                    <w:jc w:val="left"/>
+                    <w:jc w:val="center"/>
+                  </w:pPr>
+                  <w:r>
+                    <w:t xml:space="preserve">2.22 (0.62)</w:t>
+                  </w:r>
+                </w:p>
+              </w:tc>
+              <w:tc>
+                <w:tcPr/>
+                <w:p>
+                  <w:pPr>
+                    <w:pStyle w:val="Compact"/>
+                    <w:jc w:val="left"/>
+                    <w:jc w:val="center"/>
+                  </w:pPr>
+                  <w:r>
+                    <w:t xml:space="preserve">2.09 (0.59)</w:t>
+                  </w:r>
+                </w:p>
+              </w:tc>
+              <w:tc>
+                <w:tcPr/>
+                <w:p>
+                  <w:pPr>
+                    <w:pStyle w:val="Compact"/>
+                    <w:jc w:val="left"/>
+                    <w:jc w:val="center"/>
+                  </w:pPr>
+                  <w:r>
+                    <w:t xml:space="preserve">2.20 (0.66)</w:t>
+                  </w:r>
+                </w:p>
+              </w:tc>
+              <w:tc>
+                <w:tcPr/>
+                <w:p>
+                  <w:pPr>
+                    <w:pStyle w:val="Compact"/>
+                    <w:jc w:val="left"/>
+                    <w:jc w:val="center"/>
+                  </w:pPr>
+                  <w:r>
+                    <w:t xml:space="preserve">2.09 (0.62)</w:t>
+                  </w:r>
+                </w:p>
+              </w:tc>
+              <w:tc>
+                <w:tcPr/>
+                <w:p>
+                  <w:pPr>
+                    <w:pStyle w:val="Compact"/>
+                    <w:jc w:val="left"/>
+                    <w:jc w:val="center"/>
+                  </w:pPr>
+                  <w:r>
+                    <w:t xml:space="preserve">2.20 (0.68)</w:t>
+                  </w:r>
+                </w:p>
+              </w:tc>
+              <w:tc>
+                <w:tcPr/>
+                <w:p>
+                  <w:pPr>
+                    <w:pStyle w:val="Compact"/>
+                    <w:jc w:val="left"/>
+                    <w:jc w:val="center"/>
+                  </w:pPr>
+                  <w:r>
+                    <w:t xml:space="preserve">2.07 (0.65)</w:t>
+                  </w:r>
+                </w:p>
+              </w:tc>
+            </w:tr>
+            <w:tr>
+              <w:tc>
+                <w:tcPr/>
+                <w:p>
+                  <w:pPr>
+                    <w:pStyle w:val="Compact"/>
+                    <w:jc w:val="left"/>
+                    <w:jc w:val="center"/>
+                  </w:pPr>
+                  <w:r>
+                    <w:t xml:space="preserve">Parental Warmth (Father) (mean (SD))</w:t>
+                  </w:r>
+                </w:p>
+              </w:tc>
+              <w:tc>
+                <w:tcPr/>
+                <w:p>
+                  <w:pPr>
+                    <w:pStyle w:val="Compact"/>
+                    <w:jc w:val="left"/>
+                    <w:jc w:val="center"/>
+                  </w:pPr>
+                  <w:r>
+                    <w:t xml:space="preserve">4.00 (0.64)</w:t>
+                  </w:r>
+                </w:p>
+              </w:tc>
+              <w:tc>
+                <w:tcPr/>
+                <w:p>
+                  <w:pPr>
+                    <w:pStyle w:val="Compact"/>
+                    <w:jc w:val="left"/>
+                    <w:jc w:val="center"/>
+                  </w:pPr>
+                  <w:r>
+                    <w:t xml:space="preserve">4.08 (0.62)</w:t>
+                  </w:r>
+                </w:p>
+              </w:tc>
+              <w:tc>
+                <w:tcPr/>
+                <w:p>
+                  <w:pPr>
+                    <w:pStyle w:val="Compact"/>
+                    <w:jc w:val="left"/>
+                    <w:jc w:val="center"/>
+                  </w:pPr>
+                  <w:r>
+                    <w:t xml:space="preserve">3.92 (0.65)</w:t>
+                  </w:r>
+                </w:p>
+              </w:tc>
+              <w:tc>
+                <w:tcPr/>
+                <w:p>
+                  <w:pPr>
+                    <w:pStyle w:val="Compact"/>
+                    <w:jc w:val="left"/>
+                    <w:jc w:val="center"/>
+                  </w:pPr>
+                  <w:r>
+                    <w:t xml:space="preserve">4.00 (0.65)</w:t>
+                  </w:r>
+                </w:p>
+              </w:tc>
+              <w:tc>
+                <w:tcPr/>
+                <w:p>
+                  <w:pPr>
+                    <w:pStyle w:val="Compact"/>
+                    <w:jc w:val="left"/>
+                    <w:jc w:val="center"/>
+                  </w:pPr>
+                  <w:r>
+                    <w:t xml:space="preserve">3.78 (0.71)</w:t>
+                  </w:r>
+                </w:p>
+              </w:tc>
+              <w:tc>
+                <w:tcPr/>
+                <w:p>
+                  <w:pPr>
+                    <w:pStyle w:val="Compact"/>
+                    <w:jc w:val="left"/>
+                    <w:jc w:val="center"/>
+                  </w:pPr>
+                  <w:r>
+                    <w:t xml:space="preserve">3.83 (0.69)</w:t>
+                  </w:r>
+                </w:p>
+              </w:tc>
+            </w:tr>
+            <w:tr>
+              <w:tc>
+                <w:tcPr/>
+                <w:p>
+                  <w:pPr>
+                    <w:pStyle w:val="Compact"/>
+                    <w:jc w:val="left"/>
+                    <w:jc w:val="center"/>
+                  </w:pPr>
+                  <w:r>
+                    <w:t xml:space="preserve">Parental Anger (Father) (mean (SD))</w:t>
+                  </w:r>
+                </w:p>
+              </w:tc>
+              <w:tc>
+                <w:tcPr/>
+                <w:p>
+                  <w:pPr>
+                    <w:pStyle w:val="Compact"/>
+                    <w:jc w:val="left"/>
+                    <w:jc w:val="center"/>
+                  </w:pPr>
+                  <w:r>
+                    <w:t xml:space="preserve">2.22 (0.63)</w:t>
+                  </w:r>
+                </w:p>
+              </w:tc>
+              <w:tc>
+                <w:tcPr/>
+                <w:p>
+                  <w:pPr>
+                    <w:pStyle w:val="Compact"/>
+                    <w:jc w:val="left"/>
+                    <w:jc w:val="center"/>
+                  </w:pPr>
+                  <w:r>
+                    <w:t xml:space="preserve">2.10 (0.59)</w:t>
+                  </w:r>
+                </w:p>
+              </w:tc>
+              <w:tc>
+                <w:tcPr/>
+                <w:p>
+                  <w:pPr>
+                    <w:pStyle w:val="Compact"/>
+                    <w:jc w:val="left"/>
+                    <w:jc w:val="center"/>
+                  </w:pPr>
+                  <w:r>
+                    <w:t xml:space="preserve">2.19 (0.63)</w:t>
+                  </w:r>
+                </w:p>
+              </w:tc>
+              <w:tc>
+                <w:tcPr/>
+                <w:p>
+                  <w:pPr>
+                    <w:pStyle w:val="Compact"/>
+                    <w:jc w:val="left"/>
+                    <w:jc w:val="center"/>
+                  </w:pPr>
+                  <w:r>
+                    <w:t xml:space="preserve">2.07 (0.61)</w:t>
+                  </w:r>
+                </w:p>
+              </w:tc>
+              <w:tc>
+                <w:tcPr/>
+                <w:p>
+                  <w:pPr>
+                    <w:pStyle w:val="Compact"/>
+                    <w:jc w:val="left"/>
+                    <w:jc w:val="center"/>
+                  </w:pPr>
+                  <w:r>
+                    <w:t xml:space="preserve">2.17 (0.65)</w:t>
+                  </w:r>
+                </w:p>
+              </w:tc>
+              <w:tc>
+                <w:tcPr/>
+                <w:p>
+                  <w:pPr>
+                    <w:pStyle w:val="Compact"/>
+                    <w:jc w:val="left"/>
+                    <w:jc w:val="center"/>
+                  </w:pPr>
+                  <w:r>
+                    <w:t xml:space="preserve">2.06 (0.63)</w:t>
+                  </w:r>
+                </w:p>
+              </w:tc>
+            </w:tr>
+          </w:tbl>
+          <w:bookmarkEnd w:id="21"/>
+          <w:p/>
+        </w:tc>
+      </w:tr>
+    </w:tbl>
+    <w:p>
+      <w:pPr>
+        <w:pStyle w:val="BodyText"/>
+      </w:pPr>
+      <w:r>
+        <w:t xml:space="preserve"> </w:t>
+      </w:r>
+    </w:p>
+    <w:tbl>
+      <w:tblPr>
+        <w:tblStyle w:val="Table"/>
+        <w:tblLook w:firstRow="0" w:lastRow="0" w:firstColumn="0" w:lastColumn="0" w:noHBand="0" w:noVBand="0" w:val="0000"/>
+        <w:tblBorders>
+          <w:top w:val="single" w:sz="4" w:space="0" w:color="0758E5"/>
+          <w:left w:val="single" w:sz="24" w:space="0" w:color="0758E5"/>
+          <w:bottom w:val="single" w:sz="4" w:space="0" w:color="0758E5"/>
+          <w:right w:val="single" w:sz="4" w:space="0" w:color="0758E5"/>
+        </w:tblBorders>
+        <w:tblCellMar>
+          <w:left w:w="144" w:type="dxa"/>
+          <w:right w:w="144" w:type="dxa"/>
+        </w:tblCellMar>
+        <w:tblLook w:firstRow="0" w:lastRow="0" w:firstColumn="0" w:lastColumn="0" w:noHBand="0" w:noVBand="0" w:val="0000"/>
+      </w:tblPr>
+      <w:tr>
+        <w:trPr>
+          <w:cantSplit/>
+        </w:trPr>
+        <w:tc>
+          <w:tcPr>
+            <w:shd w:color="auto" w:fill="dae6fb" w:val="clear"/>
+            <w:tcMar>
+              <w:top w:w="92" w:type="dxa"/>
+              <w:bottom w:w="92" w:type="dxa"/>
+            </w:tcMar>
+          </w:tcPr>
+          <w:p>
+            <w:pPr>
+              <w:pStyle w:val="BodyText"/>
+            </w:pPr>
+            <w:pPr>
+              <w:spacing w:before="0" w:after="0"/>
+              <w:textAlignment w:val="center"/>
+            </w:pPr>
+            <w:r>
+              <w:drawing>
+                <wp:inline>
+                  <wp:extent cx="152400" cy="152400"/>
+                  <wp:effectExtent b="0" l="0" r="0" t="0"/>
+                  <wp:docPr descr="" title="" id="22" name="Picture"/>
+                  <a:graphic>
+                    <a:graphicData uri="http://schemas.openxmlformats.org/drawingml/2006/picture">
+                      <pic:pic>
+                        <pic:nvPicPr>
+                          <pic:cNvPr descr="/opt/quarto/share/formats/docx/note.png" id="23" name="Picture"/>
+                          <pic:cNvPicPr>
+                            <a:picLocks noChangeArrowheads="1" noChangeAspect="1"/>
+                          </pic:cNvPicPr>
+                        </pic:nvPicPr>
+                        <pic:blipFill>
+                          <a:blip r:embed="rId9"/>
+                          <a:stretch>
+                            <a:fillRect/>
+                          </a:stretch>
+                        </pic:blipFill>
+                        <pic:spPr bwMode="auto">
+                          <a:xfrm>
+                            <a:off x="0" y="0"/>
+                            <a:ext cx="152400" cy="152400"/>
+                          </a:xfrm>
+                          <a:prstGeom prst="rect">
+                            <a:avLst/>
+                          </a:prstGeom>
+                          <a:noFill/>
+                          <a:ln w="9525">
+                            <a:noFill/>
+                            <a:headEnd/>
+                            <a:tailEnd/>
+                          </a:ln>
+                        </pic:spPr>
+                      </pic:pic>
+                    </a:graphicData>
+                  </a:graphic>
+                </wp:inline>
+              </w:drawing>
+            </w:r>
+            <w:r>
+              <w:t xml:space="preserve"> </w:t>
+            </w:r>
+            <w:r>
+              <w:t xml:space="preserve"> </w:t>
+            </w:r>
+            <w:r>
+              <w:t xml:space="preserve">Interpretation</w:t>
+            </w:r>
+          </w:p>
+        </w:tc>
+      </w:tr>
+      <w:tr>
+        <w:trPr>
+          <w:cantSplit/>
+        </w:trPr>
+        <w:tc>
+          <w:tcPr>
+            <w:tcMar>
+              <w:top w:w="108" w:type="dxa"/>
+              <w:bottom w:w="108" w:type="dxa"/>
+            </w:tcMar>
+          </w:tcPr>
+          <w:p>
+            <w:pPr>
+              <w:pStyle w:val="Compact"/>
+              <w:numPr>
+                <w:ilvl w:val="0"/>
+                <w:numId w:val="1004"/>
+              </w:numPr>
+            </w:pPr>
+            <w:r>
+              <w:t xml:space="preserve">The decline in dissatisfaction with age noted above is mostly a boys’ pattern: any-direction dissatisfaction falls steadily for boys (53.5% → 44.5% → 41.1%), while for girls it drops from 8 to 10 (52.2% → 44.8%) and then rises again at 12 (47.2%).</w:t>
+            </w:r>
+          </w:p>
+          <w:p>
+            <w:pPr>
+              <w:pStyle w:val="Compact"/>
+              <w:numPr>
+                <w:ilvl w:val="0"/>
+                <w:numId w:val="1004"/>
+              </w:numPr>
+            </w:pPr>
+            <w:r>
+              <w:t xml:space="preserve">The rebound for girls at 12 is driven by</w:t>
+            </w:r>
+            <w:r>
+              <w:t xml:space="preserve"> </w:t>
+            </w:r>
+            <w:r>
+              <w:t xml:space="preserve">“larger than ideal”</w:t>
+            </w:r>
+            <w:r>
+              <w:t xml:space="preserve"> </w:t>
+            </w:r>
+            <w:r>
+              <w:t xml:space="preserve">(38.9% → 42.6%), whereas for boys</w:t>
+            </w:r>
+            <w:r>
+              <w:t xml:space="preserve"> </w:t>
+            </w:r>
+            <w:r>
+              <w:t xml:space="preserve">“larger than ideal”</w:t>
+            </w:r>
+            <w:r>
+              <w:t xml:space="preserve"> </w:t>
+            </w:r>
+            <w:r>
+              <w:t xml:space="preserve">keeps falling (40.3% → 36.0% → 32.1%) — plausibly early-puberty timing for girls.</w:t>
+            </w:r>
+          </w:p>
+          <w:p>
+            <w:pPr>
+              <w:pStyle w:val="Compact"/>
+              <w:numPr>
+                <w:ilvl w:val="0"/>
+                <w:numId w:val="1004"/>
+              </w:numPr>
+            </w:pPr>
+            <w:r>
+              <w:t xml:space="preserve">The direction differs consistently: girls are more likely to be</w:t>
+            </w:r>
+            <w:r>
+              <w:t xml:space="preserve"> </w:t>
+            </w:r>
+            <w:r>
+              <w:t xml:space="preserve">“larger than ideal”</w:t>
+            </w:r>
+            <w:r>
+              <w:t xml:space="preserve"> </w:t>
+            </w:r>
+            <w:r>
+              <w:t xml:space="preserve">at every age despite similar BMI z-scores, so the difference is not explained by actual body size.</w:t>
+            </w:r>
+          </w:p>
+          <w:p>
+            <w:pPr>
+              <w:pStyle w:val="Compact"/>
+              <w:numPr>
+                <w:ilvl w:val="0"/>
+                <w:numId w:val="1004"/>
+              </w:numPr>
+            </w:pPr>
+            <w:r>
+              <w:t xml:space="preserve">“Thinner than ideal”</w:t>
+            </w:r>
+            <w:r>
+              <w:t xml:space="preserve"> </w:t>
+            </w:r>
+            <w:r>
+              <w:t xml:space="preserve">declines with age in both sexes but is roughly twice as common in boys at every age.</w:t>
+            </w:r>
+          </w:p>
+          <w:p>
+            <w:pPr>
+              <w:pStyle w:val="Compact"/>
+              <w:numPr>
+                <w:ilvl w:val="0"/>
+                <w:numId w:val="1004"/>
+              </w:numPr>
+            </w:pPr>
+            <w:r>
+              <w:t xml:space="preserve">Together this suggests both the level (at older ages) and especially the direction of dissatisfaction are sex-related, so models should at minimum include a sex interaction (or be sex-stratified).</w:t>
+            </w:r>
+          </w:p>
+          <w:p/>
+        </w:tc>
+      </w:tr>
+    </w:tbl>
+    <w:bookmarkEnd w:id="24"/>
+    <w:bookmarkEnd w:id="25"/>
+    <w:bookmarkStart w:id="31" w:name="preliminary-plots"/>
     <w:p>
       <w:pPr>
         <w:pStyle w:val="Heading1"/>
@@ -5853,18 +9548,18 @@
           <wp:inline>
             <wp:extent cx="5334000" cy="3048000"/>
             <wp:effectExtent b="0" l="0" r="0" t="0"/>
-            <wp:docPr descr="Body dissatisfaction category proportions by age and cohort." title="" id="23" name="Picture"/>
+            <wp:docPr descr="Body dissatisfaction category proportions by age and cohort." title="" id="27" name="Picture"/>
             <a:graphic>
               <a:graphicData uri="http://schemas.openxmlformats.org/drawingml/2006/picture">
                 <pic:pic>
                   <pic:nvPicPr>
-                    <pic:cNvPr descr="report_files/figure-docx/plot-body-dissat-1.png" id="24" name="Picture"/>
+                    <pic:cNvPr descr="report_files/figure-docx/plot-body-dissat-1.png" id="28" name="Picture"/>
                     <pic:cNvPicPr>
                       <a:picLocks noChangeArrowheads="1" noChangeAspect="1"/>
                     </pic:cNvPicPr>
                   </pic:nvPicPr>
                   <pic:blipFill>
-                    <a:blip r:embed="rId22"/>
+                    <a:blip r:embed="rId26"/>
                     <a:stretch>
                       <a:fillRect/>
                     </a:stretch>
@@ -5940,12 +9635,12 @@
                 <wp:inline>
                   <wp:extent cx="152400" cy="152400"/>
                   <wp:effectExtent b="0" l="0" r="0" t="0"/>
-                  <wp:docPr descr="" title="" id="25" name="Picture"/>
+                  <wp:docPr descr="" title="" id="29" name="Picture"/>
                   <a:graphic>
                     <a:graphicData uri="http://schemas.openxmlformats.org/drawingml/2006/picture">
                       <pic:pic>
                         <pic:nvPicPr>
-                          <pic:cNvPr descr="/opt/quarto/share/formats/docx/note.png" id="26" name="Picture"/>
+                          <pic:cNvPr descr="/opt/quarto/share/formats/docx/note.png" id="30" name="Picture"/>
                           <pic:cNvPicPr>
                             <a:picLocks noChangeArrowheads="1" noChangeAspect="1"/>
                           </pic:cNvPicPr>
@@ -6005,7 +9700,7 @@
               <w:pStyle w:val="Compact"/>
               <w:numPr>
                 <w:ilvl w:val="0"/>
-                <w:numId w:val="1004"/>
+                <w:numId w:val="1005"/>
               </w:numPr>
             </w:pPr>
             <w:r>
@@ -6023,7 +9718,7 @@
               <w:pStyle w:val="Compact"/>
               <w:numPr>
                 <w:ilvl w:val="0"/>
-                <w:numId w:val="1004"/>
+                <w:numId w:val="1005"/>
               </w:numPr>
             </w:pPr>
             <w:r>
@@ -6034,8 +9729,8 @@
         </w:tc>
       </w:tr>
     </w:tbl>
-    <w:bookmarkEnd w:id="27"/>
-    <w:bookmarkStart w:id="28" w:name="results"/>
+    <w:bookmarkEnd w:id="31"/>
+    <w:bookmarkStart w:id="32" w:name="results"/>
     <w:p>
       <w:pPr>
         <w:pStyle w:val="Heading1"/>
@@ -6056,7 +9751,7 @@
         <w:t xml:space="preserve">Placeholder</w:t>
       </w:r>
     </w:p>
-    <w:bookmarkEnd w:id="28"/>
+    <w:bookmarkEnd w:id="32"/>
     <w:sectPr>
       <w:footnotePr>
         <w:numRestart w:val="eachSect"/>
@@ -6283,6 +9978,9 @@
     <w:abstractNumId w:val="991"/>
   </w:num>
   <w:num w:numId="1004">
+    <w:abstractNumId w:val="991"/>
+  </w:num>
+  <w:num w:numId="1005">
     <w:abstractNumId w:val="991"/>
   </w:num>
 </w:numbering>

</xml_diff>

<commit_message>
Complete the lcga modelling
</commit_message>
<xml_diff>
--- a/doc/report.docx
+++ b/doc/report.docx
@@ -10733,13 +10733,4311 @@
       </w:tr>
     </w:tbl>
     <w:bookmarkEnd w:id="36"/>
-    <w:bookmarkStart w:id="37" w:name="results"/>
+    <w:bookmarkStart w:id="53" w:name="trajectory-class-enumeration"/>
     <w:p>
       <w:pPr>
         <w:pStyle w:val="Heading1"/>
       </w:pPr>
       <w:r>
-        <w:t xml:space="preserve">5. Results</w:t>
+        <w:t xml:space="preserve">5. Trajectory class enumeration</w:t>
+      </w:r>
+    </w:p>
+    <w:p>
+      <w:pPr>
+        <w:pStyle w:val="FirstParagraph"/>
+      </w:pPr>
+      <w:r>
+        <w:t xml:space="preserve">Latent class growth analyses (linear class trajectories, no within-class</w:t>
+      </w:r>
+      <w:r>
+        <w:t xml:space="preserve"> </w:t>
+      </w:r>
+      <w:r>
+        <w:t xml:space="preserve">random effects, equal residual variance across classes) were fit for K = 1–5</w:t>
+      </w:r>
+      <w:r>
+        <w:t xml:space="preserve"> </w:t>
+      </w:r>
+      <w:r>
+        <w:t xml:space="preserve">classes with</w:t>
+      </w:r>
+      <w:r>
+        <w:t xml:space="preserve"> </w:t>
+      </w:r>
+      <w:r>
+        <w:rPr>
+          <w:rStyle w:val="VerbatimChar"/>
+        </w:rPr>
+        <w:t xml:space="preserve">lcmm::hlme()</w:t>
+      </w:r>
+      <w:r>
+        <w:t xml:space="preserve">, each multi-class model from 50 random starts</w:t>
+      </w:r>
+      <w:r>
+        <w:t xml:space="preserve"> </w:t>
+      </w:r>
+      <w:r>
+        <w:t xml:space="preserve">(gridsearch initialised from the one-class model).</w:t>
+      </w:r>
+    </w:p>
+    <w:tbl>
+      <w:tblPr>
+        <w:tblStyle w:val="Table"/>
+        <w:tblW w:type="pct" w:w="5000"/>
+        <w:tblLayout w:type="fixed"/>
+        <w:tblLook w:firstRow="0" w:lastRow="0" w:firstColumn="0" w:lastColumn="0" w:noHBand="0" w:noVBand="0" w:val="0000"/>
+      </w:tblPr>
+      <w:tblGrid>
+        <w:gridCol w:w="7920"/>
+      </w:tblGrid>
+      <w:tr>
+        <w:tc>
+          <w:tcPr/>
+          <w:bookmarkStart w:id="37" w:name="tbl-lcga-fit"/>
+          <w:p>
+            <w:pPr>
+              <w:jc w:val="center"/>
+            </w:pPr>
+            <w:pPr>
+              <w:jc w:val="left"/>
+              <w:spacing w:before="200"/>
+              <w:pStyle w:val="ImageCaption"/>
+            </w:pPr>
+            <w:r>
+              <w:t xml:space="preserve">Table 6: Fit statistics for K = 1-5 latent class growth models of body dissatisfaction.</w:t>
+            </w:r>
+          </w:p>
+          <w:tbl>
+            <w:tblPr>
+              <w:tblStyle w:val="Table"/>
+              <w:tblW w:type="pct" w:w="5000"/>
+              <w:tblLayout w:type="fixed"/>
+              <w:tblLook w:firstRow="1" w:lastRow="0" w:firstColumn="0" w:lastColumn="0" w:noHBand="0" w:noVBand="0" w:val="0020"/>
+            </w:tblPr>
+            <w:tblGrid>
+              <w:gridCol w:w="250"/>
+              <w:gridCol w:w="833"/>
+              <w:gridCol w:w="1250"/>
+              <w:gridCol w:w="917"/>
+              <w:gridCol w:w="500"/>
+              <w:gridCol w:w="500"/>
+              <w:gridCol w:w="500"/>
+              <w:gridCol w:w="666"/>
+              <w:gridCol w:w="2501"/>
+            </w:tblGrid>
+            <w:tr>
+              <w:trPr>
+                <w:tblHeader w:val="on"/>
+              </w:trPr>
+              <w:tc>
+                <w:tcPr/>
+                <w:p>
+                  <w:pPr>
+                    <w:pStyle w:val="Compact"/>
+                    <w:jc w:val="left"/>
+                    <w:jc w:val="center"/>
+                  </w:pPr>
+                  <w:r>
+                    <w:t xml:space="preserve">K</w:t>
+                  </w:r>
+                </w:p>
+              </w:tc>
+              <w:tc>
+                <w:tcPr/>
+                <w:p>
+                  <w:pPr>
+                    <w:pStyle w:val="Compact"/>
+                    <w:jc w:val="right"/>
+                    <w:jc w:val="center"/>
+                  </w:pPr>
+                  <w:r>
+                    <w:t xml:space="preserve">Converged</w:t>
+                  </w:r>
+                </w:p>
+              </w:tc>
+              <w:tc>
+                <w:tcPr/>
+                <w:p>
+                  <w:pPr>
+                    <w:pStyle w:val="Compact"/>
+                    <w:jc w:val="right"/>
+                    <w:jc w:val="center"/>
+                  </w:pPr>
+                  <w:r>
+                    <w:t xml:space="preserve">Log-likelihood</w:t>
+                  </w:r>
+                </w:p>
+              </w:tc>
+              <w:tc>
+                <w:tcPr/>
+                <w:p>
+                  <w:pPr>
+                    <w:pStyle w:val="Compact"/>
+                    <w:jc w:val="right"/>
+                    <w:jc w:val="center"/>
+                  </w:pPr>
+                  <w:r>
+                    <w:t xml:space="preserve">Parameters</w:t>
+                  </w:r>
+                </w:p>
+              </w:tc>
+              <w:tc>
+                <w:tcPr/>
+                <w:p>
+                  <w:pPr>
+                    <w:pStyle w:val="Compact"/>
+                    <w:jc w:val="right"/>
+                    <w:jc w:val="center"/>
+                  </w:pPr>
+                  <w:r>
+                    <w:t xml:space="preserve">AIC</w:t>
+                  </w:r>
+                </w:p>
+              </w:tc>
+              <w:tc>
+                <w:tcPr/>
+                <w:p>
+                  <w:pPr>
+                    <w:pStyle w:val="Compact"/>
+                    <w:jc w:val="right"/>
+                    <w:jc w:val="center"/>
+                  </w:pPr>
+                  <w:r>
+                    <w:t xml:space="preserve">BIC</w:t>
+                  </w:r>
+                </w:p>
+              </w:tc>
+              <w:tc>
+                <w:tcPr/>
+                <w:p>
+                  <w:pPr>
+                    <w:pStyle w:val="Compact"/>
+                    <w:jc w:val="right"/>
+                    <w:jc w:val="center"/>
+                  </w:pPr>
+                  <w:r>
+                    <w:t xml:space="preserve">SABIC</w:t>
+                  </w:r>
+                </w:p>
+              </w:tc>
+              <w:tc>
+                <w:tcPr/>
+                <w:p>
+                  <w:pPr>
+                    <w:pStyle w:val="Compact"/>
+                    <w:jc w:val="right"/>
+                    <w:jc w:val="center"/>
+                  </w:pPr>
+                  <w:r>
+                    <w:t xml:space="preserve">Entropy</w:t>
+                  </w:r>
+                </w:p>
+              </w:tc>
+              <w:tc>
+                <w:tcPr/>
+                <w:p>
+                  <w:pPr>
+                    <w:pStyle w:val="Compact"/>
+                    <w:jc w:val="right"/>
+                    <w:jc w:val="center"/>
+                  </w:pPr>
+                  <w:r>
+                    <w:t xml:space="preserve">Class % (largest → smallest)</w:t>
+                  </w:r>
+                </w:p>
+              </w:tc>
+            </w:tr>
+            <w:tr>
+              <w:tc>
+                <w:tcPr/>
+                <w:p>
+                  <w:pPr>
+                    <w:pStyle w:val="Compact"/>
+                    <w:jc w:val="left"/>
+                    <w:jc w:val="center"/>
+                  </w:pPr>
+                  <w:r>
+                    <w:t xml:space="preserve">1</w:t>
+                  </w:r>
+                </w:p>
+              </w:tc>
+              <w:tc>
+                <w:tcPr/>
+                <w:p>
+                  <w:pPr>
+                    <w:pStyle w:val="Compact"/>
+                    <w:jc w:val="right"/>
+                    <w:jc w:val="center"/>
+                  </w:pPr>
+                  <w:r>
+                    <w:t xml:space="preserve">Yes</w:t>
+                  </w:r>
+                </w:p>
+              </w:tc>
+              <w:tc>
+                <w:tcPr/>
+                <w:p>
+                  <w:pPr>
+                    <w:pStyle w:val="Compact"/>
+                    <w:jc w:val="right"/>
+                    <w:jc w:val="center"/>
+                  </w:pPr>
+                  <w:r>
+                    <w:t xml:space="preserve">-29234.7</w:t>
+                  </w:r>
+                </w:p>
+              </w:tc>
+              <w:tc>
+                <w:tcPr/>
+                <w:p>
+                  <w:pPr>
+                    <w:pStyle w:val="Compact"/>
+                    <w:jc w:val="right"/>
+                    <w:jc w:val="center"/>
+                  </w:pPr>
+                  <w:r>
+                    <w:t xml:space="preserve">3</w:t>
+                  </w:r>
+                </w:p>
+              </w:tc>
+              <w:tc>
+                <w:tcPr/>
+                <w:p>
+                  <w:pPr>
+                    <w:pStyle w:val="Compact"/>
+                    <w:jc w:val="right"/>
+                    <w:jc w:val="center"/>
+                  </w:pPr>
+                  <w:r>
+                    <w:t xml:space="preserve">58475</w:t>
+                  </w:r>
+                </w:p>
+              </w:tc>
+              <w:tc>
+                <w:tcPr/>
+                <w:p>
+                  <w:pPr>
+                    <w:pStyle w:val="Compact"/>
+                    <w:jc w:val="right"/>
+                    <w:jc w:val="center"/>
+                  </w:pPr>
+                  <w:r>
+                    <w:t xml:space="preserve">58496</w:t>
+                  </w:r>
+                </w:p>
+              </w:tc>
+              <w:tc>
+                <w:tcPr/>
+                <w:p>
+                  <w:pPr>
+                    <w:pStyle w:val="Compact"/>
+                    <w:jc w:val="right"/>
+                    <w:jc w:val="center"/>
+                  </w:pPr>
+                  <w:r>
+                    <w:t xml:space="preserve">58487</w:t>
+                  </w:r>
+                </w:p>
+              </w:tc>
+              <w:tc>
+                <w:tcPr/>
+                <w:p>
+                  <w:pPr>
+                    <w:pStyle w:val="Compact"/>
+                    <w:jc w:val="right"/>
+                    <w:jc w:val="center"/>
+                  </w:pPr>
+                  <w:r>
+                    <w:t xml:space="preserve">—</w:t>
+                  </w:r>
+                </w:p>
+              </w:tc>
+              <w:tc>
+                <w:tcPr/>
+                <w:p>
+                  <w:pPr>
+                    <w:pStyle w:val="Compact"/>
+                    <w:jc w:val="right"/>
+                    <w:jc w:val="center"/>
+                  </w:pPr>
+                  <w:r>
+                    <w:t xml:space="preserve">100.0</w:t>
+                  </w:r>
+                </w:p>
+              </w:tc>
+            </w:tr>
+            <w:tr>
+              <w:tc>
+                <w:tcPr/>
+                <w:p>
+                  <w:pPr>
+                    <w:pStyle w:val="Compact"/>
+                    <w:jc w:val="left"/>
+                    <w:jc w:val="center"/>
+                  </w:pPr>
+                  <w:r>
+                    <w:t xml:space="preserve">2</w:t>
+                  </w:r>
+                </w:p>
+              </w:tc>
+              <w:tc>
+                <w:tcPr/>
+                <w:p>
+                  <w:pPr>
+                    <w:pStyle w:val="Compact"/>
+                    <w:jc w:val="right"/>
+                    <w:jc w:val="center"/>
+                  </w:pPr>
+                  <w:r>
+                    <w:t xml:space="preserve">Yes</w:t>
+                  </w:r>
+                </w:p>
+              </w:tc>
+              <w:tc>
+                <w:tcPr/>
+                <w:p>
+                  <w:pPr>
+                    <w:pStyle w:val="Compact"/>
+                    <w:jc w:val="right"/>
+                    <w:jc w:val="center"/>
+                  </w:pPr>
+                  <w:r>
+                    <w:t xml:space="preserve">-27805.2</w:t>
+                  </w:r>
+                </w:p>
+              </w:tc>
+              <w:tc>
+                <w:tcPr/>
+                <w:p>
+                  <w:pPr>
+                    <w:pStyle w:val="Compact"/>
+                    <w:jc w:val="right"/>
+                    <w:jc w:val="center"/>
+                  </w:pPr>
+                  <w:r>
+                    <w:t xml:space="preserve">6</w:t>
+                  </w:r>
+                </w:p>
+              </w:tc>
+              <w:tc>
+                <w:tcPr/>
+                <w:p>
+                  <w:pPr>
+                    <w:pStyle w:val="Compact"/>
+                    <w:jc w:val="right"/>
+                    <w:jc w:val="center"/>
+                  </w:pPr>
+                  <w:r>
+                    <w:t xml:space="preserve">55622</w:t>
+                  </w:r>
+                </w:p>
+              </w:tc>
+              <w:tc>
+                <w:tcPr/>
+                <w:p>
+                  <w:pPr>
+                    <w:pStyle w:val="Compact"/>
+                    <w:jc w:val="right"/>
+                    <w:jc w:val="center"/>
+                  </w:pPr>
+                  <w:r>
+                    <w:t xml:space="preserve">55664</w:t>
+                  </w:r>
+                </w:p>
+              </w:tc>
+              <w:tc>
+                <w:tcPr/>
+                <w:p>
+                  <w:pPr>
+                    <w:pStyle w:val="Compact"/>
+                    <w:jc w:val="right"/>
+                    <w:jc w:val="center"/>
+                  </w:pPr>
+                  <w:r>
+                    <w:t xml:space="preserve">55645</w:t>
+                  </w:r>
+                </w:p>
+              </w:tc>
+              <w:tc>
+                <w:tcPr/>
+                <w:p>
+                  <w:pPr>
+                    <w:pStyle w:val="Compact"/>
+                    <w:jc w:val="right"/>
+                    <w:jc w:val="center"/>
+                  </w:pPr>
+                  <w:r>
+                    <w:t xml:space="preserve">0.77</w:t>
+                  </w:r>
+                </w:p>
+              </w:tc>
+              <w:tc>
+                <w:tcPr/>
+                <w:p>
+                  <w:pPr>
+                    <w:pStyle w:val="Compact"/>
+                    <w:jc w:val="right"/>
+                    <w:jc w:val="center"/>
+                  </w:pPr>
+                  <w:r>
+                    <w:t xml:space="preserve">84.7 / 15.3</w:t>
+                  </w:r>
+                </w:p>
+              </w:tc>
+            </w:tr>
+            <w:tr>
+              <w:tc>
+                <w:tcPr/>
+                <w:p>
+                  <w:pPr>
+                    <w:pStyle w:val="Compact"/>
+                    <w:jc w:val="left"/>
+                    <w:jc w:val="center"/>
+                  </w:pPr>
+                  <w:r>
+                    <w:t xml:space="preserve">3</w:t>
+                  </w:r>
+                </w:p>
+              </w:tc>
+              <w:tc>
+                <w:tcPr/>
+                <w:p>
+                  <w:pPr>
+                    <w:pStyle w:val="Compact"/>
+                    <w:jc w:val="right"/>
+                    <w:jc w:val="center"/>
+                  </w:pPr>
+                  <w:r>
+                    <w:t xml:space="preserve">Yes</w:t>
+                  </w:r>
+                </w:p>
+              </w:tc>
+              <w:tc>
+                <w:tcPr/>
+                <w:p>
+                  <w:pPr>
+                    <w:pStyle w:val="Compact"/>
+                    <w:jc w:val="right"/>
+                    <w:jc w:val="center"/>
+                  </w:pPr>
+                  <w:r>
+                    <w:t xml:space="preserve">-27407.3</w:t>
+                  </w:r>
+                </w:p>
+              </w:tc>
+              <w:tc>
+                <w:tcPr/>
+                <w:p>
+                  <w:pPr>
+                    <w:pStyle w:val="Compact"/>
+                    <w:jc w:val="right"/>
+                    <w:jc w:val="center"/>
+                  </w:pPr>
+                  <w:r>
+                    <w:t xml:space="preserve">9</w:t>
+                  </w:r>
+                </w:p>
+              </w:tc>
+              <w:tc>
+                <w:tcPr/>
+                <w:p>
+                  <w:pPr>
+                    <w:pStyle w:val="Compact"/>
+                    <w:jc w:val="right"/>
+                    <w:jc w:val="center"/>
+                  </w:pPr>
+                  <w:r>
+                    <w:t xml:space="preserve">54833</w:t>
+                  </w:r>
+                </w:p>
+              </w:tc>
+              <w:tc>
+                <w:tcPr/>
+                <w:p>
+                  <w:pPr>
+                    <w:pStyle w:val="Compact"/>
+                    <w:jc w:val="right"/>
+                    <w:jc w:val="center"/>
+                  </w:pPr>
+                  <w:r>
+                    <w:t xml:space="preserve">54895</w:t>
+                  </w:r>
+                </w:p>
+              </w:tc>
+              <w:tc>
+                <w:tcPr/>
+                <w:p>
+                  <w:pPr>
+                    <w:pStyle w:val="Compact"/>
+                    <w:jc w:val="right"/>
+                    <w:jc w:val="center"/>
+                  </w:pPr>
+                  <w:r>
+                    <w:t xml:space="preserve">54867</w:t>
+                  </w:r>
+                </w:p>
+              </w:tc>
+              <w:tc>
+                <w:tcPr/>
+                <w:p>
+                  <w:pPr>
+                    <w:pStyle w:val="Compact"/>
+                    <w:jc w:val="right"/>
+                    <w:jc w:val="center"/>
+                  </w:pPr>
+                  <w:r>
+                    <w:t xml:space="preserve">0.85</w:t>
+                  </w:r>
+                </w:p>
+              </w:tc>
+              <w:tc>
+                <w:tcPr/>
+                <w:p>
+                  <w:pPr>
+                    <w:pStyle w:val="Compact"/>
+                    <w:jc w:val="right"/>
+                    <w:jc w:val="center"/>
+                  </w:pPr>
+                  <w:r>
+                    <w:t xml:space="preserve">83.8 / 13.5 / 2.8</w:t>
+                  </w:r>
+                </w:p>
+              </w:tc>
+            </w:tr>
+            <w:tr>
+              <w:tc>
+                <w:tcPr/>
+                <w:p>
+                  <w:pPr>
+                    <w:pStyle w:val="Compact"/>
+                    <w:jc w:val="left"/>
+                    <w:jc w:val="center"/>
+                  </w:pPr>
+                  <w:r>
+                    <w:t xml:space="preserve">4</w:t>
+                  </w:r>
+                </w:p>
+              </w:tc>
+              <w:tc>
+                <w:tcPr/>
+                <w:p>
+                  <w:pPr>
+                    <w:pStyle w:val="Compact"/>
+                    <w:jc w:val="right"/>
+                    <w:jc w:val="center"/>
+                  </w:pPr>
+                  <w:r>
+                    <w:t xml:space="preserve">Yes</w:t>
+                  </w:r>
+                </w:p>
+              </w:tc>
+              <w:tc>
+                <w:tcPr/>
+                <w:p>
+                  <w:pPr>
+                    <w:pStyle w:val="Compact"/>
+                    <w:jc w:val="right"/>
+                    <w:jc w:val="center"/>
+                  </w:pPr>
+                  <w:r>
+                    <w:t xml:space="preserve">-27142.6</w:t>
+                  </w:r>
+                </w:p>
+              </w:tc>
+              <w:tc>
+                <w:tcPr/>
+                <w:p>
+                  <w:pPr>
+                    <w:pStyle w:val="Compact"/>
+                    <w:jc w:val="right"/>
+                    <w:jc w:val="center"/>
+                  </w:pPr>
+                  <w:r>
+                    <w:t xml:space="preserve">12</w:t>
+                  </w:r>
+                </w:p>
+              </w:tc>
+              <w:tc>
+                <w:tcPr/>
+                <w:p>
+                  <w:pPr>
+                    <w:pStyle w:val="Compact"/>
+                    <w:jc w:val="right"/>
+                    <w:jc w:val="center"/>
+                  </w:pPr>
+                  <w:r>
+                    <w:t xml:space="preserve">54309</w:t>
+                  </w:r>
+                </w:p>
+              </w:tc>
+              <w:tc>
+                <w:tcPr/>
+                <w:p>
+                  <w:pPr>
+                    <w:pStyle w:val="Compact"/>
+                    <w:jc w:val="right"/>
+                    <w:jc w:val="center"/>
+                  </w:pPr>
+                  <w:r>
+                    <w:t xml:space="preserve">54393</w:t>
+                  </w:r>
+                </w:p>
+              </w:tc>
+              <w:tc>
+                <w:tcPr/>
+                <w:p>
+                  <w:pPr>
+                    <w:pStyle w:val="Compact"/>
+                    <w:jc w:val="right"/>
+                    <w:jc w:val="center"/>
+                  </w:pPr>
+                  <w:r>
+                    <w:t xml:space="preserve">54355</w:t>
+                  </w:r>
+                </w:p>
+              </w:tc>
+              <w:tc>
+                <w:tcPr/>
+                <w:p>
+                  <w:pPr>
+                    <w:pStyle w:val="Compact"/>
+                    <w:jc w:val="right"/>
+                    <w:jc w:val="center"/>
+                  </w:pPr>
+                  <w:r>
+                    <w:t xml:space="preserve">0.81</w:t>
+                  </w:r>
+                </w:p>
+              </w:tc>
+              <w:tc>
+                <w:tcPr/>
+                <w:p>
+                  <w:pPr>
+                    <w:pStyle w:val="Compact"/>
+                    <w:jc w:val="right"/>
+                    <w:jc w:val="center"/>
+                  </w:pPr>
+                  <w:r>
+                    <w:t xml:space="preserve">72.1 / 22.6 / 2.7 / 2.6</w:t>
+                  </w:r>
+                </w:p>
+              </w:tc>
+            </w:tr>
+            <w:tr>
+              <w:tc>
+                <w:tcPr/>
+                <w:p>
+                  <w:pPr>
+                    <w:pStyle w:val="Compact"/>
+                    <w:jc w:val="left"/>
+                    <w:jc w:val="center"/>
+                  </w:pPr>
+                  <w:r>
+                    <w:t xml:space="preserve">5</w:t>
+                  </w:r>
+                </w:p>
+              </w:tc>
+              <w:tc>
+                <w:tcPr/>
+                <w:p>
+                  <w:pPr>
+                    <w:pStyle w:val="Compact"/>
+                    <w:jc w:val="right"/>
+                    <w:jc w:val="center"/>
+                  </w:pPr>
+                  <w:r>
+                    <w:t xml:space="preserve">Yes</w:t>
+                  </w:r>
+                </w:p>
+              </w:tc>
+              <w:tc>
+                <w:tcPr/>
+                <w:p>
+                  <w:pPr>
+                    <w:pStyle w:val="Compact"/>
+                    <w:jc w:val="right"/>
+                    <w:jc w:val="center"/>
+                  </w:pPr>
+                  <w:r>
+                    <w:t xml:space="preserve">-26950.2</w:t>
+                  </w:r>
+                </w:p>
+              </w:tc>
+              <w:tc>
+                <w:tcPr/>
+                <w:p>
+                  <w:pPr>
+                    <w:pStyle w:val="Compact"/>
+                    <w:jc w:val="right"/>
+                    <w:jc w:val="center"/>
+                  </w:pPr>
+                  <w:r>
+                    <w:t xml:space="preserve">15</w:t>
+                  </w:r>
+                </w:p>
+              </w:tc>
+              <w:tc>
+                <w:tcPr/>
+                <w:p>
+                  <w:pPr>
+                    <w:pStyle w:val="Compact"/>
+                    <w:jc w:val="right"/>
+                    <w:jc w:val="center"/>
+                  </w:pPr>
+                  <w:r>
+                    <w:t xml:space="preserve">53930</w:t>
+                  </w:r>
+                </w:p>
+              </w:tc>
+              <w:tc>
+                <w:tcPr/>
+                <w:p>
+                  <w:pPr>
+                    <w:pStyle w:val="Compact"/>
+                    <w:jc w:val="right"/>
+                    <w:jc w:val="center"/>
+                  </w:pPr>
+                  <w:r>
+                    <w:t xml:space="preserve">54035</w:t>
+                  </w:r>
+                </w:p>
+              </w:tc>
+              <w:tc>
+                <w:tcPr/>
+                <w:p>
+                  <w:pPr>
+                    <w:pStyle w:val="Compact"/>
+                    <w:jc w:val="right"/>
+                    <w:jc w:val="center"/>
+                  </w:pPr>
+                  <w:r>
+                    <w:t xml:space="preserve">53987</w:t>
+                  </w:r>
+                </w:p>
+              </w:tc>
+              <w:tc>
+                <w:tcPr/>
+                <w:p>
+                  <w:pPr>
+                    <w:pStyle w:val="Compact"/>
+                    <w:jc w:val="right"/>
+                    <w:jc w:val="center"/>
+                  </w:pPr>
+                  <w:r>
+                    <w:t xml:space="preserve">0.81</w:t>
+                  </w:r>
+                </w:p>
+              </w:tc>
+              <w:tc>
+                <w:tcPr/>
+                <w:p>
+                  <w:pPr>
+                    <w:pStyle w:val="Compact"/>
+                    <w:jc w:val="right"/>
+                    <w:jc w:val="center"/>
+                  </w:pPr>
+                  <w:r>
+                    <w:t xml:space="preserve">72.2 / 19.1 / 4.4 / 2.8 / 1.6</w:t>
+                  </w:r>
+                </w:p>
+              </w:tc>
+            </w:tr>
+          </w:tbl>
+          <w:bookmarkEnd w:id="37"/>
+          <w:p/>
+        </w:tc>
+      </w:tr>
+    </w:tbl>
+    <w:p>
+      <w:pPr>
+        <w:pStyle w:val="CaptionedFigure"/>
+      </w:pPr>
+      <w:r>
+        <w:drawing>
+          <wp:inline>
+            <wp:extent cx="5334000" cy="1866900"/>
+            <wp:effectExtent b="0" l="0" r="0" t="0"/>
+            <wp:docPr descr="Predicted class trajectories (95% bands) by number of classes. Dashed line: observed overall means." title="" id="39" name="Picture"/>
+            <a:graphic>
+              <a:graphicData uri="http://schemas.openxmlformats.org/drawingml/2006/picture">
+                <pic:pic>
+                  <pic:nvPicPr>
+                    <pic:cNvPr descr="report_files/figure-docx/plot-lcga-trajectories-1.png" id="40" name="Picture"/>
+                    <pic:cNvPicPr>
+                      <a:picLocks noChangeArrowheads="1" noChangeAspect="1"/>
+                    </pic:cNvPicPr>
+                  </pic:nvPicPr>
+                  <pic:blipFill>
+                    <a:blip r:embed="rId38"/>
+                    <a:stretch>
+                      <a:fillRect/>
+                    </a:stretch>
+                  </pic:blipFill>
+                  <pic:spPr bwMode="auto">
+                    <a:xfrm>
+                      <a:off x="0" y="0"/>
+                      <a:ext cx="5334000" cy="1866900"/>
+                    </a:xfrm>
+                    <a:prstGeom prst="rect">
+                      <a:avLst/>
+                    </a:prstGeom>
+                    <a:noFill/>
+                    <a:ln w="9525">
+                      <a:noFill/>
+                      <a:headEnd/>
+                      <a:tailEnd/>
+                    </a:ln>
+                  </pic:spPr>
+                </pic:pic>
+              </a:graphicData>
+            </a:graphic>
+          </wp:inline>
+        </w:drawing>
+      </w:r>
+    </w:p>
+    <w:p>
+      <w:pPr>
+        <w:pStyle w:val="ImageCaption"/>
+      </w:pPr>
+      <w:r>
+        <w:t xml:space="preserve">Predicted class trajectories (95% bands) by number of classes. Dashed line: observed overall means.</w:t>
+      </w:r>
+    </w:p>
+    <w:tbl>
+      <w:tblPr>
+        <w:tblStyle w:val="Table"/>
+        <w:tblLook w:firstRow="0" w:lastRow="0" w:firstColumn="0" w:lastColumn="0" w:noHBand="0" w:noVBand="0" w:val="0000"/>
+        <w:tblBorders>
+          <w:top w:val="single" w:sz="4" w:space="0" w:color="0758E5"/>
+          <w:left w:val="single" w:sz="24" w:space="0" w:color="0758E5"/>
+          <w:bottom w:val="single" w:sz="4" w:space="0" w:color="0758E5"/>
+          <w:right w:val="single" w:sz="4" w:space="0" w:color="0758E5"/>
+        </w:tblBorders>
+        <w:tblCellMar>
+          <w:left w:w="144" w:type="dxa"/>
+          <w:right w:w="144" w:type="dxa"/>
+        </w:tblCellMar>
+        <w:tblLook w:firstRow="0" w:lastRow="0" w:firstColumn="0" w:lastColumn="0" w:noHBand="0" w:noVBand="0" w:val="0000"/>
+      </w:tblPr>
+      <w:tr>
+        <w:trPr>
+          <w:cantSplit/>
+        </w:trPr>
+        <w:tc>
+          <w:tcPr>
+            <w:shd w:color="auto" w:fill="dae6fb" w:val="clear"/>
+            <w:tcMar>
+              <w:top w:w="92" w:type="dxa"/>
+              <w:bottom w:w="92" w:type="dxa"/>
+            </w:tcMar>
+          </w:tcPr>
+          <w:p>
+            <w:pPr>
+              <w:pStyle w:val="BodyText"/>
+            </w:pPr>
+            <w:pPr>
+              <w:spacing w:before="0" w:after="0"/>
+              <w:textAlignment w:val="center"/>
+            </w:pPr>
+            <w:r>
+              <w:drawing>
+                <wp:inline>
+                  <wp:extent cx="152400" cy="152400"/>
+                  <wp:effectExtent b="0" l="0" r="0" t="0"/>
+                  <wp:docPr descr="" title="" id="41" name="Picture"/>
+                  <a:graphic>
+                    <a:graphicData uri="http://schemas.openxmlformats.org/drawingml/2006/picture">
+                      <pic:pic>
+                        <pic:nvPicPr>
+                          <pic:cNvPr descr="/opt/quarto/share/formats/docx/note.png" id="42" name="Picture"/>
+                          <pic:cNvPicPr>
+                            <a:picLocks noChangeArrowheads="1" noChangeAspect="1"/>
+                          </pic:cNvPicPr>
+                        </pic:nvPicPr>
+                        <pic:blipFill>
+                          <a:blip r:embed="rId9"/>
+                          <a:stretch>
+                            <a:fillRect/>
+                          </a:stretch>
+                        </pic:blipFill>
+                        <pic:spPr bwMode="auto">
+                          <a:xfrm>
+                            <a:off x="0" y="0"/>
+                            <a:ext cx="152400" cy="152400"/>
+                          </a:xfrm>
+                          <a:prstGeom prst="rect">
+                            <a:avLst/>
+                          </a:prstGeom>
+                          <a:noFill/>
+                          <a:ln w="9525">
+                            <a:noFill/>
+                            <a:headEnd/>
+                            <a:tailEnd/>
+                          </a:ln>
+                        </pic:spPr>
+                      </pic:pic>
+                    </a:graphicData>
+                  </a:graphic>
+                </wp:inline>
+              </w:drawing>
+            </w:r>
+            <w:r>
+              <w:t xml:space="preserve"> </w:t>
+            </w:r>
+            <w:r>
+              <w:t xml:space="preserve"> </w:t>
+            </w:r>
+            <w:r>
+              <w:t xml:space="preserve">Interpretation</w:t>
+            </w:r>
+          </w:p>
+        </w:tc>
+      </w:tr>
+      <w:tr>
+        <w:trPr>
+          <w:cantSplit/>
+        </w:trPr>
+        <w:tc>
+          <w:tcPr>
+            <w:tcMar>
+              <w:top w:w="108" w:type="dxa"/>
+              <w:bottom w:w="108" w:type="dxa"/>
+            </w:tcMar>
+          </w:tcPr>
+          <w:p>
+            <w:pPr>
+              <w:pStyle w:val="Compact"/>
+              <w:numPr>
+                <w:ilvl w:val="0"/>
+                <w:numId w:val="1007"/>
+              </w:numPr>
+            </w:pPr>
+            <w:r>
+              <w:t xml:space="preserve">All five models converged. As anticipated at this sample size (N = 7,843),</w:t>
+            </w:r>
+            <w:r>
+              <w:t xml:space="preserve"> </w:t>
+            </w:r>
+            <w:r>
+              <w:t xml:space="preserve">AIC/BIC/SABIC fall monotonically through K = 5, so information criteria</w:t>
+            </w:r>
+            <w:r>
+              <w:t xml:space="preserve"> </w:t>
+            </w:r>
+            <w:r>
+              <w:t xml:space="preserve">alone cannot settle enumeration — entropy, class sizes, and</w:t>
+            </w:r>
+            <w:r>
+              <w:t xml:space="preserve"> </w:t>
+            </w:r>
+            <w:r>
+              <w:t xml:space="preserve">interpretability carry more weight.</w:t>
+            </w:r>
+          </w:p>
+          <w:p>
+            <w:pPr>
+              <w:pStyle w:val="Compact"/>
+              <w:numPr>
+                <w:ilvl w:val="0"/>
+                <w:numId w:val="1007"/>
+              </w:numPr>
+            </w:pPr>
+            <w:r>
+              <w:rPr>
+                <w:b/>
+                <w:bCs/>
+              </w:rPr>
+              <w:t xml:space="preserve">Entropy peaks at K = 3 (0.85)</w:t>
+            </w:r>
+            <w:r>
+              <w:t xml:space="preserve"> </w:t>
+            </w:r>
+            <w:r>
+              <w:t xml:space="preserve">and drops to ~0.81 at K = 4–5. All values</w:t>
+            </w:r>
+            <w:r>
+              <w:t xml:space="preserve"> </w:t>
+            </w:r>
+            <w:r>
+              <w:t xml:space="preserve">from K = 3 up clear the ≥0.8 bar for the proportional-weighting three-step</w:t>
+            </w:r>
+            <w:r>
+              <w:t xml:space="preserve"> </w:t>
+            </w:r>
+            <w:r>
+              <w:t xml:space="preserve">approach (Step 4 decision point).</w:t>
+            </w:r>
+          </w:p>
+          <w:p>
+            <w:pPr>
+              <w:pStyle w:val="Compact"/>
+              <w:numPr>
+                <w:ilvl w:val="0"/>
+                <w:numId w:val="1007"/>
+              </w:numPr>
+            </w:pPr>
+            <w:r>
+              <w:t xml:space="preserve">The K = 3 solution is highly interpretable: a satisfied majority tracking</w:t>
+            </w:r>
+            <w:r>
+              <w:t xml:space="preserve"> </w:t>
+            </w:r>
+            <w:r>
+              <w:t xml:space="preserve">close to zero discrepancy (~84%), a</w:t>
+            </w:r>
+            <w:r>
+              <w:t xml:space="preserve"> </w:t>
+            </w:r>
+            <w:r>
+              <w:t xml:space="preserve">“larger than ideal”</w:t>
+            </w:r>
+            <w:r>
+              <w:t xml:space="preserve"> </w:t>
+            </w:r>
+            <w:r>
+              <w:t xml:space="preserve">class starting high</w:t>
+            </w:r>
+            <w:r>
+              <w:t xml:space="preserve"> </w:t>
+            </w:r>
+            <w:r>
+              <w:t xml:space="preserve">and declining (~13.5%), and a small</w:t>
+            </w:r>
+            <w:r>
+              <w:t xml:space="preserve"> </w:t>
+            </w:r>
+            <w:r>
+              <w:t xml:space="preserve">“thinner than ideal”</w:t>
+            </w:r>
+            <w:r>
+              <w:t xml:space="preserve"> </w:t>
+            </w:r>
+            <w:r>
+              <w:t xml:space="preserve">class converging</w:t>
+            </w:r>
+            <w:r>
+              <w:t xml:space="preserve"> </w:t>
+            </w:r>
+            <w:r>
+              <w:t xml:space="preserve">toward zero (~2.8%, ≈ 220 children).</w:t>
+            </w:r>
+          </w:p>
+          <w:p>
+            <w:pPr>
+              <w:pStyle w:val="Compact"/>
+              <w:numPr>
+                <w:ilvl w:val="0"/>
+                <w:numId w:val="1007"/>
+              </w:numPr>
+            </w:pPr>
+            <w:r>
+              <w:t xml:space="preserve">K = 4 splits the</w:t>
+            </w:r>
+            <w:r>
+              <w:t xml:space="preserve"> </w:t>
+            </w:r>
+            <w:r>
+              <w:t xml:space="preserve">“larger than ideal”</w:t>
+            </w:r>
+            <w:r>
+              <w:t xml:space="preserve"> </w:t>
+            </w:r>
+            <w:r>
+              <w:t xml:space="preserve">group into a moderate-stable class</w:t>
+            </w:r>
+            <w:r>
+              <w:t xml:space="preserve"> </w:t>
+            </w:r>
+            <w:r>
+              <w:t xml:space="preserve">(~23%) and a small extreme-declining class (~2.7%), at the cost of lower</w:t>
+            </w:r>
+            <w:r>
+              <w:t xml:space="preserve"> </w:t>
+            </w:r>
+            <w:r>
+              <w:t xml:space="preserve">entropy; K = 5 adds a 1.6% class with a steep crossing trajectory that looks</w:t>
+            </w:r>
+            <w:r>
+              <w:t xml:space="preserve"> </w:t>
+            </w:r>
+            <w:r>
+              <w:t xml:space="preserve">like a fringe pattern rather than a substantive group.</w:t>
+            </w:r>
+          </w:p>
+          <w:p>
+            <w:pPr>
+              <w:pStyle w:val="Compact"/>
+              <w:numPr>
+                <w:ilvl w:val="0"/>
+                <w:numId w:val="1007"/>
+              </w:numPr>
+            </w:pPr>
+            <w:r>
+              <w:t xml:space="preserve">Classes below the 5% flag appear from K = 3 onward, but the 2.8% class at</w:t>
+            </w:r>
+            <w:r>
+              <w:t xml:space="preserve"> </w:t>
+            </w:r>
+            <w:r>
+              <w:t xml:space="preserve">K = 3 maps directly onto the</w:t>
+            </w:r>
+            <w:r>
+              <w:t xml:space="preserve"> </w:t>
+            </w:r>
+            <w:r>
+              <w:t xml:space="preserve">“thinner than ideal”</w:t>
+            </w:r>
+            <w:r>
+              <w:t xml:space="preserve"> </w:t>
+            </w:r>
+            <w:r>
+              <w:t xml:space="preserve">group visible in the</w:t>
+            </w:r>
+            <w:r>
+              <w:t xml:space="preserve"> </w:t>
+            </w:r>
+            <w:r>
+              <w:t xml:space="preserve">descriptives, which argues for keeping it.</w:t>
+            </w:r>
+          </w:p>
+          <w:p>
+            <w:pPr>
+              <w:pStyle w:val="Compact"/>
+              <w:numPr>
+                <w:ilvl w:val="0"/>
+                <w:numId w:val="1007"/>
+              </w:numPr>
+            </w:pPr>
+            <w:r>
+              <w:rPr>
+                <w:b/>
+                <w:bCs/>
+              </w:rPr>
+              <w:t xml:space="preserve">Tentative recommendation: K = 3</w:t>
+            </w:r>
+            <w:r>
+              <w:t xml:space="preserve"> </w:t>
+            </w:r>
+            <w:r>
+              <w:t xml:space="preserve">(best entropy, cleanly interpretable,</w:t>
+            </w:r>
+            <w:r>
+              <w:t xml:space="preserve"> </w:t>
+            </w:r>
+            <w:r>
+              <w:t xml:space="preserve">classes matching the descriptive patterns), with K = 4 the main alternative</w:t>
+            </w:r>
+            <w:r>
+              <w:t xml:space="preserve"> </w:t>
+            </w:r>
+            <w:r>
+              <w:t xml:space="preserve">if the moderate/extreme split among dissatisfied children is of substantive</w:t>
+            </w:r>
+            <w:r>
+              <w:t xml:space="preserve"> </w:t>
+            </w:r>
+            <w:r>
+              <w:t xml:space="preserve">interest.</w:t>
+            </w:r>
+            <w:r>
+              <w:t xml:space="preserve"> </w:t>
+            </w:r>
+            <w:r>
+              <w:rPr>
+                <w:b/>
+                <w:bCs/>
+              </w:rPr>
+              <w:t xml:space="preserve">Decision on K is yours</w:t>
+            </w:r>
+            <w:r>
+              <w:t xml:space="preserve"> </w:t>
+            </w:r>
+            <w:r>
+              <w:t xml:space="preserve">— it is set in one place</w:t>
+            </w:r>
+            <w:r>
+              <w:t xml:space="preserve"> </w:t>
+            </w:r>
+            <w:r>
+              <w:t xml:space="preserve">(</w:t>
+            </w:r>
+            <w:r>
+              <w:rPr>
+                <w:rStyle w:val="VerbatimChar"/>
+              </w:rPr>
+              <w:t xml:space="preserve">lcga_k_chosen</w:t>
+            </w:r>
+            <w:r>
+              <w:t xml:space="preserve"> </w:t>
+            </w:r>
+            <w:r>
+              <w:t xml:space="preserve">in</w:t>
+            </w:r>
+            <w:r>
+              <w:t xml:space="preserve"> </w:t>
+            </w:r>
+            <w:r>
+              <w:rPr>
+                <w:rStyle w:val="VerbatimChar"/>
+              </w:rPr>
+              <w:t xml:space="preserve">_targets.R</w:t>
+            </w:r>
+            <w:r>
+              <w:t xml:space="preserve">) at Step 3b.</w:t>
+            </w:r>
+          </w:p>
+          <w:p/>
+        </w:tc>
+      </w:tr>
+    </w:tbl>
+    <w:bookmarkStart w:id="52" w:name="sex-stratified-enumeration-check"/>
+    <w:p>
+      <w:pPr>
+        <w:pStyle w:val="Heading2"/>
+      </w:pPr>
+      <w:r>
+        <w:t xml:space="preserve">5.1 Sex-stratified enumeration check</w:t>
+      </w:r>
+    </w:p>
+    <w:p>
+      <w:pPr>
+        <w:pStyle w:val="FirstParagraph"/>
+      </w:pPr>
+      <w:r>
+        <w:t xml:space="preserve">The descriptive statistics showed sex-linked patterns in the level and</w:t>
+      </w:r>
+      <w:r>
+        <w:t xml:space="preserve"> </w:t>
+      </w:r>
+      <w:r>
+        <w:t xml:space="preserve">direction of body dissatisfaction, raising the question of whether trajectory</w:t>
+      </w:r>
+      <w:r>
+        <w:t xml:space="preserve"> </w:t>
+      </w:r>
+      <w:r>
+        <w:t xml:space="preserve">classes should be sex-stratified. As a diagnostic, the same K = 1–5</w:t>
+      </w:r>
+      <w:r>
+        <w:t xml:space="preserve"> </w:t>
+      </w:r>
+      <w:r>
+        <w:t xml:space="preserve">enumeration was repeated separately for boys and girls. If the stratified</w:t>
+      </w:r>
+      <w:r>
+        <w:t xml:space="preserve"> </w:t>
+      </w:r>
+      <w:r>
+        <w:t xml:space="preserve">class</w:t>
+      </w:r>
+      <w:r>
+        <w:t xml:space="preserve"> </w:t>
+      </w:r>
+      <w:r>
+        <w:rPr>
+          <w:i/>
+          <w:iCs/>
+        </w:rPr>
+        <w:t xml:space="preserve">shapes</w:t>
+      </w:r>
+      <w:r>
+        <w:t xml:space="preserve"> </w:t>
+      </w:r>
+      <w:r>
+        <w:t xml:space="preserve">mirror the pooled solution, sex differences are a matter of</w:t>
+      </w:r>
+      <w:r>
+        <w:t xml:space="preserve"> </w:t>
+      </w:r>
+      <w:r>
+        <w:t xml:space="preserve">class</w:t>
+      </w:r>
+      <w:r>
+        <w:t xml:space="preserve"> </w:t>
+      </w:r>
+      <w:r>
+        <w:rPr>
+          <w:i/>
+          <w:iCs/>
+        </w:rPr>
+        <w:t xml:space="preserve">prevalence</w:t>
+      </w:r>
+      <w:r>
+        <w:t xml:space="preserve"> </w:t>
+      </w:r>
+      <w:r>
+        <w:t xml:space="preserve">— handled by sex in the class-membership model and the</w:t>
+      </w:r>
+      <w:r>
+        <w:t xml:space="preserve"> </w:t>
+      </w:r>
+      <w:r>
+        <w:t xml:space="preserve">planned sex-moderation tests — and the pooled LCGA stands as the primary</w:t>
+      </w:r>
+      <w:r>
+        <w:t xml:space="preserve"> </w:t>
+      </w:r>
+      <w:r>
+        <w:t xml:space="preserve">specification.</w:t>
+      </w:r>
+    </w:p>
+    <w:tbl>
+      <w:tblPr>
+        <w:tblStyle w:val="Table"/>
+        <w:tblW w:type="pct" w:w="5000"/>
+        <w:tblLayout w:type="fixed"/>
+        <w:tblLook w:firstRow="0" w:lastRow="0" w:firstColumn="0" w:lastColumn="0" w:noHBand="0" w:noVBand="0" w:val="0000"/>
+      </w:tblPr>
+      <w:tblGrid>
+        <w:gridCol w:w="7920"/>
+      </w:tblGrid>
+      <w:tr>
+        <w:tc>
+          <w:tcPr/>
+          <w:bookmarkStart w:id="43" w:name="tbl-lcga-strat"/>
+          <w:p>
+            <w:pPr>
+              <w:jc w:val="center"/>
+            </w:pPr>
+            <w:pPr>
+              <w:jc w:val="left"/>
+              <w:spacing w:before="200"/>
+              <w:pStyle w:val="ImageCaption"/>
+            </w:pPr>
+            <w:r>
+              <w:t xml:space="preserve">Table 7: Class enumeration in the pooled sample and stratified by sex.</w:t>
+            </w:r>
+          </w:p>
+          <w:tbl>
+            <w:tblPr>
+              <w:tblStyle w:val="Table"/>
+              <w:tblW w:type="pct" w:w="5000"/>
+              <w:tblLayout w:type="fixed"/>
+              <w:tblLook w:firstRow="1" w:lastRow="0" w:firstColumn="0" w:lastColumn="0" w:noHBand="0" w:noVBand="0" w:val="0020"/>
+            </w:tblPr>
+            <w:tblGrid>
+              <w:gridCol w:w="792"/>
+              <w:gridCol w:w="339"/>
+              <w:gridCol w:w="1131"/>
+              <w:gridCol w:w="678"/>
+              <w:gridCol w:w="678"/>
+              <w:gridCol w:w="905"/>
+              <w:gridCol w:w="3394"/>
+            </w:tblGrid>
+            <w:tr>
+              <w:trPr>
+                <w:tblHeader w:val="on"/>
+              </w:trPr>
+              <w:tc>
+                <w:tcPr/>
+                <w:p>
+                  <w:pPr>
+                    <w:pStyle w:val="Compact"/>
+                    <w:jc w:val="left"/>
+                    <w:jc w:val="center"/>
+                  </w:pPr>
+                  <w:r>
+                    <w:t xml:space="preserve">Sample</w:t>
+                  </w:r>
+                </w:p>
+              </w:tc>
+              <w:tc>
+                <w:tcPr/>
+                <w:p>
+                  <w:pPr>
+                    <w:pStyle w:val="Compact"/>
+                    <w:jc w:val="right"/>
+                    <w:jc w:val="center"/>
+                  </w:pPr>
+                  <w:r>
+                    <w:t xml:space="preserve">K</w:t>
+                  </w:r>
+                </w:p>
+              </w:tc>
+              <w:tc>
+                <w:tcPr/>
+                <w:p>
+                  <w:pPr>
+                    <w:pStyle w:val="Compact"/>
+                    <w:jc w:val="right"/>
+                    <w:jc w:val="center"/>
+                  </w:pPr>
+                  <w:r>
+                    <w:t xml:space="preserve">Converged</w:t>
+                  </w:r>
+                </w:p>
+              </w:tc>
+              <w:tc>
+                <w:tcPr/>
+                <w:p>
+                  <w:pPr>
+                    <w:pStyle w:val="Compact"/>
+                    <w:jc w:val="right"/>
+                    <w:jc w:val="center"/>
+                  </w:pPr>
+                  <w:r>
+                    <w:t xml:space="preserve">BIC</w:t>
+                  </w:r>
+                </w:p>
+              </w:tc>
+              <w:tc>
+                <w:tcPr/>
+                <w:p>
+                  <w:pPr>
+                    <w:pStyle w:val="Compact"/>
+                    <w:jc w:val="right"/>
+                    <w:jc w:val="center"/>
+                  </w:pPr>
+                  <w:r>
+                    <w:t xml:space="preserve">SABIC</w:t>
+                  </w:r>
+                </w:p>
+              </w:tc>
+              <w:tc>
+                <w:tcPr/>
+                <w:p>
+                  <w:pPr>
+                    <w:pStyle w:val="Compact"/>
+                    <w:jc w:val="right"/>
+                    <w:jc w:val="center"/>
+                  </w:pPr>
+                  <w:r>
+                    <w:t xml:space="preserve">Entropy</w:t>
+                  </w:r>
+                </w:p>
+              </w:tc>
+              <w:tc>
+                <w:tcPr/>
+                <w:p>
+                  <w:pPr>
+                    <w:pStyle w:val="Compact"/>
+                    <w:jc w:val="right"/>
+                    <w:jc w:val="center"/>
+                  </w:pPr>
+                  <w:r>
+                    <w:t xml:space="preserve">Class % (largest → smallest)</w:t>
+                  </w:r>
+                </w:p>
+              </w:tc>
+            </w:tr>
+            <w:tr>
+              <w:tc>
+                <w:tcPr/>
+                <w:p>
+                  <w:pPr>
+                    <w:pStyle w:val="Compact"/>
+                    <w:jc w:val="left"/>
+                    <w:jc w:val="center"/>
+                  </w:pPr>
+                  <w:r>
+                    <w:t xml:space="preserve">Boys</w:t>
+                  </w:r>
+                </w:p>
+              </w:tc>
+              <w:tc>
+                <w:tcPr/>
+                <w:p>
+                  <w:pPr>
+                    <w:pStyle w:val="Compact"/>
+                    <w:jc w:val="right"/>
+                    <w:jc w:val="center"/>
+                  </w:pPr>
+                  <w:r>
+                    <w:t xml:space="preserve">1</w:t>
+                  </w:r>
+                </w:p>
+              </w:tc>
+              <w:tc>
+                <w:tcPr/>
+                <w:p>
+                  <w:pPr>
+                    <w:pStyle w:val="Compact"/>
+                    <w:jc w:val="right"/>
+                    <w:jc w:val="center"/>
+                  </w:pPr>
+                  <w:r>
+                    <w:t xml:space="preserve">Yes</w:t>
+                  </w:r>
+                </w:p>
+              </w:tc>
+              <w:tc>
+                <w:tcPr/>
+                <w:p>
+                  <w:pPr>
+                    <w:pStyle w:val="Compact"/>
+                    <w:jc w:val="right"/>
+                    <w:jc w:val="center"/>
+                  </w:pPr>
+                  <w:r>
+                    <w:t xml:space="preserve">30310</w:t>
+                  </w:r>
+                </w:p>
+              </w:tc>
+              <w:tc>
+                <w:tcPr/>
+                <w:p>
+                  <w:pPr>
+                    <w:pStyle w:val="Compact"/>
+                    <w:jc w:val="right"/>
+                    <w:jc w:val="center"/>
+                  </w:pPr>
+                  <w:r>
+                    <w:t xml:space="preserve">30301</w:t>
+                  </w:r>
+                </w:p>
+              </w:tc>
+              <w:tc>
+                <w:tcPr/>
+                <w:p>
+                  <w:pPr>
+                    <w:pStyle w:val="Compact"/>
+                    <w:jc w:val="right"/>
+                    <w:jc w:val="center"/>
+                  </w:pPr>
+                  <w:r>
+                    <w:t xml:space="preserve">—</w:t>
+                  </w:r>
+                </w:p>
+              </w:tc>
+              <w:tc>
+                <w:tcPr/>
+                <w:p>
+                  <w:pPr>
+                    <w:pStyle w:val="Compact"/>
+                    <w:jc w:val="right"/>
+                    <w:jc w:val="center"/>
+                  </w:pPr>
+                  <w:r>
+                    <w:t xml:space="preserve">100.0</w:t>
+                  </w:r>
+                </w:p>
+              </w:tc>
+            </w:tr>
+            <w:tr>
+              <w:tc>
+                <w:tcPr/>
+                <w:p>
+                  <w:pPr>
+                    <w:pStyle w:val="Compact"/>
+                    <w:jc w:val="left"/>
+                    <w:jc w:val="center"/>
+                  </w:pPr>
+                  <w:r>
+                    <w:t xml:space="preserve">Boys</w:t>
+                  </w:r>
+                </w:p>
+              </w:tc>
+              <w:tc>
+                <w:tcPr/>
+                <w:p>
+                  <w:pPr>
+                    <w:pStyle w:val="Compact"/>
+                    <w:jc w:val="right"/>
+                    <w:jc w:val="center"/>
+                  </w:pPr>
+                  <w:r>
+                    <w:t xml:space="preserve">2</w:t>
+                  </w:r>
+                </w:p>
+              </w:tc>
+              <w:tc>
+                <w:tcPr/>
+                <w:p>
+                  <w:pPr>
+                    <w:pStyle w:val="Compact"/>
+                    <w:jc w:val="right"/>
+                    <w:jc w:val="center"/>
+                  </w:pPr>
+                  <w:r>
+                    <w:t xml:space="preserve">Yes</w:t>
+                  </w:r>
+                </w:p>
+              </w:tc>
+              <w:tc>
+                <w:tcPr/>
+                <w:p>
+                  <w:pPr>
+                    <w:pStyle w:val="Compact"/>
+                    <w:jc w:val="right"/>
+                    <w:jc w:val="center"/>
+                  </w:pPr>
+                  <w:r>
+                    <w:t xml:space="preserve">28904</w:t>
+                  </w:r>
+                </w:p>
+              </w:tc>
+              <w:tc>
+                <w:tcPr/>
+                <w:p>
+                  <w:pPr>
+                    <w:pStyle w:val="Compact"/>
+                    <w:jc w:val="right"/>
+                    <w:jc w:val="center"/>
+                  </w:pPr>
+                  <w:r>
+                    <w:t xml:space="preserve">28885</w:t>
+                  </w:r>
+                </w:p>
+              </w:tc>
+              <w:tc>
+                <w:tcPr/>
+                <w:p>
+                  <w:pPr>
+                    <w:pStyle w:val="Compact"/>
+                    <w:jc w:val="right"/>
+                    <w:jc w:val="center"/>
+                  </w:pPr>
+                  <w:r>
+                    <w:t xml:space="preserve">0.78</w:t>
+                  </w:r>
+                </w:p>
+              </w:tc>
+              <w:tc>
+                <w:tcPr/>
+                <w:p>
+                  <w:pPr>
+                    <w:pStyle w:val="Compact"/>
+                    <w:jc w:val="right"/>
+                    <w:jc w:val="center"/>
+                  </w:pPr>
+                  <w:r>
+                    <w:t xml:space="preserve">85.6 / 14.4</w:t>
+                  </w:r>
+                </w:p>
+              </w:tc>
+            </w:tr>
+            <w:tr>
+              <w:tc>
+                <w:tcPr/>
+                <w:p>
+                  <w:pPr>
+                    <w:pStyle w:val="Compact"/>
+                    <w:jc w:val="left"/>
+                    <w:jc w:val="center"/>
+                  </w:pPr>
+                  <w:r>
+                    <w:t xml:space="preserve">Boys</w:t>
+                  </w:r>
+                </w:p>
+              </w:tc>
+              <w:tc>
+                <w:tcPr/>
+                <w:p>
+                  <w:pPr>
+                    <w:pStyle w:val="Compact"/>
+                    <w:jc w:val="right"/>
+                    <w:jc w:val="center"/>
+                  </w:pPr>
+                  <w:r>
+                    <w:t xml:space="preserve">3</w:t>
+                  </w:r>
+                </w:p>
+              </w:tc>
+              <w:tc>
+                <w:tcPr/>
+                <w:p>
+                  <w:pPr>
+                    <w:pStyle w:val="Compact"/>
+                    <w:jc w:val="right"/>
+                    <w:jc w:val="center"/>
+                  </w:pPr>
+                  <w:r>
+                    <w:t xml:space="preserve">Yes</w:t>
+                  </w:r>
+                </w:p>
+              </w:tc>
+              <w:tc>
+                <w:tcPr/>
+                <w:p>
+                  <w:pPr>
+                    <w:pStyle w:val="Compact"/>
+                    <w:jc w:val="right"/>
+                    <w:jc w:val="center"/>
+                  </w:pPr>
+                  <w:r>
+                    <w:t xml:space="preserve">28485</w:t>
+                  </w:r>
+                </w:p>
+              </w:tc>
+              <w:tc>
+                <w:tcPr/>
+                <w:p>
+                  <w:pPr>
+                    <w:pStyle w:val="Compact"/>
+                    <w:jc w:val="right"/>
+                    <w:jc w:val="center"/>
+                  </w:pPr>
+                  <w:r>
+                    <w:t xml:space="preserve">28456</w:t>
+                  </w:r>
+                </w:p>
+              </w:tc>
+              <w:tc>
+                <w:tcPr/>
+                <w:p>
+                  <w:pPr>
+                    <w:pStyle w:val="Compact"/>
+                    <w:jc w:val="right"/>
+                    <w:jc w:val="center"/>
+                  </w:pPr>
+                  <w:r>
+                    <w:t xml:space="preserve">0.85</w:t>
+                  </w:r>
+                </w:p>
+              </w:tc>
+              <w:tc>
+                <w:tcPr/>
+                <w:p>
+                  <w:pPr>
+                    <w:pStyle w:val="Compact"/>
+                    <w:jc w:val="right"/>
+                    <w:jc w:val="center"/>
+                  </w:pPr>
+                  <w:r>
+                    <w:t xml:space="preserve">83.8 / 12.6 / 3.5</w:t>
+                  </w:r>
+                </w:p>
+              </w:tc>
+            </w:tr>
+            <w:tr>
+              <w:tc>
+                <w:tcPr/>
+                <w:p>
+                  <w:pPr>
+                    <w:pStyle w:val="Compact"/>
+                    <w:jc w:val="left"/>
+                    <w:jc w:val="center"/>
+                  </w:pPr>
+                  <w:r>
+                    <w:t xml:space="preserve">Boys</w:t>
+                  </w:r>
+                </w:p>
+              </w:tc>
+              <w:tc>
+                <w:tcPr/>
+                <w:p>
+                  <w:pPr>
+                    <w:pStyle w:val="Compact"/>
+                    <w:jc w:val="right"/>
+                    <w:jc w:val="center"/>
+                  </w:pPr>
+                  <w:r>
+                    <w:t xml:space="preserve">4</w:t>
+                  </w:r>
+                </w:p>
+              </w:tc>
+              <w:tc>
+                <w:tcPr/>
+                <w:p>
+                  <w:pPr>
+                    <w:pStyle w:val="Compact"/>
+                    <w:jc w:val="right"/>
+                    <w:jc w:val="center"/>
+                  </w:pPr>
+                  <w:r>
+                    <w:t xml:space="preserve">Yes</w:t>
+                  </w:r>
+                </w:p>
+              </w:tc>
+              <w:tc>
+                <w:tcPr/>
+                <w:p>
+                  <w:pPr>
+                    <w:pStyle w:val="Compact"/>
+                    <w:jc w:val="right"/>
+                    <w:jc w:val="center"/>
+                  </w:pPr>
+                  <w:r>
+                    <w:t xml:space="preserve">28236</w:t>
+                  </w:r>
+                </w:p>
+              </w:tc>
+              <w:tc>
+                <w:tcPr/>
+                <w:p>
+                  <w:pPr>
+                    <w:pStyle w:val="Compact"/>
+                    <w:jc w:val="right"/>
+                    <w:jc w:val="center"/>
+                  </w:pPr>
+                  <w:r>
+                    <w:t xml:space="preserve">28198</w:t>
+                  </w:r>
+                </w:p>
+              </w:tc>
+              <w:tc>
+                <w:tcPr/>
+                <w:p>
+                  <w:pPr>
+                    <w:pStyle w:val="Compact"/>
+                    <w:jc w:val="right"/>
+                    <w:jc w:val="center"/>
+                  </w:pPr>
+                  <w:r>
+                    <w:t xml:space="preserve">0.82</w:t>
+                  </w:r>
+                </w:p>
+              </w:tc>
+              <w:tc>
+                <w:tcPr/>
+                <w:p>
+                  <w:pPr>
+                    <w:pStyle w:val="Compact"/>
+                    <w:jc w:val="right"/>
+                    <w:jc w:val="center"/>
+                  </w:pPr>
+                  <w:r>
+                    <w:t xml:space="preserve">74.8 / 20.6 / 2.9 / 1.7</w:t>
+                  </w:r>
+                </w:p>
+              </w:tc>
+            </w:tr>
+            <w:tr>
+              <w:tc>
+                <w:tcPr/>
+                <w:p>
+                  <w:pPr>
+                    <w:pStyle w:val="Compact"/>
+                    <w:jc w:val="left"/>
+                    <w:jc w:val="center"/>
+                  </w:pPr>
+                  <w:r>
+                    <w:t xml:space="preserve">Boys</w:t>
+                  </w:r>
+                </w:p>
+              </w:tc>
+              <w:tc>
+                <w:tcPr/>
+                <w:p>
+                  <w:pPr>
+                    <w:pStyle w:val="Compact"/>
+                    <w:jc w:val="right"/>
+                    <w:jc w:val="center"/>
+                  </w:pPr>
+                  <w:r>
+                    <w:t xml:space="preserve">5</w:t>
+                  </w:r>
+                </w:p>
+              </w:tc>
+              <w:tc>
+                <w:tcPr/>
+                <w:p>
+                  <w:pPr>
+                    <w:pStyle w:val="Compact"/>
+                    <w:jc w:val="right"/>
+                    <w:jc w:val="center"/>
+                  </w:pPr>
+                  <w:r>
+                    <w:t xml:space="preserve">Yes</w:t>
+                  </w:r>
+                </w:p>
+              </w:tc>
+              <w:tc>
+                <w:tcPr/>
+                <w:p>
+                  <w:pPr>
+                    <w:pStyle w:val="Compact"/>
+                    <w:jc w:val="right"/>
+                    <w:jc w:val="center"/>
+                  </w:pPr>
+                  <w:r>
+                    <w:t xml:space="preserve">28130</w:t>
+                  </w:r>
+                </w:p>
+              </w:tc>
+              <w:tc>
+                <w:tcPr/>
+                <w:p>
+                  <w:pPr>
+                    <w:pStyle w:val="Compact"/>
+                    <w:jc w:val="right"/>
+                    <w:jc w:val="center"/>
+                  </w:pPr>
+                  <w:r>
+                    <w:t xml:space="preserve">28083</w:t>
+                  </w:r>
+                </w:p>
+              </w:tc>
+              <w:tc>
+                <w:tcPr/>
+                <w:p>
+                  <w:pPr>
+                    <w:pStyle w:val="Compact"/>
+                    <w:jc w:val="right"/>
+                    <w:jc w:val="center"/>
+                  </w:pPr>
+                  <w:r>
+                    <w:t xml:space="preserve">0.80</w:t>
+                  </w:r>
+                </w:p>
+              </w:tc>
+              <w:tc>
+                <w:tcPr/>
+                <w:p>
+                  <w:pPr>
+                    <w:pStyle w:val="Compact"/>
+                    <w:jc w:val="right"/>
+                    <w:jc w:val="center"/>
+                  </w:pPr>
+                  <w:r>
+                    <w:t xml:space="preserve">75.7 / 11.7 / 7.2 / 3.5 / 1.8</w:t>
+                  </w:r>
+                </w:p>
+              </w:tc>
+            </w:tr>
+            <w:tr>
+              <w:tc>
+                <w:tcPr/>
+                <w:p>
+                  <w:pPr>
+                    <w:pStyle w:val="Compact"/>
+                    <w:jc w:val="left"/>
+                    <w:jc w:val="center"/>
+                  </w:pPr>
+                  <w:r>
+                    <w:t xml:space="preserve">Girls</w:t>
+                  </w:r>
+                </w:p>
+              </w:tc>
+              <w:tc>
+                <w:tcPr/>
+                <w:p>
+                  <w:pPr>
+                    <w:pStyle w:val="Compact"/>
+                    <w:jc w:val="right"/>
+                    <w:jc w:val="center"/>
+                  </w:pPr>
+                  <w:r>
+                    <w:t xml:space="preserve">1</w:t>
+                  </w:r>
+                </w:p>
+              </w:tc>
+              <w:tc>
+                <w:tcPr/>
+                <w:p>
+                  <w:pPr>
+                    <w:pStyle w:val="Compact"/>
+                    <w:jc w:val="right"/>
+                    <w:jc w:val="center"/>
+                  </w:pPr>
+                  <w:r>
+                    <w:t xml:space="preserve">Yes</w:t>
+                  </w:r>
+                </w:p>
+              </w:tc>
+              <w:tc>
+                <w:tcPr/>
+                <w:p>
+                  <w:pPr>
+                    <w:pStyle w:val="Compact"/>
+                    <w:jc w:val="right"/>
+                    <w:jc w:val="center"/>
+                  </w:pPr>
+                  <w:r>
+                    <w:t xml:space="preserve">28094</w:t>
+                  </w:r>
+                </w:p>
+              </w:tc>
+              <w:tc>
+                <w:tcPr/>
+                <w:p>
+                  <w:pPr>
+                    <w:pStyle w:val="Compact"/>
+                    <w:jc w:val="right"/>
+                    <w:jc w:val="center"/>
+                  </w:pPr>
+                  <w:r>
+                    <w:t xml:space="preserve">28084</w:t>
+                  </w:r>
+                </w:p>
+              </w:tc>
+              <w:tc>
+                <w:tcPr/>
+                <w:p>
+                  <w:pPr>
+                    <w:pStyle w:val="Compact"/>
+                    <w:jc w:val="right"/>
+                    <w:jc w:val="center"/>
+                  </w:pPr>
+                  <w:r>
+                    <w:t xml:space="preserve">—</w:t>
+                  </w:r>
+                </w:p>
+              </w:tc>
+              <w:tc>
+                <w:tcPr/>
+                <w:p>
+                  <w:pPr>
+                    <w:pStyle w:val="Compact"/>
+                    <w:jc w:val="right"/>
+                    <w:jc w:val="center"/>
+                  </w:pPr>
+                  <w:r>
+                    <w:t xml:space="preserve">100.0</w:t>
+                  </w:r>
+                </w:p>
+              </w:tc>
+            </w:tr>
+            <w:tr>
+              <w:tc>
+                <w:tcPr/>
+                <w:p>
+                  <w:pPr>
+                    <w:pStyle w:val="Compact"/>
+                    <w:jc w:val="left"/>
+                    <w:jc w:val="center"/>
+                  </w:pPr>
+                  <w:r>
+                    <w:t xml:space="preserve">Girls</w:t>
+                  </w:r>
+                </w:p>
+              </w:tc>
+              <w:tc>
+                <w:tcPr/>
+                <w:p>
+                  <w:pPr>
+                    <w:pStyle w:val="Compact"/>
+                    <w:jc w:val="right"/>
+                    <w:jc w:val="center"/>
+                  </w:pPr>
+                  <w:r>
+                    <w:t xml:space="preserve">2</w:t>
+                  </w:r>
+                </w:p>
+              </w:tc>
+              <w:tc>
+                <w:tcPr/>
+                <w:p>
+                  <w:pPr>
+                    <w:pStyle w:val="Compact"/>
+                    <w:jc w:val="right"/>
+                    <w:jc w:val="center"/>
+                  </w:pPr>
+                  <w:r>
+                    <w:t xml:space="preserve">Yes</w:t>
+                  </w:r>
+                </w:p>
+              </w:tc>
+              <w:tc>
+                <w:tcPr/>
+                <w:p>
+                  <w:pPr>
+                    <w:pStyle w:val="Compact"/>
+                    <w:jc w:val="right"/>
+                    <w:jc w:val="center"/>
+                  </w:pPr>
+                  <w:r>
+                    <w:t xml:space="preserve">26677</w:t>
+                  </w:r>
+                </w:p>
+              </w:tc>
+              <w:tc>
+                <w:tcPr/>
+                <w:p>
+                  <w:pPr>
+                    <w:pStyle w:val="Compact"/>
+                    <w:jc w:val="right"/>
+                    <w:jc w:val="center"/>
+                  </w:pPr>
+                  <w:r>
+                    <w:t xml:space="preserve">26658</w:t>
+                  </w:r>
+                </w:p>
+              </w:tc>
+              <w:tc>
+                <w:tcPr/>
+                <w:p>
+                  <w:pPr>
+                    <w:pStyle w:val="Compact"/>
+                    <w:jc w:val="right"/>
+                    <w:jc w:val="center"/>
+                  </w:pPr>
+                  <w:r>
+                    <w:t xml:space="preserve">0.76</w:t>
+                  </w:r>
+                </w:p>
+              </w:tc>
+              <w:tc>
+                <w:tcPr/>
+                <w:p>
+                  <w:pPr>
+                    <w:pStyle w:val="Compact"/>
+                    <w:jc w:val="right"/>
+                    <w:jc w:val="center"/>
+                  </w:pPr>
+                  <w:r>
+                    <w:t xml:space="preserve">84.7 / 15.3</w:t>
+                  </w:r>
+                </w:p>
+              </w:tc>
+            </w:tr>
+            <w:tr>
+              <w:tc>
+                <w:tcPr/>
+                <w:p>
+                  <w:pPr>
+                    <w:pStyle w:val="Compact"/>
+                    <w:jc w:val="left"/>
+                    <w:jc w:val="center"/>
+                  </w:pPr>
+                  <w:r>
+                    <w:t xml:space="preserve">Girls</w:t>
+                  </w:r>
+                </w:p>
+              </w:tc>
+              <w:tc>
+                <w:tcPr/>
+                <w:p>
+                  <w:pPr>
+                    <w:pStyle w:val="Compact"/>
+                    <w:jc w:val="right"/>
+                    <w:jc w:val="center"/>
+                  </w:pPr>
+                  <w:r>
+                    <w:t xml:space="preserve">3</w:t>
+                  </w:r>
+                </w:p>
+              </w:tc>
+              <w:tc>
+                <w:tcPr/>
+                <w:p>
+                  <w:pPr>
+                    <w:pStyle w:val="Compact"/>
+                    <w:jc w:val="right"/>
+                    <w:jc w:val="center"/>
+                  </w:pPr>
+                  <w:r>
+                    <w:t xml:space="preserve">Yes</w:t>
+                  </w:r>
+                </w:p>
+              </w:tc>
+              <w:tc>
+                <w:tcPr/>
+                <w:p>
+                  <w:pPr>
+                    <w:pStyle w:val="Compact"/>
+                    <w:jc w:val="right"/>
+                    <w:jc w:val="center"/>
+                  </w:pPr>
+                  <w:r>
+                    <w:t xml:space="preserve">26370</w:t>
+                  </w:r>
+                </w:p>
+              </w:tc>
+              <w:tc>
+                <w:tcPr/>
+                <w:p>
+                  <w:pPr>
+                    <w:pStyle w:val="Compact"/>
+                    <w:jc w:val="right"/>
+                    <w:jc w:val="center"/>
+                  </w:pPr>
+                  <w:r>
+                    <w:t xml:space="preserve">26342</w:t>
+                  </w:r>
+                </w:p>
+              </w:tc>
+              <w:tc>
+                <w:tcPr/>
+                <w:p>
+                  <w:pPr>
+                    <w:pStyle w:val="Compact"/>
+                    <w:jc w:val="right"/>
+                    <w:jc w:val="center"/>
+                  </w:pPr>
+                  <w:r>
+                    <w:t xml:space="preserve">0.85</w:t>
+                  </w:r>
+                </w:p>
+              </w:tc>
+              <w:tc>
+                <w:tcPr/>
+                <w:p>
+                  <w:pPr>
+                    <w:pStyle w:val="Compact"/>
+                    <w:jc w:val="right"/>
+                    <w:jc w:val="center"/>
+                  </w:pPr>
+                  <w:r>
+                    <w:t xml:space="preserve">83.7 / 14.3 / 2.0</w:t>
+                  </w:r>
+                </w:p>
+              </w:tc>
+            </w:tr>
+            <w:tr>
+              <w:tc>
+                <w:tcPr/>
+                <w:p>
+                  <w:pPr>
+                    <w:pStyle w:val="Compact"/>
+                    <w:jc w:val="left"/>
+                    <w:jc w:val="center"/>
+                  </w:pPr>
+                  <w:r>
+                    <w:t xml:space="preserve">Girls</w:t>
+                  </w:r>
+                </w:p>
+              </w:tc>
+              <w:tc>
+                <w:tcPr/>
+                <w:p>
+                  <w:pPr>
+                    <w:pStyle w:val="Compact"/>
+                    <w:jc w:val="right"/>
+                    <w:jc w:val="center"/>
+                  </w:pPr>
+                  <w:r>
+                    <w:t xml:space="preserve">4</w:t>
+                  </w:r>
+                </w:p>
+              </w:tc>
+              <w:tc>
+                <w:tcPr/>
+                <w:p>
+                  <w:pPr>
+                    <w:pStyle w:val="Compact"/>
+                    <w:jc w:val="right"/>
+                    <w:jc w:val="center"/>
+                  </w:pPr>
+                  <w:r>
+                    <w:t xml:space="preserve">Yes</w:t>
+                  </w:r>
+                </w:p>
+              </w:tc>
+              <w:tc>
+                <w:tcPr/>
+                <w:p>
+                  <w:pPr>
+                    <w:pStyle w:val="Compact"/>
+                    <w:jc w:val="right"/>
+                    <w:jc w:val="center"/>
+                  </w:pPr>
+                  <w:r>
+                    <w:t xml:space="preserve">26092</w:t>
+                  </w:r>
+                </w:p>
+              </w:tc>
+              <w:tc>
+                <w:tcPr/>
+                <w:p>
+                  <w:pPr>
+                    <w:pStyle w:val="Compact"/>
+                    <w:jc w:val="right"/>
+                    <w:jc w:val="center"/>
+                  </w:pPr>
+                  <w:r>
+                    <w:t xml:space="preserve">26054</w:t>
+                  </w:r>
+                </w:p>
+              </w:tc>
+              <w:tc>
+                <w:tcPr/>
+                <w:p>
+                  <w:pPr>
+                    <w:pStyle w:val="Compact"/>
+                    <w:jc w:val="right"/>
+                    <w:jc w:val="center"/>
+                  </w:pPr>
+                  <w:r>
+                    <w:t xml:space="preserve">0.81</w:t>
+                  </w:r>
+                </w:p>
+              </w:tc>
+              <w:tc>
+                <w:tcPr/>
+                <w:p>
+                  <w:pPr>
+                    <w:pStyle w:val="Compact"/>
+                    <w:jc w:val="right"/>
+                    <w:jc w:val="center"/>
+                  </w:pPr>
+                  <w:r>
+                    <w:t xml:space="preserve">73.2 / 20.9 / 4.0 / 2.0</w:t>
+                  </w:r>
+                </w:p>
+              </w:tc>
+            </w:tr>
+            <w:tr>
+              <w:tc>
+                <w:tcPr/>
+                <w:p>
+                  <w:pPr>
+                    <w:pStyle w:val="Compact"/>
+                    <w:jc w:val="left"/>
+                    <w:jc w:val="center"/>
+                  </w:pPr>
+                  <w:r>
+                    <w:t xml:space="preserve">Girls</w:t>
+                  </w:r>
+                </w:p>
+              </w:tc>
+              <w:tc>
+                <w:tcPr/>
+                <w:p>
+                  <w:pPr>
+                    <w:pStyle w:val="Compact"/>
+                    <w:jc w:val="right"/>
+                    <w:jc w:val="center"/>
+                  </w:pPr>
+                  <w:r>
+                    <w:t xml:space="preserve">5</w:t>
+                  </w:r>
+                </w:p>
+              </w:tc>
+              <w:tc>
+                <w:tcPr/>
+                <w:p>
+                  <w:pPr>
+                    <w:pStyle w:val="Compact"/>
+                    <w:jc w:val="right"/>
+                    <w:jc w:val="center"/>
+                  </w:pPr>
+                  <w:r>
+                    <w:t xml:space="preserve">Yes</w:t>
+                  </w:r>
+                </w:p>
+              </w:tc>
+              <w:tc>
+                <w:tcPr/>
+                <w:p>
+                  <w:pPr>
+                    <w:pStyle w:val="Compact"/>
+                    <w:jc w:val="right"/>
+                    <w:jc w:val="center"/>
+                  </w:pPr>
+                  <w:r>
+                    <w:t xml:space="preserve">25882</w:t>
+                  </w:r>
+                </w:p>
+              </w:tc>
+              <w:tc>
+                <w:tcPr/>
+                <w:p>
+                  <w:pPr>
+                    <w:pStyle w:val="Compact"/>
+                    <w:jc w:val="right"/>
+                    <w:jc w:val="center"/>
+                  </w:pPr>
+                  <w:r>
+                    <w:t xml:space="preserve">25834</w:t>
+                  </w:r>
+                </w:p>
+              </w:tc>
+              <w:tc>
+                <w:tcPr/>
+                <w:p>
+                  <w:pPr>
+                    <w:pStyle w:val="Compact"/>
+                    <w:jc w:val="right"/>
+                    <w:jc w:val="center"/>
+                  </w:pPr>
+                  <w:r>
+                    <w:t xml:space="preserve">0.80</w:t>
+                  </w:r>
+                </w:p>
+              </w:tc>
+              <w:tc>
+                <w:tcPr/>
+                <w:p>
+                  <w:pPr>
+                    <w:pStyle w:val="Compact"/>
+                    <w:jc w:val="right"/>
+                    <w:jc w:val="center"/>
+                  </w:pPr>
+                  <w:r>
+                    <w:t xml:space="preserve">69.9 / 22.3 / 3.5 / 2.3 / 2.0</w:t>
+                  </w:r>
+                </w:p>
+              </w:tc>
+            </w:tr>
+            <w:tr>
+              <w:tc>
+                <w:tcPr/>
+                <w:p>
+                  <w:pPr>
+                    <w:pStyle w:val="Compact"/>
+                    <w:jc w:val="left"/>
+                    <w:jc w:val="center"/>
+                  </w:pPr>
+                  <w:r>
+                    <w:t xml:space="preserve">Pooled</w:t>
+                  </w:r>
+                </w:p>
+              </w:tc>
+              <w:tc>
+                <w:tcPr/>
+                <w:p>
+                  <w:pPr>
+                    <w:pStyle w:val="Compact"/>
+                    <w:jc w:val="right"/>
+                    <w:jc w:val="center"/>
+                  </w:pPr>
+                  <w:r>
+                    <w:t xml:space="preserve">1</w:t>
+                  </w:r>
+                </w:p>
+              </w:tc>
+              <w:tc>
+                <w:tcPr/>
+                <w:p>
+                  <w:pPr>
+                    <w:pStyle w:val="Compact"/>
+                    <w:jc w:val="right"/>
+                    <w:jc w:val="center"/>
+                  </w:pPr>
+                  <w:r>
+                    <w:t xml:space="preserve">Yes</w:t>
+                  </w:r>
+                </w:p>
+              </w:tc>
+              <w:tc>
+                <w:tcPr/>
+                <w:p>
+                  <w:pPr>
+                    <w:pStyle w:val="Compact"/>
+                    <w:jc w:val="right"/>
+                    <w:jc w:val="center"/>
+                  </w:pPr>
+                  <w:r>
+                    <w:t xml:space="preserve">58496</w:t>
+                  </w:r>
+                </w:p>
+              </w:tc>
+              <w:tc>
+                <w:tcPr/>
+                <w:p>
+                  <w:pPr>
+                    <w:pStyle w:val="Compact"/>
+                    <w:jc w:val="right"/>
+                    <w:jc w:val="center"/>
+                  </w:pPr>
+                  <w:r>
+                    <w:t xml:space="preserve">58487</w:t>
+                  </w:r>
+                </w:p>
+              </w:tc>
+              <w:tc>
+                <w:tcPr/>
+                <w:p>
+                  <w:pPr>
+                    <w:pStyle w:val="Compact"/>
+                    <w:jc w:val="right"/>
+                    <w:jc w:val="center"/>
+                  </w:pPr>
+                  <w:r>
+                    <w:t xml:space="preserve">—</w:t>
+                  </w:r>
+                </w:p>
+              </w:tc>
+              <w:tc>
+                <w:tcPr/>
+                <w:p>
+                  <w:pPr>
+                    <w:pStyle w:val="Compact"/>
+                    <w:jc w:val="right"/>
+                    <w:jc w:val="center"/>
+                  </w:pPr>
+                  <w:r>
+                    <w:t xml:space="preserve">100.0</w:t>
+                  </w:r>
+                </w:p>
+              </w:tc>
+            </w:tr>
+            <w:tr>
+              <w:tc>
+                <w:tcPr/>
+                <w:p>
+                  <w:pPr>
+                    <w:pStyle w:val="Compact"/>
+                    <w:jc w:val="left"/>
+                    <w:jc w:val="center"/>
+                  </w:pPr>
+                  <w:r>
+                    <w:t xml:space="preserve">Pooled</w:t>
+                  </w:r>
+                </w:p>
+              </w:tc>
+              <w:tc>
+                <w:tcPr/>
+                <w:p>
+                  <w:pPr>
+                    <w:pStyle w:val="Compact"/>
+                    <w:jc w:val="right"/>
+                    <w:jc w:val="center"/>
+                  </w:pPr>
+                  <w:r>
+                    <w:t xml:space="preserve">2</w:t>
+                  </w:r>
+                </w:p>
+              </w:tc>
+              <w:tc>
+                <w:tcPr/>
+                <w:p>
+                  <w:pPr>
+                    <w:pStyle w:val="Compact"/>
+                    <w:jc w:val="right"/>
+                    <w:jc w:val="center"/>
+                  </w:pPr>
+                  <w:r>
+                    <w:t xml:space="preserve">Yes</w:t>
+                  </w:r>
+                </w:p>
+              </w:tc>
+              <w:tc>
+                <w:tcPr/>
+                <w:p>
+                  <w:pPr>
+                    <w:pStyle w:val="Compact"/>
+                    <w:jc w:val="right"/>
+                    <w:jc w:val="center"/>
+                  </w:pPr>
+                  <w:r>
+                    <w:t xml:space="preserve">55664</w:t>
+                  </w:r>
+                </w:p>
+              </w:tc>
+              <w:tc>
+                <w:tcPr/>
+                <w:p>
+                  <w:pPr>
+                    <w:pStyle w:val="Compact"/>
+                    <w:jc w:val="right"/>
+                    <w:jc w:val="center"/>
+                  </w:pPr>
+                  <w:r>
+                    <w:t xml:space="preserve">55645</w:t>
+                  </w:r>
+                </w:p>
+              </w:tc>
+              <w:tc>
+                <w:tcPr/>
+                <w:p>
+                  <w:pPr>
+                    <w:pStyle w:val="Compact"/>
+                    <w:jc w:val="right"/>
+                    <w:jc w:val="center"/>
+                  </w:pPr>
+                  <w:r>
+                    <w:t xml:space="preserve">0.77</w:t>
+                  </w:r>
+                </w:p>
+              </w:tc>
+              <w:tc>
+                <w:tcPr/>
+                <w:p>
+                  <w:pPr>
+                    <w:pStyle w:val="Compact"/>
+                    <w:jc w:val="right"/>
+                    <w:jc w:val="center"/>
+                  </w:pPr>
+                  <w:r>
+                    <w:t xml:space="preserve">84.7 / 15.3</w:t>
+                  </w:r>
+                </w:p>
+              </w:tc>
+            </w:tr>
+            <w:tr>
+              <w:tc>
+                <w:tcPr/>
+                <w:p>
+                  <w:pPr>
+                    <w:pStyle w:val="Compact"/>
+                    <w:jc w:val="left"/>
+                    <w:jc w:val="center"/>
+                  </w:pPr>
+                  <w:r>
+                    <w:t xml:space="preserve">Pooled</w:t>
+                  </w:r>
+                </w:p>
+              </w:tc>
+              <w:tc>
+                <w:tcPr/>
+                <w:p>
+                  <w:pPr>
+                    <w:pStyle w:val="Compact"/>
+                    <w:jc w:val="right"/>
+                    <w:jc w:val="center"/>
+                  </w:pPr>
+                  <w:r>
+                    <w:t xml:space="preserve">3</w:t>
+                  </w:r>
+                </w:p>
+              </w:tc>
+              <w:tc>
+                <w:tcPr/>
+                <w:p>
+                  <w:pPr>
+                    <w:pStyle w:val="Compact"/>
+                    <w:jc w:val="right"/>
+                    <w:jc w:val="center"/>
+                  </w:pPr>
+                  <w:r>
+                    <w:t xml:space="preserve">Yes</w:t>
+                  </w:r>
+                </w:p>
+              </w:tc>
+              <w:tc>
+                <w:tcPr/>
+                <w:p>
+                  <w:pPr>
+                    <w:pStyle w:val="Compact"/>
+                    <w:jc w:val="right"/>
+                    <w:jc w:val="center"/>
+                  </w:pPr>
+                  <w:r>
+                    <w:t xml:space="preserve">54895</w:t>
+                  </w:r>
+                </w:p>
+              </w:tc>
+              <w:tc>
+                <w:tcPr/>
+                <w:p>
+                  <w:pPr>
+                    <w:pStyle w:val="Compact"/>
+                    <w:jc w:val="right"/>
+                    <w:jc w:val="center"/>
+                  </w:pPr>
+                  <w:r>
+                    <w:t xml:space="preserve">54867</w:t>
+                  </w:r>
+                </w:p>
+              </w:tc>
+              <w:tc>
+                <w:tcPr/>
+                <w:p>
+                  <w:pPr>
+                    <w:pStyle w:val="Compact"/>
+                    <w:jc w:val="right"/>
+                    <w:jc w:val="center"/>
+                  </w:pPr>
+                  <w:r>
+                    <w:t xml:space="preserve">0.85</w:t>
+                  </w:r>
+                </w:p>
+              </w:tc>
+              <w:tc>
+                <w:tcPr/>
+                <w:p>
+                  <w:pPr>
+                    <w:pStyle w:val="Compact"/>
+                    <w:jc w:val="right"/>
+                    <w:jc w:val="center"/>
+                  </w:pPr>
+                  <w:r>
+                    <w:t xml:space="preserve">83.8 / 13.5 / 2.8</w:t>
+                  </w:r>
+                </w:p>
+              </w:tc>
+            </w:tr>
+            <w:tr>
+              <w:tc>
+                <w:tcPr/>
+                <w:p>
+                  <w:pPr>
+                    <w:pStyle w:val="Compact"/>
+                    <w:jc w:val="left"/>
+                    <w:jc w:val="center"/>
+                  </w:pPr>
+                  <w:r>
+                    <w:t xml:space="preserve">Pooled</w:t>
+                  </w:r>
+                </w:p>
+              </w:tc>
+              <w:tc>
+                <w:tcPr/>
+                <w:p>
+                  <w:pPr>
+                    <w:pStyle w:val="Compact"/>
+                    <w:jc w:val="right"/>
+                    <w:jc w:val="center"/>
+                  </w:pPr>
+                  <w:r>
+                    <w:t xml:space="preserve">4</w:t>
+                  </w:r>
+                </w:p>
+              </w:tc>
+              <w:tc>
+                <w:tcPr/>
+                <w:p>
+                  <w:pPr>
+                    <w:pStyle w:val="Compact"/>
+                    <w:jc w:val="right"/>
+                    <w:jc w:val="center"/>
+                  </w:pPr>
+                  <w:r>
+                    <w:t xml:space="preserve">Yes</w:t>
+                  </w:r>
+                </w:p>
+              </w:tc>
+              <w:tc>
+                <w:tcPr/>
+                <w:p>
+                  <w:pPr>
+                    <w:pStyle w:val="Compact"/>
+                    <w:jc w:val="right"/>
+                    <w:jc w:val="center"/>
+                  </w:pPr>
+                  <w:r>
+                    <w:t xml:space="preserve">54393</w:t>
+                  </w:r>
+                </w:p>
+              </w:tc>
+              <w:tc>
+                <w:tcPr/>
+                <w:p>
+                  <w:pPr>
+                    <w:pStyle w:val="Compact"/>
+                    <w:jc w:val="right"/>
+                    <w:jc w:val="center"/>
+                  </w:pPr>
+                  <w:r>
+                    <w:t xml:space="preserve">54355</w:t>
+                  </w:r>
+                </w:p>
+              </w:tc>
+              <w:tc>
+                <w:tcPr/>
+                <w:p>
+                  <w:pPr>
+                    <w:pStyle w:val="Compact"/>
+                    <w:jc w:val="right"/>
+                    <w:jc w:val="center"/>
+                  </w:pPr>
+                  <w:r>
+                    <w:t xml:space="preserve">0.81</w:t>
+                  </w:r>
+                </w:p>
+              </w:tc>
+              <w:tc>
+                <w:tcPr/>
+                <w:p>
+                  <w:pPr>
+                    <w:pStyle w:val="Compact"/>
+                    <w:jc w:val="right"/>
+                    <w:jc w:val="center"/>
+                  </w:pPr>
+                  <w:r>
+                    <w:t xml:space="preserve">72.1 / 22.6 / 2.7 / 2.6</w:t>
+                  </w:r>
+                </w:p>
+              </w:tc>
+            </w:tr>
+            <w:tr>
+              <w:tc>
+                <w:tcPr/>
+                <w:p>
+                  <w:pPr>
+                    <w:pStyle w:val="Compact"/>
+                    <w:jc w:val="left"/>
+                    <w:jc w:val="center"/>
+                  </w:pPr>
+                  <w:r>
+                    <w:t xml:space="preserve">Pooled</w:t>
+                  </w:r>
+                </w:p>
+              </w:tc>
+              <w:tc>
+                <w:tcPr/>
+                <w:p>
+                  <w:pPr>
+                    <w:pStyle w:val="Compact"/>
+                    <w:jc w:val="right"/>
+                    <w:jc w:val="center"/>
+                  </w:pPr>
+                  <w:r>
+                    <w:t xml:space="preserve">5</w:t>
+                  </w:r>
+                </w:p>
+              </w:tc>
+              <w:tc>
+                <w:tcPr/>
+                <w:p>
+                  <w:pPr>
+                    <w:pStyle w:val="Compact"/>
+                    <w:jc w:val="right"/>
+                    <w:jc w:val="center"/>
+                  </w:pPr>
+                  <w:r>
+                    <w:t xml:space="preserve">Yes</w:t>
+                  </w:r>
+                </w:p>
+              </w:tc>
+              <w:tc>
+                <w:tcPr/>
+                <w:p>
+                  <w:pPr>
+                    <w:pStyle w:val="Compact"/>
+                    <w:jc w:val="right"/>
+                    <w:jc w:val="center"/>
+                  </w:pPr>
+                  <w:r>
+                    <w:t xml:space="preserve">54035</w:t>
+                  </w:r>
+                </w:p>
+              </w:tc>
+              <w:tc>
+                <w:tcPr/>
+                <w:p>
+                  <w:pPr>
+                    <w:pStyle w:val="Compact"/>
+                    <w:jc w:val="right"/>
+                    <w:jc w:val="center"/>
+                  </w:pPr>
+                  <w:r>
+                    <w:t xml:space="preserve">53987</w:t>
+                  </w:r>
+                </w:p>
+              </w:tc>
+              <w:tc>
+                <w:tcPr/>
+                <w:p>
+                  <w:pPr>
+                    <w:pStyle w:val="Compact"/>
+                    <w:jc w:val="right"/>
+                    <w:jc w:val="center"/>
+                  </w:pPr>
+                  <w:r>
+                    <w:t xml:space="preserve">0.81</w:t>
+                  </w:r>
+                </w:p>
+              </w:tc>
+              <w:tc>
+                <w:tcPr/>
+                <w:p>
+                  <w:pPr>
+                    <w:pStyle w:val="Compact"/>
+                    <w:jc w:val="right"/>
+                    <w:jc w:val="center"/>
+                  </w:pPr>
+                  <w:r>
+                    <w:t xml:space="preserve">72.2 / 19.1 / 4.4 / 2.8 / 1.6</w:t>
+                  </w:r>
+                </w:p>
+              </w:tc>
+            </w:tr>
+          </w:tbl>
+          <w:bookmarkEnd w:id="43"/>
+          <w:p/>
+        </w:tc>
+      </w:tr>
+    </w:tbl>
+    <w:p>
+      <w:pPr>
+        <w:pStyle w:val="CaptionedFigure"/>
+      </w:pPr>
+      <w:r>
+        <w:drawing>
+          <wp:inline>
+            <wp:extent cx="5334000" cy="4267200"/>
+            <wp:effectExtent b="0" l="0" r="0" t="0"/>
+            <wp:docPr descr="Predicted class trajectories by sample (pooled, boys, girls) and number of classes. Dashed lines: observed means within each sample." title="" id="45" name="Picture"/>
+            <a:graphic>
+              <a:graphicData uri="http://schemas.openxmlformats.org/drawingml/2006/picture">
+                <pic:pic>
+                  <pic:nvPicPr>
+                    <pic:cNvPr descr="report_files/figure-docx/plot-lcga-sex-comparison-1.png" id="46" name="Picture"/>
+                    <pic:cNvPicPr>
+                      <a:picLocks noChangeArrowheads="1" noChangeAspect="1"/>
+                    </pic:cNvPicPr>
+                  </pic:nvPicPr>
+                  <pic:blipFill>
+                    <a:blip r:embed="rId44"/>
+                    <a:stretch>
+                      <a:fillRect/>
+                    </a:stretch>
+                  </pic:blipFill>
+                  <pic:spPr bwMode="auto">
+                    <a:xfrm>
+                      <a:off x="0" y="0"/>
+                      <a:ext cx="5334000" cy="4267200"/>
+                    </a:xfrm>
+                    <a:prstGeom prst="rect">
+                      <a:avLst/>
+                    </a:prstGeom>
+                    <a:noFill/>
+                    <a:ln w="9525">
+                      <a:noFill/>
+                      <a:headEnd/>
+                      <a:tailEnd/>
+                    </a:ln>
+                  </pic:spPr>
+                </pic:pic>
+              </a:graphicData>
+            </a:graphic>
+          </wp:inline>
+        </w:drawing>
+      </w:r>
+    </w:p>
+    <w:p>
+      <w:pPr>
+        <w:pStyle w:val="ImageCaption"/>
+      </w:pPr>
+      <w:r>
+        <w:t xml:space="preserve">Predicted class trajectories by sample (pooled, boys, girls) and number of classes. Dashed lines: observed means within each sample.</w:t>
+      </w:r>
+    </w:p>
+    <w:tbl>
+      <w:tblPr>
+        <w:tblStyle w:val="Table"/>
+        <w:tblLook w:firstRow="0" w:lastRow="0" w:firstColumn="0" w:lastColumn="0" w:noHBand="0" w:noVBand="0" w:val="0000"/>
+        <w:tblBorders>
+          <w:top w:val="single" w:sz="4" w:space="0" w:color="0758E5"/>
+          <w:left w:val="single" w:sz="24" w:space="0" w:color="0758E5"/>
+          <w:bottom w:val="single" w:sz="4" w:space="0" w:color="0758E5"/>
+          <w:right w:val="single" w:sz="4" w:space="0" w:color="0758E5"/>
+        </w:tblBorders>
+        <w:tblCellMar>
+          <w:left w:w="144" w:type="dxa"/>
+          <w:right w:w="144" w:type="dxa"/>
+        </w:tblCellMar>
+        <w:tblLook w:firstRow="0" w:lastRow="0" w:firstColumn="0" w:lastColumn="0" w:noHBand="0" w:noVBand="0" w:val="0000"/>
+      </w:tblPr>
+      <w:tr>
+        <w:trPr>
+          <w:cantSplit/>
+        </w:trPr>
+        <w:tc>
+          <w:tcPr>
+            <w:shd w:color="auto" w:fill="dae6fb" w:val="clear"/>
+            <w:tcMar>
+              <w:top w:w="92" w:type="dxa"/>
+              <w:bottom w:w="92" w:type="dxa"/>
+            </w:tcMar>
+          </w:tcPr>
+          <w:p>
+            <w:pPr>
+              <w:pStyle w:val="BodyText"/>
+            </w:pPr>
+            <w:pPr>
+              <w:spacing w:before="0" w:after="0"/>
+              <w:textAlignment w:val="center"/>
+            </w:pPr>
+            <w:r>
+              <w:drawing>
+                <wp:inline>
+                  <wp:extent cx="152400" cy="152400"/>
+                  <wp:effectExtent b="0" l="0" r="0" t="0"/>
+                  <wp:docPr descr="" title="" id="47" name="Picture"/>
+                  <a:graphic>
+                    <a:graphicData uri="http://schemas.openxmlformats.org/drawingml/2006/picture">
+                      <pic:pic>
+                        <pic:nvPicPr>
+                          <pic:cNvPr descr="/opt/quarto/share/formats/docx/note.png" id="48" name="Picture"/>
+                          <pic:cNvPicPr>
+                            <a:picLocks noChangeArrowheads="1" noChangeAspect="1"/>
+                          </pic:cNvPicPr>
+                        </pic:nvPicPr>
+                        <pic:blipFill>
+                          <a:blip r:embed="rId9"/>
+                          <a:stretch>
+                            <a:fillRect/>
+                          </a:stretch>
+                        </pic:blipFill>
+                        <pic:spPr bwMode="auto">
+                          <a:xfrm>
+                            <a:off x="0" y="0"/>
+                            <a:ext cx="152400" cy="152400"/>
+                          </a:xfrm>
+                          <a:prstGeom prst="rect">
+                            <a:avLst/>
+                          </a:prstGeom>
+                          <a:noFill/>
+                          <a:ln w="9525">
+                            <a:noFill/>
+                            <a:headEnd/>
+                            <a:tailEnd/>
+                          </a:ln>
+                        </pic:spPr>
+                      </pic:pic>
+                    </a:graphicData>
+                  </a:graphic>
+                </wp:inline>
+              </w:drawing>
+            </w:r>
+            <w:r>
+              <w:t xml:space="preserve"> </w:t>
+            </w:r>
+            <w:r>
+              <w:t xml:space="preserve"> </w:t>
+            </w:r>
+            <w:r>
+              <w:t xml:space="preserve">Interpretation</w:t>
+            </w:r>
+          </w:p>
+        </w:tc>
+      </w:tr>
+      <w:tr>
+        <w:trPr>
+          <w:cantSplit/>
+        </w:trPr>
+        <w:tc>
+          <w:tcPr>
+            <w:tcMar>
+              <w:top w:w="108" w:type="dxa"/>
+              <w:bottom w:w="108" w:type="dxa"/>
+            </w:tcMar>
+          </w:tcPr>
+          <w:p>
+            <w:pPr>
+              <w:pStyle w:val="Compact"/>
+              <w:numPr>
+                <w:ilvl w:val="0"/>
+                <w:numId w:val="1008"/>
+              </w:numPr>
+            </w:pPr>
+            <w:r>
+              <w:t xml:space="preserve">All stratified models converged, and enumeration behaves the same way</w:t>
+            </w:r>
+            <w:r>
+              <w:t xml:space="preserve"> </w:t>
+            </w:r>
+            <w:r>
+              <w:t xml:space="preserve">within each sex as in the pooled sample: BIC falls monotonically, entropy</w:t>
+            </w:r>
+            <w:r>
+              <w:t xml:space="preserve"> </w:t>
+            </w:r>
+            <w:r>
+              <w:t xml:space="preserve">peaks at K = 3 (0.85 in boys, girls, and pooled alike).</w:t>
+            </w:r>
+          </w:p>
+          <w:p>
+            <w:pPr>
+              <w:pStyle w:val="Compact"/>
+              <w:numPr>
+                <w:ilvl w:val="0"/>
+                <w:numId w:val="1008"/>
+              </w:numPr>
+            </w:pPr>
+            <w:r>
+              <w:rPr>
+                <w:b/>
+                <w:bCs/>
+              </w:rPr>
+              <w:t xml:space="preserve">At K = 3 the class shapes replicate almost exactly in both sexes</w:t>
+            </w:r>
+            <w:r>
+              <w:t xml:space="preserve">: a</w:t>
+            </w:r>
+            <w:r>
+              <w:t xml:space="preserve"> </w:t>
+            </w:r>
+            <w:r>
+              <w:t xml:space="preserve">flat satisfied majority (~84% in both), a declining</w:t>
+            </w:r>
+            <w:r>
+              <w:t xml:space="preserve"> </w:t>
+            </w:r>
+            <w:r>
+              <w:t xml:space="preserve">“larger than ideal”</w:t>
+            </w:r>
+            <w:r>
+              <w:t xml:space="preserve"> </w:t>
+            </w:r>
+            <w:r>
+              <w:t xml:space="preserve">class (boys 12.6%, girls 14.3%), and a rising</w:t>
+            </w:r>
+            <w:r>
+              <w:t xml:space="preserve"> </w:t>
+            </w:r>
+            <w:r>
+              <w:t xml:space="preserve">“thinner than ideal”</w:t>
+            </w:r>
+            <w:r>
+              <w:t xml:space="preserve"> </w:t>
+            </w:r>
+            <w:r>
+              <w:t xml:space="preserve">class</w:t>
+            </w:r>
+            <w:r>
+              <w:t xml:space="preserve"> </w:t>
+            </w:r>
+            <w:r>
+              <w:t xml:space="preserve">(boys 3.5%, girls 2.0%). The sexes differ in class</w:t>
+            </w:r>
+            <w:r>
+              <w:t xml:space="preserve"> </w:t>
+            </w:r>
+            <w:r>
+              <w:rPr>
+                <w:i/>
+                <w:iCs/>
+              </w:rPr>
+              <w:t xml:space="preserve">prevalence</w:t>
+            </w:r>
+            <w:r>
+              <w:t xml:space="preserve"> </w:t>
+            </w:r>
+            <w:r>
+              <w:t xml:space="preserve">— the</w:t>
+            </w:r>
+            <w:r>
+              <w:t xml:space="preserve"> </w:t>
+            </w:r>
+            <w:r>
+              <w:t xml:space="preserve">thinner-than-ideal class is nearly twice as common in boys — not in class</w:t>
+            </w:r>
+            <w:r>
+              <w:t xml:space="preserve"> </w:t>
+            </w:r>
+            <w:r>
+              <w:rPr>
+                <w:i/>
+                <w:iCs/>
+              </w:rPr>
+              <w:t xml:space="preserve">shape</w:t>
+            </w:r>
+            <w:r>
+              <w:t xml:space="preserve">. Prevalence differences are exactly what the class-membership</w:t>
+            </w:r>
+            <w:r>
+              <w:t xml:space="preserve"> </w:t>
+            </w:r>
+            <w:r>
+              <w:t xml:space="preserve">model with sex handles.</w:t>
+            </w:r>
+          </w:p>
+          <w:p>
+            <w:pPr>
+              <w:pStyle w:val="Compact"/>
+              <w:numPr>
+                <w:ilvl w:val="0"/>
+                <w:numId w:val="1008"/>
+              </w:numPr>
+            </w:pPr>
+            <w:r>
+              <w:t xml:space="preserve">The girls’ age-12 rebound in</w:t>
+            </w:r>
+            <w:r>
+              <w:t xml:space="preserve"> </w:t>
+            </w:r>
+            <w:r>
+              <w:t xml:space="preserve">“larger than ideal”</w:t>
+            </w:r>
+            <w:r>
+              <w:t xml:space="preserve"> </w:t>
+            </w:r>
+            <w:r>
+              <w:t xml:space="preserve">seen in the descriptives</w:t>
+            </w:r>
+            <w:r>
+              <w:t xml:space="preserve"> </w:t>
+            </w:r>
+            <w:r>
+              <w:t xml:space="preserve">surfaces only at K = 4, and only as a slope difference: girls’ moderate</w:t>
+            </w:r>
+            <w:r>
+              <w:t xml:space="preserve"> </w:t>
+            </w:r>
+            <w:r>
+              <w:t xml:space="preserve">dissatisfied class drifts slightly upward from 10 to 12 while the boys’</w:t>
+            </w:r>
+            <w:r>
+              <w:t xml:space="preserve"> </w:t>
+            </w:r>
+            <w:r>
+              <w:t xml:space="preserve">equivalent drifts down. It is a modest divergence within one class, not a</w:t>
+            </w:r>
+            <w:r>
+              <w:t xml:space="preserve"> </w:t>
+            </w:r>
+            <w:r>
+              <w:t xml:space="preserve">distinct trajectory structure, and no rising-positive class exists in the</w:t>
+            </w:r>
+            <w:r>
+              <w:t xml:space="preserve"> </w:t>
+            </w:r>
+            <w:r>
+              <w:t xml:space="preserve">girls-only solutions at K = 3.</w:t>
+            </w:r>
+          </w:p>
+          <w:p>
+            <w:pPr>
+              <w:pStyle w:val="Compact"/>
+              <w:numPr>
+                <w:ilvl w:val="0"/>
+                <w:numId w:val="1008"/>
+              </w:numPr>
+            </w:pPr>
+            <w:r>
+              <w:rPr>
+                <w:b/>
+                <w:bCs/>
+              </w:rPr>
+              <w:t xml:space="preserve">Conclusion: the pooled LCGA stands as the primary specification.</w:t>
+            </w:r>
+            <w:r>
+              <w:t xml:space="preserve"> </w:t>
+            </w:r>
+            <w:r>
+              <w:t xml:space="preserve">This</w:t>
+            </w:r>
+            <w:r>
+              <w:t xml:space="preserve"> </w:t>
+            </w:r>
+            <w:r>
+              <w:t xml:space="preserve">supports K = 3 specifically — its structure is reproducible within each</w:t>
+            </w:r>
+            <w:r>
+              <w:t xml:space="preserve"> </w:t>
+            </w:r>
+            <w:r>
+              <w:t xml:space="preserve">sex, whereas the K = 4 structures start to diverge across sexes. If the</w:t>
+            </w:r>
+            <w:r>
+              <w:t xml:space="preserve"> </w:t>
+            </w:r>
+            <w:r>
+              <w:t xml:space="preserve">moderate-class slope difference matters substantively, it is better</w:t>
+            </w:r>
+            <w:r>
+              <w:t xml:space="preserve"> </w:t>
+            </w:r>
+            <w:r>
+              <w:t xml:space="preserve">captured by the planned sex-moderation analysis than by stratified</w:t>
+            </w:r>
+            <w:r>
+              <w:t xml:space="preserve"> </w:t>
+            </w:r>
+            <w:r>
+              <w:t xml:space="preserve">classes.</w:t>
+            </w:r>
+          </w:p>
+          <w:p/>
+        </w:tc>
+      </w:tr>
+    </w:tbl>
+    <w:p>
+      <w:pPr>
+        <w:pStyle w:val="FirstParagraph"/>
+      </w:pPr>
+      <w:r>
+        <w:t xml:space="preserve"> </w:t>
+      </w:r>
+    </w:p>
+    <w:tbl>
+      <w:tblPr>
+        <w:tblStyle w:val="Table"/>
+        <w:tblLook w:firstRow="0" w:lastRow="0" w:firstColumn="0" w:lastColumn="0" w:noHBand="0" w:noVBand="0" w:val="0000"/>
+        <w:tblBorders>
+          <w:top w:val="single" w:sz="4" w:space="0" w:color="CC1914"/>
+          <w:left w:val="single" w:sz="24" w:space="0" w:color="CC1914"/>
+          <w:bottom w:val="single" w:sz="4" w:space="0" w:color="CC1914"/>
+          <w:right w:val="single" w:sz="4" w:space="0" w:color="CC1914"/>
+        </w:tblBorders>
+        <w:tblCellMar>
+          <w:left w:w="144" w:type="dxa"/>
+          <w:right w:w="144" w:type="dxa"/>
+        </w:tblCellMar>
+        <w:tblLook w:firstRow="0" w:lastRow="0" w:firstColumn="0" w:lastColumn="0" w:noHBand="0" w:noVBand="0" w:val="0000"/>
+      </w:tblPr>
+      <w:tr>
+        <w:trPr>
+          <w:cantSplit/>
+        </w:trPr>
+        <w:tc>
+          <w:tcPr>
+            <w:shd w:color="auto" w:fill="f7dddc" w:val="clear"/>
+            <w:tcMar>
+              <w:top w:w="92" w:type="dxa"/>
+              <w:bottom w:w="92" w:type="dxa"/>
+            </w:tcMar>
+          </w:tcPr>
+          <w:p>
+            <w:pPr>
+              <w:pStyle w:val="BodyText"/>
+            </w:pPr>
+            <w:pPr>
+              <w:spacing w:before="0" w:after="0"/>
+              <w:textAlignment w:val="center"/>
+            </w:pPr>
+            <w:r>
+              <w:drawing>
+                <wp:inline>
+                  <wp:extent cx="152400" cy="152400"/>
+                  <wp:effectExtent b="0" l="0" r="0" t="0"/>
+                  <wp:docPr descr="" title="" id="50" name="Picture"/>
+                  <a:graphic>
+                    <a:graphicData uri="http://schemas.openxmlformats.org/drawingml/2006/picture">
+                      <pic:pic>
+                        <pic:nvPicPr>
+                          <pic:cNvPr descr="/opt/quarto/share/formats/docx/important.png" id="51" name="Picture"/>
+                          <pic:cNvPicPr>
+                            <a:picLocks noChangeArrowheads="1" noChangeAspect="1"/>
+                          </pic:cNvPicPr>
+                        </pic:nvPicPr>
+                        <pic:blipFill>
+                          <a:blip r:embed="rId49"/>
+                          <a:stretch>
+                            <a:fillRect/>
+                          </a:stretch>
+                        </pic:blipFill>
+                        <pic:spPr bwMode="auto">
+                          <a:xfrm>
+                            <a:off x="0" y="0"/>
+                            <a:ext cx="152400" cy="152400"/>
+                          </a:xfrm>
+                          <a:prstGeom prst="rect">
+                            <a:avLst/>
+                          </a:prstGeom>
+                          <a:noFill/>
+                          <a:ln w="9525">
+                            <a:noFill/>
+                            <a:headEnd/>
+                            <a:tailEnd/>
+                          </a:ln>
+                        </pic:spPr>
+                      </pic:pic>
+                    </a:graphicData>
+                  </a:graphic>
+                </wp:inline>
+              </w:drawing>
+            </w:r>
+            <w:r>
+              <w:t xml:space="preserve"> </w:t>
+            </w:r>
+            <w:r>
+              <w:t xml:space="preserve"> </w:t>
+            </w:r>
+            <w:r>
+              <w:t xml:space="preserve">Enumeration criteria &amp; limitations</w:t>
+            </w:r>
+          </w:p>
+        </w:tc>
+      </w:tr>
+      <w:tr>
+        <w:trPr>
+          <w:cantSplit/>
+        </w:trPr>
+        <w:tc>
+          <w:tcPr>
+            <w:tcMar>
+              <w:top w:w="108" w:type="dxa"/>
+              <w:bottom w:w="108" w:type="dxa"/>
+            </w:tcMar>
+          </w:tcPr>
+          <w:p>
+            <w:pPr>
+              <w:pStyle w:val="Compact"/>
+              <w:numPr>
+                <w:ilvl w:val="0"/>
+                <w:numId w:val="1009"/>
+              </w:numPr>
+            </w:pPr>
+            <w:r>
+              <w:t xml:space="preserve">Class enumeration rests on BIC/SABIC, entropy, smallest-class size (flag</w:t>
+            </w:r>
+            <w:r>
+              <w:t xml:space="preserve"> </w:t>
+            </w:r>
+            <w:r>
+              <w:t xml:space="preserve">&lt;5%), and interpretability.</w:t>
+            </w:r>
+            <w:r>
+              <w:t xml:space="preserve"> </w:t>
+            </w:r>
+            <w:r>
+              <w:rPr>
+                <w:rStyle w:val="VerbatimChar"/>
+              </w:rPr>
+              <w:t xml:space="preserve">lcmm</w:t>
+            </w:r>
+            <w:r>
+              <w:t xml:space="preserve"> </w:t>
+            </w:r>
+            <w:r>
+              <w:t xml:space="preserve">provides no LMR-LRT or BLRT (Nylund et</w:t>
+            </w:r>
+            <w:r>
+              <w:t xml:space="preserve"> </w:t>
+            </w:r>
+            <w:r>
+              <w:t xml:space="preserve">al., 2007); a manual bootstrap LRT is a possible add-on if the picture is</w:t>
+            </w:r>
+            <w:r>
+              <w:t xml:space="preserve"> </w:t>
+            </w:r>
+            <w:r>
+              <w:t xml:space="preserve">ambiguous.</w:t>
+            </w:r>
+          </w:p>
+          <w:p>
+            <w:pPr>
+              <w:pStyle w:val="Compact"/>
+              <w:numPr>
+                <w:ilvl w:val="0"/>
+                <w:numId w:val="1009"/>
+              </w:numPr>
+            </w:pPr>
+            <w:r>
+              <w:t xml:space="preserve">At this sample size BIC can keep falling as classes are added — where it</w:t>
+            </w:r>
+            <w:r>
+              <w:t xml:space="preserve"> </w:t>
+            </w:r>
+            <w:r>
+              <w:t xml:space="preserve">does, we lean on entropy, class sizes, and interpretability.</w:t>
+            </w:r>
+          </w:p>
+          <w:p>
+            <w:pPr>
+              <w:pStyle w:val="Compact"/>
+              <w:numPr>
+                <w:ilvl w:val="0"/>
+                <w:numId w:val="1009"/>
+              </w:numPr>
+            </w:pPr>
+            <w:r>
+              <w:t xml:space="preserve">Never accept a solution with</w:t>
+            </w:r>
+            <w:r>
+              <w:t xml:space="preserve"> </w:t>
+            </w:r>
+            <w:r>
+              <w:rPr>
+                <w:rStyle w:val="VerbatimChar"/>
+              </w:rPr>
+              <w:t xml:space="preserve">Converged = No</w:t>
+            </w:r>
+            <w:r>
+              <w:t xml:space="preserve">.</w:t>
+            </w:r>
+          </w:p>
+          <w:p>
+            <w:pPr>
+              <w:pStyle w:val="Compact"/>
+              <w:numPr>
+                <w:ilvl w:val="0"/>
+                <w:numId w:val="1009"/>
+              </w:numPr>
+            </w:pPr>
+            <w:r>
+              <w:t xml:space="preserve">Linear class trajectories only: three timepoints saturate a quadratic.</w:t>
+            </w:r>
+          </w:p>
+          <w:p>
+            <w:pPr>
+              <w:pStyle w:val="Compact"/>
+              <w:numPr>
+                <w:ilvl w:val="0"/>
+                <w:numId w:val="1009"/>
+              </w:numPr>
+            </w:pPr>
+            <w:r>
+              <w:t xml:space="preserve">Reporting follows the GRoLTS checklist (van de Schoot et al., 2017).</w:t>
+            </w:r>
+          </w:p>
+          <w:p/>
+        </w:tc>
+      </w:tr>
+    </w:tbl>
+    <w:bookmarkEnd w:id="52"/>
+    <w:bookmarkEnd w:id="53"/>
+    <w:bookmarkStart w:id="60" w:name="trajectory-classes-final-model"/>
+    <w:p>
+      <w:pPr>
+        <w:pStyle w:val="Heading1"/>
+      </w:pPr>
+      <w:r>
+        <w:t xml:space="preserve">6. Trajectory classes (final model)</w:t>
+      </w:r>
+    </w:p>
+    <w:p>
+      <w:pPr>
+        <w:pStyle w:val="FirstParagraph"/>
+      </w:pPr>
+      <w:r>
+        <w:t xml:space="preserve">The three-class model was frozen as the final trajectory model (K = 3;</w:t>
+      </w:r>
+      <w:r>
+        <w:t xml:space="preserve"> </w:t>
+      </w:r>
+      <w:r>
+        <w:t xml:space="preserve">entropy 0.85), based on the enumeration statistics and the sex-stratified</w:t>
+      </w:r>
+      <w:r>
+        <w:t xml:space="preserve"> </w:t>
+      </w:r>
+      <w:r>
+        <w:t xml:space="preserve">check above. Classes are labelled in ascending order of their age-8</w:t>
+      </w:r>
+      <w:r>
+        <w:t xml:space="preserve"> </w:t>
+      </w:r>
+      <w:r>
+        <w:t xml:space="preserve">intercept, so numbering is stable across refits.</w:t>
+      </w:r>
+    </w:p>
+    <w:p>
+      <w:pPr>
+        <w:pStyle w:val="CaptionedFigure"/>
+      </w:pPr>
+      <w:r>
+        <w:drawing>
+          <wp:inline>
+            <wp:extent cx="5334000" cy="3429000"/>
+            <wp:effectExtent b="0" l="0" r="0" t="0"/>
+            <wp:docPr descr="Final three-class model: predicted trajectories (95% bands) and observed means by modal class." title="" id="55" name="Picture"/>
+            <a:graphic>
+              <a:graphicData uri="http://schemas.openxmlformats.org/drawingml/2006/picture">
+                <pic:pic>
+                  <pic:nvPicPr>
+                    <pic:cNvPr descr="report_files/figure-docx/plot-lcga-classes-1.png" id="56" name="Picture"/>
+                    <pic:cNvPicPr>
+                      <a:picLocks noChangeArrowheads="1" noChangeAspect="1"/>
+                    </pic:cNvPicPr>
+                  </pic:nvPicPr>
+                  <pic:blipFill>
+                    <a:blip r:embed="rId54"/>
+                    <a:stretch>
+                      <a:fillRect/>
+                    </a:stretch>
+                  </pic:blipFill>
+                  <pic:spPr bwMode="auto">
+                    <a:xfrm>
+                      <a:off x="0" y="0"/>
+                      <a:ext cx="5334000" cy="3429000"/>
+                    </a:xfrm>
+                    <a:prstGeom prst="rect">
+                      <a:avLst/>
+                    </a:prstGeom>
+                    <a:noFill/>
+                    <a:ln w="9525">
+                      <a:noFill/>
+                      <a:headEnd/>
+                      <a:tailEnd/>
+                    </a:ln>
+                  </pic:spPr>
+                </pic:pic>
+              </a:graphicData>
+            </a:graphic>
+          </wp:inline>
+        </w:drawing>
+      </w:r>
+    </w:p>
+    <w:p>
+      <w:pPr>
+        <w:pStyle w:val="ImageCaption"/>
+      </w:pPr>
+      <w:r>
+        <w:t xml:space="preserve">Final three-class model: predicted trajectories (95% bands) and observed means by modal class.</w:t>
+      </w:r>
+    </w:p>
+    <w:tbl>
+      <w:tblPr>
+        <w:tblStyle w:val="Table"/>
+        <w:tblW w:type="pct" w:w="5000"/>
+        <w:tblLayout w:type="fixed"/>
+        <w:tblLook w:firstRow="0" w:lastRow="0" w:firstColumn="0" w:lastColumn="0" w:noHBand="0" w:noVBand="0" w:val="0000"/>
+      </w:tblPr>
+      <w:tblGrid>
+        <w:gridCol w:w="7920"/>
+      </w:tblGrid>
+      <w:tr>
+        <w:tc>
+          <w:tcPr/>
+          <w:bookmarkStart w:id="57" w:name="tbl-class-quality"/>
+          <w:p>
+            <w:pPr>
+              <w:jc w:val="center"/>
+            </w:pPr>
+            <w:pPr>
+              <w:jc w:val="left"/>
+              <w:spacing w:before="200"/>
+              <w:pStyle w:val="ImageCaption"/>
+            </w:pPr>
+            <w:r>
+              <w:t xml:space="preserve">Table 8: Class sizes and modal-assignment quality (posterior probabilities of the assigned class).</w:t>
+            </w:r>
+          </w:p>
+          <w:tbl>
+            <w:tblPr>
+              <w:tblStyle w:val="Table"/>
+              <w:tblW w:type="auto" w:w="0"/>
+              <w:tblLook w:firstRow="1" w:lastRow="0" w:firstColumn="0" w:lastColumn="0" w:noHBand="0" w:noVBand="0" w:val="0020"/>
+            </w:tblPr>
+            <w:tblGrid>
+              <w:gridCol w:w="1584"/>
+              <w:gridCol w:w="1584"/>
+              <w:gridCol w:w="1584"/>
+              <w:gridCol w:w="1584"/>
+              <w:gridCol w:w="1584"/>
+            </w:tblGrid>
+            <w:tr>
+              <w:trPr>
+                <w:tblHeader w:val="on"/>
+              </w:trPr>
+              <w:tc>
+                <w:tcPr/>
+                <w:p>
+                  <w:pPr>
+                    <w:pStyle w:val="Compact"/>
+                    <w:jc w:val="left"/>
+                    <w:jc w:val="center"/>
+                  </w:pPr>
+                  <w:r>
+                    <w:t xml:space="preserve">Class</w:t>
+                  </w:r>
+                </w:p>
+              </w:tc>
+              <w:tc>
+                <w:tcPr/>
+                <w:p>
+                  <w:pPr>
+                    <w:pStyle w:val="Compact"/>
+                    <w:jc w:val="right"/>
+                    <w:jc w:val="center"/>
+                  </w:pPr>
+                  <w:r>
+                    <w:t xml:space="preserve">N</w:t>
+                  </w:r>
+                </w:p>
+              </w:tc>
+              <w:tc>
+                <w:tcPr/>
+                <w:p>
+                  <w:pPr>
+                    <w:pStyle w:val="Compact"/>
+                    <w:jc w:val="right"/>
+                    <w:jc w:val="center"/>
+                  </w:pPr>
+                  <w:r>
+                    <w:t xml:space="preserve">%</w:t>
+                  </w:r>
+                </w:p>
+              </w:tc>
+              <w:tc>
+                <w:tcPr/>
+                <w:p>
+                  <w:pPr>
+                    <w:pStyle w:val="Compact"/>
+                    <w:jc w:val="right"/>
+                    <w:jc w:val="center"/>
+                  </w:pPr>
+                  <w:r>
+                    <w:t xml:space="preserve">Mean posterior prob.</w:t>
+                  </w:r>
+                </w:p>
+              </w:tc>
+              <w:tc>
+                <w:tcPr/>
+                <w:p>
+                  <w:pPr>
+                    <w:pStyle w:val="Compact"/>
+                    <w:jc w:val="right"/>
+                    <w:jc w:val="center"/>
+                  </w:pPr>
+                  <w:r>
+                    <w:t xml:space="preserve">Min posterior prob.</w:t>
+                  </w:r>
+                </w:p>
+              </w:tc>
+            </w:tr>
+            <w:tr>
+              <w:tc>
+                <w:tcPr/>
+                <w:p>
+                  <w:pPr>
+                    <w:pStyle w:val="Compact"/>
+                    <w:jc w:val="left"/>
+                    <w:jc w:val="center"/>
+                  </w:pPr>
+                  <w:r>
+                    <w:t xml:space="preserve">1</w:t>
+                  </w:r>
+                </w:p>
+              </w:tc>
+              <w:tc>
+                <w:tcPr/>
+                <w:p>
+                  <w:pPr>
+                    <w:pStyle w:val="Compact"/>
+                    <w:jc w:val="right"/>
+                    <w:jc w:val="center"/>
+                  </w:pPr>
+                  <w:r>
+                    <w:t xml:space="preserve">218</w:t>
+                  </w:r>
+                </w:p>
+              </w:tc>
+              <w:tc>
+                <w:tcPr/>
+                <w:p>
+                  <w:pPr>
+                    <w:pStyle w:val="Compact"/>
+                    <w:jc w:val="right"/>
+                    <w:jc w:val="center"/>
+                  </w:pPr>
+                  <w:r>
+                    <w:t xml:space="preserve">2.8</w:t>
+                  </w:r>
+                </w:p>
+              </w:tc>
+              <w:tc>
+                <w:tcPr/>
+                <w:p>
+                  <w:pPr>
+                    <w:pStyle w:val="Compact"/>
+                    <w:jc w:val="right"/>
+                    <w:jc w:val="center"/>
+                  </w:pPr>
+                  <w:r>
+                    <w:t xml:space="preserve">0.81</w:t>
+                  </w:r>
+                </w:p>
+              </w:tc>
+              <w:tc>
+                <w:tcPr/>
+                <w:p>
+                  <w:pPr>
+                    <w:pStyle w:val="Compact"/>
+                    <w:jc w:val="right"/>
+                    <w:jc w:val="center"/>
+                  </w:pPr>
+                  <w:r>
+                    <w:t xml:space="preserve">0.54</w:t>
+                  </w:r>
+                </w:p>
+              </w:tc>
+            </w:tr>
+            <w:tr>
+              <w:tc>
+                <w:tcPr/>
+                <w:p>
+                  <w:pPr>
+                    <w:pStyle w:val="Compact"/>
+                    <w:jc w:val="left"/>
+                    <w:jc w:val="center"/>
+                  </w:pPr>
+                  <w:r>
+                    <w:t xml:space="preserve">2</w:t>
+                  </w:r>
+                </w:p>
+              </w:tc>
+              <w:tc>
+                <w:tcPr/>
+                <w:p>
+                  <w:pPr>
+                    <w:pStyle w:val="Compact"/>
+                    <w:jc w:val="right"/>
+                    <w:jc w:val="center"/>
+                  </w:pPr>
+                  <w:r>
+                    <w:t xml:space="preserve">6570</w:t>
+                  </w:r>
+                </w:p>
+              </w:tc>
+              <w:tc>
+                <w:tcPr/>
+                <w:p>
+                  <w:pPr>
+                    <w:pStyle w:val="Compact"/>
+                    <w:jc w:val="right"/>
+                    <w:jc w:val="center"/>
+                  </w:pPr>
+                  <w:r>
+                    <w:t xml:space="preserve">83.8</w:t>
+                  </w:r>
+                </w:p>
+              </w:tc>
+              <w:tc>
+                <w:tcPr/>
+                <w:p>
+                  <w:pPr>
+                    <w:pStyle w:val="Compact"/>
+                    <w:jc w:val="right"/>
+                    <w:jc w:val="center"/>
+                  </w:pPr>
+                  <w:r>
+                    <w:t xml:space="preserve">0.94</w:t>
+                  </w:r>
+                </w:p>
+              </w:tc>
+              <w:tc>
+                <w:tcPr/>
+                <w:p>
+                  <w:pPr>
+                    <w:pStyle w:val="Compact"/>
+                    <w:jc w:val="right"/>
+                    <w:jc w:val="center"/>
+                  </w:pPr>
+                  <w:r>
+                    <w:t xml:space="preserve">0.53</w:t>
+                  </w:r>
+                </w:p>
+              </w:tc>
+            </w:tr>
+            <w:tr>
+              <w:tc>
+                <w:tcPr/>
+                <w:p>
+                  <w:pPr>
+                    <w:pStyle w:val="Compact"/>
+                    <w:jc w:val="left"/>
+                    <w:jc w:val="center"/>
+                  </w:pPr>
+                  <w:r>
+                    <w:t xml:space="preserve">3</w:t>
+                  </w:r>
+                </w:p>
+              </w:tc>
+              <w:tc>
+                <w:tcPr/>
+                <w:p>
+                  <w:pPr>
+                    <w:pStyle w:val="Compact"/>
+                    <w:jc w:val="right"/>
+                    <w:jc w:val="center"/>
+                  </w:pPr>
+                  <w:r>
+                    <w:t xml:space="preserve">1055</w:t>
+                  </w:r>
+                </w:p>
+              </w:tc>
+              <w:tc>
+                <w:tcPr/>
+                <w:p>
+                  <w:pPr>
+                    <w:pStyle w:val="Compact"/>
+                    <w:jc w:val="right"/>
+                    <w:jc w:val="center"/>
+                  </w:pPr>
+                  <w:r>
+                    <w:t xml:space="preserve">13.5</w:t>
+                  </w:r>
+                </w:p>
+              </w:tc>
+              <w:tc>
+                <w:tcPr/>
+                <w:p>
+                  <w:pPr>
+                    <w:pStyle w:val="Compact"/>
+                    <w:jc w:val="right"/>
+                    <w:jc w:val="center"/>
+                  </w:pPr>
+                  <w:r>
+                    <w:t xml:space="preserve">0.90</w:t>
+                  </w:r>
+                </w:p>
+              </w:tc>
+              <w:tc>
+                <w:tcPr/>
+                <w:p>
+                  <w:pPr>
+                    <w:pStyle w:val="Compact"/>
+                    <w:jc w:val="right"/>
+                    <w:jc w:val="center"/>
+                  </w:pPr>
+                  <w:r>
+                    <w:t xml:space="preserve">0.54</w:t>
+                  </w:r>
+                </w:p>
+              </w:tc>
+            </w:tr>
+          </w:tbl>
+          <w:bookmarkEnd w:id="57"/>
+          <w:p/>
+        </w:tc>
+      </w:tr>
+    </w:tbl>
+    <w:p>
+      <w:pPr>
+        <w:pStyle w:val="BodyText"/>
+      </w:pPr>
+      <w:r>
+        <w:t xml:space="preserve"> </w:t>
+      </w:r>
+    </w:p>
+    <w:tbl>
+      <w:tblPr>
+        <w:tblStyle w:val="Table"/>
+        <w:tblLook w:firstRow="0" w:lastRow="0" w:firstColumn="0" w:lastColumn="0" w:noHBand="0" w:noVBand="0" w:val="0000"/>
+        <w:tblBorders>
+          <w:top w:val="single" w:sz="4" w:space="0" w:color="0758E5"/>
+          <w:left w:val="single" w:sz="24" w:space="0" w:color="0758E5"/>
+          <w:bottom w:val="single" w:sz="4" w:space="0" w:color="0758E5"/>
+          <w:right w:val="single" w:sz="4" w:space="0" w:color="0758E5"/>
+        </w:tblBorders>
+        <w:tblCellMar>
+          <w:left w:w="144" w:type="dxa"/>
+          <w:right w:w="144" w:type="dxa"/>
+        </w:tblCellMar>
+        <w:tblLook w:firstRow="0" w:lastRow="0" w:firstColumn="0" w:lastColumn="0" w:noHBand="0" w:noVBand="0" w:val="0000"/>
+      </w:tblPr>
+      <w:tr>
+        <w:trPr>
+          <w:cantSplit/>
+        </w:trPr>
+        <w:tc>
+          <w:tcPr>
+            <w:shd w:color="auto" w:fill="dae6fb" w:val="clear"/>
+            <w:tcMar>
+              <w:top w:w="92" w:type="dxa"/>
+              <w:bottom w:w="92" w:type="dxa"/>
+            </w:tcMar>
+          </w:tcPr>
+          <w:p>
+            <w:pPr>
+              <w:pStyle w:val="BodyText"/>
+            </w:pPr>
+            <w:pPr>
+              <w:spacing w:before="0" w:after="0"/>
+              <w:textAlignment w:val="center"/>
+            </w:pPr>
+            <w:r>
+              <w:drawing>
+                <wp:inline>
+                  <wp:extent cx="152400" cy="152400"/>
+                  <wp:effectExtent b="0" l="0" r="0" t="0"/>
+                  <wp:docPr descr="" title="" id="58" name="Picture"/>
+                  <a:graphic>
+                    <a:graphicData uri="http://schemas.openxmlformats.org/drawingml/2006/picture">
+                      <pic:pic>
+                        <pic:nvPicPr>
+                          <pic:cNvPr descr="/opt/quarto/share/formats/docx/note.png" id="59" name="Picture"/>
+                          <pic:cNvPicPr>
+                            <a:picLocks noChangeArrowheads="1" noChangeAspect="1"/>
+                          </pic:cNvPicPr>
+                        </pic:nvPicPr>
+                        <pic:blipFill>
+                          <a:blip r:embed="rId9"/>
+                          <a:stretch>
+                            <a:fillRect/>
+                          </a:stretch>
+                        </pic:blipFill>
+                        <pic:spPr bwMode="auto">
+                          <a:xfrm>
+                            <a:off x="0" y="0"/>
+                            <a:ext cx="152400" cy="152400"/>
+                          </a:xfrm>
+                          <a:prstGeom prst="rect">
+                            <a:avLst/>
+                          </a:prstGeom>
+                          <a:noFill/>
+                          <a:ln w="9525">
+                            <a:noFill/>
+                            <a:headEnd/>
+                            <a:tailEnd/>
+                          </a:ln>
+                        </pic:spPr>
+                      </pic:pic>
+                    </a:graphicData>
+                  </a:graphic>
+                </wp:inline>
+              </w:drawing>
+            </w:r>
+            <w:r>
+              <w:t xml:space="preserve"> </w:t>
+            </w:r>
+            <w:r>
+              <w:t xml:space="preserve"> </w:t>
+            </w:r>
+            <w:r>
+              <w:t xml:space="preserve">Interpretation</w:t>
+            </w:r>
+          </w:p>
+        </w:tc>
+      </w:tr>
+      <w:tr>
+        <w:trPr>
+          <w:cantSplit/>
+        </w:trPr>
+        <w:tc>
+          <w:tcPr>
+            <w:tcMar>
+              <w:top w:w="108" w:type="dxa"/>
+              <w:bottom w:w="108" w:type="dxa"/>
+            </w:tcMar>
+          </w:tcPr>
+          <w:p>
+            <w:pPr>
+              <w:pStyle w:val="Compact"/>
+              <w:numPr>
+                <w:ilvl w:val="0"/>
+                <w:numId w:val="1010"/>
+              </w:numPr>
+            </w:pPr>
+            <w:r>
+              <w:rPr>
+                <w:b/>
+                <w:bCs/>
+              </w:rPr>
+              <w:t xml:space="preserve">Class 1 —</w:t>
+            </w:r>
+            <w:r>
+              <w:rPr>
+                <w:b/>
+                <w:bCs/>
+              </w:rPr>
+              <w:t xml:space="preserve"> </w:t>
+            </w:r>
+            <w:r>
+              <w:rPr>
+                <w:b/>
+                <w:bCs/>
+              </w:rPr>
+              <w:t xml:space="preserve">“thinner than ideal, converging”</w:t>
+            </w:r>
+            <w:r>
+              <w:rPr>
+                <w:b/>
+                <w:bCs/>
+              </w:rPr>
+              <w:t xml:space="preserve"> </w:t>
+            </w:r>
+            <w:r>
+              <w:rPr>
+                <w:b/>
+                <w:bCs/>
+              </w:rPr>
+              <w:t xml:space="preserve">(2.8%, n = 218):</w:t>
+            </w:r>
+            <w:r>
+              <w:t xml:space="preserve"> </w:t>
+            </w:r>
+            <w:r>
+              <w:t xml:space="preserve">starts</w:t>
+            </w:r>
+            <w:r>
+              <w:t xml:space="preserve"> </w:t>
+            </w:r>
+            <w:r>
+              <w:t xml:space="preserve">around −1.7 at age 8 and rises toward −0.4 by 12; these children see</w:t>
+            </w:r>
+            <w:r>
+              <w:t xml:space="preserve"> </w:t>
+            </w:r>
+            <w:r>
+              <w:t xml:space="preserve">themselves as thinner than their ideal, with the gap closing over time.</w:t>
+            </w:r>
+          </w:p>
+          <w:p>
+            <w:pPr>
+              <w:pStyle w:val="Compact"/>
+              <w:numPr>
+                <w:ilvl w:val="0"/>
+                <w:numId w:val="1010"/>
+              </w:numPr>
+            </w:pPr>
+            <w:r>
+              <w:rPr>
+                <w:b/>
+                <w:bCs/>
+              </w:rPr>
+              <w:t xml:space="preserve">Class 2 —</w:t>
+            </w:r>
+            <w:r>
+              <w:rPr>
+                <w:b/>
+                <w:bCs/>
+              </w:rPr>
+              <w:t xml:space="preserve"> </w:t>
+            </w:r>
+            <w:r>
+              <w:rPr>
+                <w:b/>
+                <w:bCs/>
+              </w:rPr>
+              <w:t xml:space="preserve">“satisfied”</w:t>
+            </w:r>
+            <w:r>
+              <w:rPr>
+                <w:b/>
+                <w:bCs/>
+              </w:rPr>
+              <w:t xml:space="preserve"> </w:t>
+            </w:r>
+            <w:r>
+              <w:rPr>
+                <w:b/>
+                <w:bCs/>
+              </w:rPr>
+              <w:t xml:space="preserve">(83.8%, n = 6,570):</w:t>
+            </w:r>
+            <w:r>
+              <w:t xml:space="preserve"> </w:t>
+            </w:r>
+            <w:r>
+              <w:t xml:space="preserve">flat trajectory just above</w:t>
+            </w:r>
+            <w:r>
+              <w:t xml:space="preserve"> </w:t>
+            </w:r>
+            <w:r>
+              <w:t xml:space="preserve">zero across ages 8–12.</w:t>
+            </w:r>
+          </w:p>
+          <w:p>
+            <w:pPr>
+              <w:pStyle w:val="Compact"/>
+              <w:numPr>
+                <w:ilvl w:val="0"/>
+                <w:numId w:val="1010"/>
+              </w:numPr>
+            </w:pPr>
+            <w:r>
+              <w:rPr>
+                <w:b/>
+                <w:bCs/>
+              </w:rPr>
+              <w:t xml:space="preserve">Class 3 —</w:t>
+            </w:r>
+            <w:r>
+              <w:rPr>
+                <w:b/>
+                <w:bCs/>
+              </w:rPr>
+              <w:t xml:space="preserve"> </w:t>
+            </w:r>
+            <w:r>
+              <w:rPr>
+                <w:b/>
+                <w:bCs/>
+              </w:rPr>
+              <w:t xml:space="preserve">“larger than ideal, declining”</w:t>
+            </w:r>
+            <w:r>
+              <w:rPr>
+                <w:b/>
+                <w:bCs/>
+              </w:rPr>
+              <w:t xml:space="preserve"> </w:t>
+            </w:r>
+            <w:r>
+              <w:rPr>
+                <w:b/>
+                <w:bCs/>
+              </w:rPr>
+              <w:t xml:space="preserve">(13.5%, n = 1,055):</w:t>
+            </w:r>
+            <w:r>
+              <w:t xml:space="preserve"> </w:t>
+            </w:r>
+            <w:r>
+              <w:t xml:space="preserve">starts</w:t>
+            </w:r>
+            <w:r>
+              <w:t xml:space="preserve"> </w:t>
+            </w:r>
+            <w:r>
+              <w:t xml:space="preserve">around 1.7 and declines modestly to about 1.3; persistent dissatisfaction</w:t>
+            </w:r>
+            <w:r>
+              <w:t xml:space="preserve"> </w:t>
+            </w:r>
+            <w:r>
+              <w:t xml:space="preserve">in the</w:t>
+            </w:r>
+            <w:r>
+              <w:t xml:space="preserve"> </w:t>
+            </w:r>
+            <w:r>
+              <w:t xml:space="preserve">“feels larger than ideal”</w:t>
+            </w:r>
+            <w:r>
+              <w:t xml:space="preserve"> </w:t>
+            </w:r>
+            <w:r>
+              <w:t xml:space="preserve">direction.</w:t>
+            </w:r>
+          </w:p>
+          <w:p>
+            <w:pPr>
+              <w:pStyle w:val="Compact"/>
+              <w:numPr>
+                <w:ilvl w:val="0"/>
+                <w:numId w:val="1010"/>
+              </w:numPr>
+            </w:pPr>
+            <w:r>
+              <w:t xml:space="preserve">Classification quality is good: mean posterior probabilities of the</w:t>
+            </w:r>
+            <w:r>
+              <w:t xml:space="preserve"> </w:t>
+            </w:r>
+            <w:r>
+              <w:t xml:space="preserve">assigned class are 0.81 / 0.94 / 0.90 (all above the 0.70 rule of thumb),</w:t>
+            </w:r>
+            <w:r>
+              <w:t xml:space="preserve"> </w:t>
+            </w:r>
+            <w:r>
+              <w:t xml:space="preserve">consistent with entropy of 0.85. Observed class means track the model</w:t>
+            </w:r>
+            <w:r>
+              <w:t xml:space="preserve"> </w:t>
+            </w:r>
+            <w:r>
+              <w:t xml:space="preserve">predictions closely, with mild shrinkage at the age-8 extremes.</w:t>
+            </w:r>
+          </w:p>
+          <w:p>
+            <w:pPr>
+              <w:pStyle w:val="Compact"/>
+              <w:numPr>
+                <w:ilvl w:val="0"/>
+                <w:numId w:val="1010"/>
+              </w:numPr>
+            </w:pPr>
+            <w:r>
+              <w:t xml:space="preserve">Entropy ≥ 0.8 settles the Step 4 decision point: the three-step membership</w:t>
+            </w:r>
+            <w:r>
+              <w:t xml:space="preserve"> </w:t>
+            </w:r>
+            <w:r>
+              <w:t xml:space="preserve">models will use</w:t>
+            </w:r>
+            <w:r>
+              <w:t xml:space="preserve"> </w:t>
+            </w:r>
+            <w:r>
+              <w:rPr>
+                <w:b/>
+                <w:bCs/>
+              </w:rPr>
+              <w:t xml:space="preserve">proportional posterior weighting</w:t>
+            </w:r>
+            <w:r>
+              <w:t xml:space="preserve">, with a</w:t>
+            </w:r>
+            <w:r>
+              <w:t xml:space="preserve"> </w:t>
+            </w:r>
+            <w:r>
+              <w:t xml:space="preserve">modal-assignment sensitivity check.</w:t>
+            </w:r>
+          </w:p>
+          <w:p>
+            <w:pPr>
+              <w:pStyle w:val="Compact"/>
+              <w:numPr>
+                <w:ilvl w:val="0"/>
+                <w:numId w:val="1010"/>
+              </w:numPr>
+            </w:pPr>
+            <w:r>
+              <w:t xml:space="preserve">Class names above are working labels — happy to change them to whatever</w:t>
+            </w:r>
+            <w:r>
+              <w:t xml:space="preserve"> </w:t>
+            </w:r>
+            <w:r>
+              <w:t xml:space="preserve">you want used in the manuscript.</w:t>
+            </w:r>
+          </w:p>
+          <w:p/>
+        </w:tc>
+      </w:tr>
+    </w:tbl>
+    <w:bookmarkEnd w:id="60"/>
+    <w:bookmarkStart w:id="61" w:name="results"/>
+    <w:p>
+      <w:pPr>
+        <w:pStyle w:val="Heading1"/>
+      </w:pPr>
+      <w:r>
+        <w:t xml:space="preserve">7. Results</w:t>
       </w:r>
     </w:p>
     <w:p>
@@ -10754,7 +15052,7 @@
         <w:t xml:space="preserve">Placeholder</w:t>
       </w:r>
     </w:p>
-    <w:bookmarkEnd w:id="37"/>
+    <w:bookmarkEnd w:id="61"/>
     <w:sectPr>
       <w:footnotePr>
         <w:numRestart w:val="eachSect"/>
@@ -10987,6 +15285,18 @@
     <w:abstractNumId w:val="991"/>
   </w:num>
   <w:num w:numId="1006">
+    <w:abstractNumId w:val="991"/>
+  </w:num>
+  <w:num w:numId="1007">
+    <w:abstractNumId w:val="991"/>
+  </w:num>
+  <w:num w:numId="1008">
+    <w:abstractNumId w:val="991"/>
+  </w:num>
+  <w:num w:numId="1009">
+    <w:abstractNumId w:val="991"/>
+  </w:num>
+  <w:num w:numId="1010">
     <w:abstractNumId w:val="991"/>
   </w:num>
 </w:numbering>

</xml_diff>

<commit_message>
Tidy up the repo
</commit_message>
<xml_diff>
--- a/doc/report.docx
+++ b/doc/report.docx
@@ -316,7 +316,7 @@
                     <w:jc w:val="center"/>
                   </w:pPr>
                   <w:r>
-                    <w:t xml:space="preserve">≥ 1 wave with a PBI score</w:t>
+                    <w:t xml:space="preserve">&gt;= 1 wave with a PBI score</w:t>
                   </w:r>
                 </w:p>
               </w:tc>
@@ -357,7 +357,7 @@
                     <w:jc w:val="center"/>
                   </w:pPr>
                   <w:r>
-                    <w:t xml:space="preserve">≥ 2 waves with a PBI score (trajectory sample)</w:t>
+                    <w:t xml:space="preserve">&gt;= 2 waves with a PBI score (trajectory sample)</w:t>
                   </w:r>
                 </w:p>
               </w:tc>
@@ -5366,7 +5366,7 @@
                     <w:jc w:val="center"/>
                   </w:pPr>
                   <w:r>
-                    <w:t xml:space="preserve">Warmth P1 × Time (per year)</w:t>
+                    <w:t xml:space="preserve">Warmth P1 x Time (per year)</w:t>
                   </w:r>
                 </w:p>
               </w:tc>
@@ -5407,7 +5407,7 @@
                     <w:jc w:val="center"/>
                   </w:pPr>
                   <w:r>
-                    <w:t xml:space="preserve">Anger P1 × Time (per year)</w:t>
+                    <w:t xml:space="preserve">Anger P1 x Time (per year)</w:t>
                   </w:r>
                 </w:p>
               </w:tc>
@@ -5791,7 +5791,7 @@
                     <w:jc w:val="center"/>
                   </w:pPr>
                   <w:r>
-                    <w:t xml:space="preserve">Warmth P1 × Time (per year)</w:t>
+                    <w:t xml:space="preserve">Warmth P1 x Time (per year)</w:t>
                   </w:r>
                 </w:p>
               </w:tc>
@@ -5832,7 +5832,7 @@
                     <w:jc w:val="center"/>
                   </w:pPr>
                   <w:r>
-                    <w:t xml:space="preserve">Anger P1 × Time (per year)</w:t>
+                    <w:t xml:space="preserve">Anger P1 x Time (per year)</w:t>
                   </w:r>
                 </w:p>
               </w:tc>
@@ -13820,7 +13820,7 @@
                     <w:jc w:val="center"/>
                   </w:pPr>
                   <w:r>
-                    <w:t xml:space="preserve">By class × wave</w:t>
+                    <w:t xml:space="preserve">By class x wave</w:t>
                   </w:r>
                 </w:p>
               </w:tc>
@@ -13913,7 +13913,7 @@
                     <w:jc w:val="center"/>
                   </w:pPr>
                   <w:r>
-                    <w:t xml:space="preserve">By class × wave</w:t>
+                    <w:t xml:space="preserve">By class x wave</w:t>
                   </w:r>
                 </w:p>
               </w:tc>
@@ -14006,7 +14006,7 @@
                     <w:jc w:val="center"/>
                   </w:pPr>
                   <w:r>
-                    <w:t xml:space="preserve">By class × wave</w:t>
+                    <w:t xml:space="preserve">By class x wave</w:t>
                   </w:r>
                 </w:p>
               </w:tc>
@@ -14099,7 +14099,7 @@
                     <w:jc w:val="center"/>
                   </w:pPr>
                   <w:r>
-                    <w:t xml:space="preserve">By class × wave</w:t>
+                    <w:t xml:space="preserve">By class x wave</w:t>
                   </w:r>
                 </w:p>
               </w:tc>
@@ -14192,7 +14192,7 @@
                     <w:jc w:val="center"/>
                   </w:pPr>
                   <w:r>
-                    <w:t xml:space="preserve">By class × wave</w:t>
+                    <w:t xml:space="preserve">By class x wave</w:t>
                   </w:r>
                 </w:p>
               </w:tc>
@@ -14285,7 +14285,7 @@
                     <w:jc w:val="center"/>
                   </w:pPr>
                   <w:r>
-                    <w:t xml:space="preserve">By class × wave</w:t>
+                    <w:t xml:space="preserve">By class x wave</w:t>
                   </w:r>
                 </w:p>
               </w:tc>
@@ -14378,7 +14378,7 @@
                     <w:jc w:val="center"/>
                   </w:pPr>
                   <w:r>
-                    <w:t xml:space="preserve">By class × wave</w:t>
+                    <w:t xml:space="preserve">By class x wave</w:t>
                   </w:r>
                 </w:p>
               </w:tc>
@@ -14471,7 +14471,7 @@
                     <w:jc w:val="center"/>
                   </w:pPr>
                   <w:r>
-                    <w:t xml:space="preserve">By class × wave</w:t>
+                    <w:t xml:space="preserve">By class x wave</w:t>
                   </w:r>
                 </w:p>
               </w:tc>
@@ -14564,7 +14564,7 @@
                     <w:jc w:val="center"/>
                   </w:pPr>
                   <w:r>
-                    <w:t xml:space="preserve">By class × wave</w:t>
+                    <w:t xml:space="preserve">By class x wave</w:t>
                   </w:r>
                 </w:p>
               </w:tc>
@@ -15362,12 +15362,12 @@
               <w:tblLook w:firstRow="1" w:lastRow="0" w:firstColumn="0" w:lastColumn="0" w:noHBand="0" w:noVBand="0" w:val="0020"/>
             </w:tblPr>
             <w:tblGrid>
-              <w:gridCol w:w="3540"/>
-              <w:gridCol w:w="1304"/>
-              <w:gridCol w:w="1304"/>
-              <w:gridCol w:w="652"/>
-              <w:gridCol w:w="465"/>
-              <w:gridCol w:w="652"/>
+              <w:gridCol w:w="3499"/>
+              <w:gridCol w:w="1289"/>
+              <w:gridCol w:w="1381"/>
+              <w:gridCol w:w="644"/>
+              <w:gridCol w:w="460"/>
+              <w:gridCol w:w="644"/>
             </w:tblGrid>
             <w:tr>
               <w:trPr>
@@ -15403,7 +15403,7 @@
                     <w:jc w:val="center"/>
                   </w:pPr>
                   <w:r>
-                    <w:t xml:space="preserve">Included (≥2)</w:t>
+                    <w:t xml:space="preserve">Included (&gt;=2)</w:t>
                   </w:r>
                 </w:p>
               </w:tc>
@@ -21235,7 +21235,7 @@
               <w:jc w:val="left"/>
             </w:pPr>
             <w:r>
-              <w:t xml:space="preserve">Warmth P1 × female</w:t>
+              <w:t xml:space="preserve">Warmth P1 x female</w:t>
             </w:r>
           </w:p>
         </w:tc>

</xml_diff>